<commit_message>
IA6 some kmeans ;(
</commit_message>
<xml_diff>
--- a/41IA Intelektualnyj analiz danyh/6/IA_KNT-122_Onyshchenko_19_PR6.docx
+++ b/41IA Intelektualnyj analiz danyh/6/IA_KNT-122_Onyshchenko_19_PR6.docx
@@ -4,7 +4,7 @@
   <w:body>
     <w:p>
       <w:pPr>
-        <w:pStyle w:val="p11"/>
+        <w:pStyle w:val="Normal"/>
         <w:ind w:hanging="0"/>
         <w:jc w:val="center"/>
         <w:rPr/>
@@ -18,7 +18,7 @@
     </w:p>
     <w:p>
       <w:pPr>
-        <w:pStyle w:val="p11"/>
+        <w:pStyle w:val="Normal"/>
         <w:ind w:hanging="0"/>
         <w:jc w:val="center"/>
         <w:rPr/>
@@ -32,7 +32,7 @@
     </w:p>
     <w:p>
       <w:pPr>
-        <w:pStyle w:val="p11"/>
+        <w:pStyle w:val="Normal"/>
         <w:ind w:hanging="0"/>
         <w:jc w:val="right"/>
         <w:rPr/>
@@ -44,7 +44,7 @@
     </w:p>
     <w:p>
       <w:pPr>
-        <w:pStyle w:val="p11"/>
+        <w:pStyle w:val="Normal"/>
         <w:ind w:hanging="0"/>
         <w:rPr/>
       </w:pPr>
@@ -54,7 +54,7 @@
     </w:p>
     <w:p>
       <w:pPr>
-        <w:pStyle w:val="p11"/>
+        <w:pStyle w:val="Normal"/>
         <w:ind w:hanging="0"/>
         <w:rPr/>
       </w:pPr>
@@ -64,7 +64,7 @@
     </w:p>
     <w:p>
       <w:pPr>
-        <w:pStyle w:val="p11"/>
+        <w:pStyle w:val="Normal"/>
         <w:ind w:hanging="0"/>
         <w:rPr/>
       </w:pPr>
@@ -74,7 +74,7 @@
     </w:p>
     <w:p>
       <w:pPr>
-        <w:pStyle w:val="p11"/>
+        <w:pStyle w:val="Normal"/>
         <w:ind w:hanging="0"/>
         <w:rPr/>
       </w:pPr>
@@ -84,7 +84,7 @@
     </w:p>
     <w:p>
       <w:pPr>
-        <w:pStyle w:val="p11"/>
+        <w:pStyle w:val="Normal"/>
         <w:ind w:hanging="0"/>
         <w:rPr/>
       </w:pPr>
@@ -94,7 +94,7 @@
     </w:p>
     <w:p>
       <w:pPr>
-        <w:pStyle w:val="p11"/>
+        <w:pStyle w:val="Normal"/>
         <w:ind w:hanging="0"/>
         <w:jc w:val="center"/>
         <w:rPr/>
@@ -106,7 +106,7 @@
     </w:p>
     <w:p>
       <w:pPr>
-        <w:pStyle w:val="p11"/>
+        <w:pStyle w:val="Normal"/>
         <w:ind w:hanging="0"/>
         <w:jc w:val="center"/>
         <w:rPr/>
@@ -118,7 +118,7 @@
     </w:p>
     <w:p>
       <w:pPr>
-        <w:pStyle w:val="p11"/>
+        <w:pStyle w:val="Normal"/>
         <w:tabs>
           <w:tab w:val="clear" w:pos="851"/>
           <w:tab w:val="left" w:pos="2185" w:leader="none"/>
@@ -142,7 +142,7 @@
     </w:p>
     <w:p>
       <w:pPr>
-        <w:pStyle w:val="p11"/>
+        <w:pStyle w:val="Normal"/>
         <w:ind w:hanging="0"/>
         <w:jc w:val="center"/>
         <w:rPr/>
@@ -162,7 +162,7 @@
     </w:p>
     <w:p>
       <w:pPr>
-        <w:pStyle w:val="p11"/>
+        <w:pStyle w:val="Normal"/>
         <w:ind w:hanging="0"/>
         <w:jc w:val="center"/>
         <w:rPr/>
@@ -173,61 +173,61 @@
     </w:p>
     <w:p>
       <w:pPr>
-        <w:pStyle w:val="p11"/>
-        <w:rPr/>
-      </w:pPr>
-      <w:r>
-        <w:rPr/>
-      </w:r>
-    </w:p>
-    <w:p>
-      <w:pPr>
-        <w:pStyle w:val="p11"/>
-        <w:rPr/>
-      </w:pPr>
-      <w:r>
-        <w:rPr/>
-      </w:r>
-    </w:p>
-    <w:p>
-      <w:pPr>
-        <w:pStyle w:val="p11"/>
-        <w:rPr/>
-      </w:pPr>
-      <w:r>
-        <w:rPr/>
-      </w:r>
-    </w:p>
-    <w:p>
-      <w:pPr>
-        <w:pStyle w:val="p11"/>
-        <w:rPr/>
-      </w:pPr>
-      <w:r>
-        <w:rPr/>
-      </w:r>
-    </w:p>
-    <w:p>
-      <w:pPr>
-        <w:pStyle w:val="p11"/>
-        <w:rPr/>
-      </w:pPr>
-      <w:r>
-        <w:rPr/>
-      </w:r>
-    </w:p>
-    <w:p>
-      <w:pPr>
-        <w:pStyle w:val="p11"/>
-        <w:rPr/>
-      </w:pPr>
-      <w:r>
-        <w:rPr/>
-      </w:r>
-    </w:p>
-    <w:p>
-      <w:pPr>
-        <w:pStyle w:val="p11"/>
+        <w:pStyle w:val="Normal"/>
+        <w:rPr/>
+      </w:pPr>
+      <w:r>
+        <w:rPr/>
+      </w:r>
+    </w:p>
+    <w:p>
+      <w:pPr>
+        <w:pStyle w:val="Normal"/>
+        <w:rPr/>
+      </w:pPr>
+      <w:r>
+        <w:rPr/>
+      </w:r>
+    </w:p>
+    <w:p>
+      <w:pPr>
+        <w:pStyle w:val="Normal"/>
+        <w:rPr/>
+      </w:pPr>
+      <w:r>
+        <w:rPr/>
+      </w:r>
+    </w:p>
+    <w:p>
+      <w:pPr>
+        <w:pStyle w:val="Normal"/>
+        <w:rPr/>
+      </w:pPr>
+      <w:r>
+        <w:rPr/>
+      </w:r>
+    </w:p>
+    <w:p>
+      <w:pPr>
+        <w:pStyle w:val="Normal"/>
+        <w:rPr/>
+      </w:pPr>
+      <w:r>
+        <w:rPr/>
+      </w:r>
+    </w:p>
+    <w:p>
+      <w:pPr>
+        <w:pStyle w:val="Normal"/>
+        <w:rPr/>
+      </w:pPr>
+      <w:r>
+        <w:rPr/>
+      </w:r>
+    </w:p>
+    <w:p>
+      <w:pPr>
+        <w:pStyle w:val="Normal"/>
         <w:widowControl/>
         <w:suppressAutoHyphens w:val="true"/>
         <w:bidi w:val="0"/>
@@ -249,7 +249,7 @@
     </w:p>
     <w:p>
       <w:pPr>
-        <w:pStyle w:val="p11"/>
+        <w:pStyle w:val="Normal"/>
         <w:widowControl/>
         <w:suppressAutoHyphens w:val="true"/>
         <w:bidi w:val="0"/>
@@ -272,7 +272,7 @@
     </w:p>
     <w:p>
       <w:pPr>
-        <w:pStyle w:val="p11"/>
+        <w:pStyle w:val="Normal"/>
         <w:widowControl/>
         <w:suppressAutoHyphens w:val="true"/>
         <w:bidi w:val="0"/>
@@ -287,7 +287,7 @@
     </w:p>
     <w:p>
       <w:pPr>
-        <w:pStyle w:val="p11"/>
+        <w:pStyle w:val="Normal"/>
         <w:widowControl/>
         <w:suppressAutoHyphens w:val="true"/>
         <w:bidi w:val="0"/>
@@ -309,7 +309,7 @@
     </w:p>
     <w:p>
       <w:pPr>
-        <w:pStyle w:val="p11"/>
+        <w:pStyle w:val="Normal"/>
         <w:widowControl/>
         <w:suppressAutoHyphens w:val="true"/>
         <w:bidi w:val="0"/>
@@ -333,7 +333,7 @@
     </w:p>
     <w:p>
       <w:pPr>
-        <w:pStyle w:val="p11"/>
+        <w:pStyle w:val="Normal"/>
         <w:widowControl/>
         <w:suppressAutoHyphens w:val="true"/>
         <w:bidi w:val="0"/>
@@ -348,7 +348,7 @@
     </w:p>
     <w:p>
       <w:pPr>
-        <w:pStyle w:val="p11"/>
+        <w:pStyle w:val="Normal"/>
         <w:widowControl/>
         <w:suppressAutoHyphens w:val="true"/>
         <w:bidi w:val="0"/>
@@ -363,16 +363,16 @@
     </w:p>
     <w:p>
       <w:pPr>
-        <w:pStyle w:val="p11"/>
-        <w:rPr/>
-      </w:pPr>
-      <w:r>
-        <w:rPr/>
-      </w:r>
-    </w:p>
-    <w:p>
-      <w:pPr>
-        <w:pStyle w:val="p11"/>
+        <w:pStyle w:val="Normal"/>
+        <w:rPr/>
+      </w:pPr>
+      <w:r>
+        <w:rPr/>
+      </w:r>
+    </w:p>
+    <w:p>
+      <w:pPr>
+        <w:pStyle w:val="Normal"/>
         <w:tabs>
           <w:tab w:val="clear" w:pos="851"/>
           <w:tab w:val="left" w:pos="1986" w:leader="none"/>
@@ -392,7 +392,7 @@
     </w:p>
     <w:p>
       <w:pPr>
-        <w:pStyle w:val="p11"/>
+        <w:pStyle w:val="Normal"/>
         <w:tabs>
           <w:tab w:val="clear" w:pos="851"/>
           <w:tab w:val="left" w:pos="1986" w:leader="none"/>
@@ -422,16 +422,16 @@
     </w:p>
     <w:p>
       <w:pPr>
-        <w:pStyle w:val="p11"/>
-        <w:rPr/>
-      </w:pPr>
-      <w:r>
-        <w:rPr/>
-      </w:r>
-    </w:p>
-    <w:p>
-      <w:pPr>
-        <w:pStyle w:val="p11"/>
+        <w:pStyle w:val="Normal"/>
+        <w:rPr/>
+      </w:pPr>
+      <w:r>
+        <w:rPr/>
+      </w:r>
+    </w:p>
+    <w:p>
+      <w:pPr>
+        <w:pStyle w:val="Normal"/>
         <w:rPr/>
       </w:pPr>
       <w:r>
@@ -451,7 +451,7 @@
     </w:p>
     <w:p>
       <w:pPr>
-        <w:pStyle w:val="p11"/>
+        <w:pStyle w:val="Normal"/>
         <w:rPr/>
       </w:pPr>
       <w:r>
@@ -470,16 +470,16 @@
     </w:p>
     <w:p>
       <w:pPr>
-        <w:pStyle w:val="p11"/>
-        <w:rPr/>
-      </w:pPr>
-      <w:r>
-        <w:rPr/>
-      </w:r>
-    </w:p>
-    <w:p>
-      <w:pPr>
-        <w:pStyle w:val="p11"/>
+        <w:pStyle w:val="Normal"/>
+        <w:rPr/>
+      </w:pPr>
+      <w:r>
+        <w:rPr/>
+      </w:r>
+    </w:p>
+    <w:p>
+      <w:pPr>
+        <w:pStyle w:val="Normal"/>
         <w:rPr/>
       </w:pPr>
       <w:r>
@@ -489,7 +489,7 @@
     </w:p>
     <w:p>
       <w:pPr>
-        <w:pStyle w:val="p11"/>
+        <w:pStyle w:val="Normal"/>
         <w:rPr>
           <w:b w:val="false"/>
           <w:i w:val="false"/>
@@ -511,7 +511,7 @@
     </w:p>
     <w:p>
       <w:pPr>
-        <w:pStyle w:val="p11"/>
+        <w:pStyle w:val="Normal"/>
         <w:widowControl/>
         <w:numPr>
           <w:ilvl w:val="0"/>
@@ -536,12 +536,12 @@
           <w:smallCaps w:val="false"/>
           <w:spacing w:val="0"/>
         </w:rPr>
-        <w:t>Виконати пошук  асоціативних  правил  за  допомогою засобів мови програмування Python:</w:t>
-      </w:r>
-    </w:p>
-    <w:p>
-      <w:pPr>
-        <w:pStyle w:val="p11"/>
+        <w:t>Вирішити задачу кластеризації  за  допомогою  засобів  мови програмування Python:</w:t>
+      </w:r>
+    </w:p>
+    <w:p>
+      <w:pPr>
+        <w:pStyle w:val="Normal"/>
         <w:widowControl/>
         <w:numPr>
           <w:ilvl w:val="0"/>
@@ -566,12 +566,12 @@
           <w:smallCaps w:val="false"/>
           <w:spacing w:val="0"/>
         </w:rPr>
-        <w:t>- конвертувати  вибірку «marketbasket.arff»  в  CSV  формат,  та завантажити в програму;</w:t>
-      </w:r>
-    </w:p>
-    <w:p>
-      <w:pPr>
-        <w:pStyle w:val="p11"/>
+        <w:t>- конвертувати  вибірку «vehicle.arff» в CSV формат, та завантажити в програму;</w:t>
+      </w:r>
+    </w:p>
+    <w:p>
+      <w:pPr>
+        <w:pStyle w:val="Normal"/>
         <w:widowControl/>
         <w:numPr>
           <w:ilvl w:val="0"/>
@@ -596,12 +596,32 @@
           <w:smallCaps w:val="false"/>
           <w:spacing w:val="0"/>
         </w:rPr>
-        <w:t>- виконати  пошук  асоціативних  правил  за  допомогою  всіх розглянутих в лабораторній роботі алгоритмів бібліотеки mlxtend;</w:t>
-      </w:r>
-    </w:p>
-    <w:p>
-      <w:pPr>
-        <w:pStyle w:val="p11"/>
+        <w:t xml:space="preserve">- виконати кластеризацію </w:t>
+      </w:r>
+      <w:r>
+        <w:rPr>
+          <w:b w:val="false"/>
+          <w:i w:val="false"/>
+          <w:caps w:val="false"/>
+          <w:smallCaps w:val="false"/>
+          <w:spacing w:val="0"/>
+        </w:rPr>
+        <w:t>з</w:t>
+      </w:r>
+      <w:r>
+        <w:rPr>
+          <w:b w:val="false"/>
+          <w:i w:val="false"/>
+          <w:caps w:val="false"/>
+          <w:smallCaps w:val="false"/>
+          <w:spacing w:val="0"/>
+        </w:rPr>
+        <w:t>а допомогою алгоритму KMeans (кількість кластерів має дорівнювати кількості класів);</w:t>
+      </w:r>
+    </w:p>
+    <w:p>
+      <w:pPr>
+        <w:pStyle w:val="Normal"/>
         <w:widowControl/>
         <w:numPr>
           <w:ilvl w:val="0"/>
@@ -626,12 +646,192 @@
           <w:smallCaps w:val="false"/>
           <w:spacing w:val="0"/>
         </w:rPr>
-        <w:t>- використовуючи  одну  з  розглянутих  метрик, відобразити найкращі з отриманих асоціативних правил.</w:t>
-      </w:r>
-    </w:p>
-    <w:p>
-      <w:pPr>
-        <w:pStyle w:val="p11"/>
+        <w:t>- продемонструвати та оцінити отримані результати;</w:t>
+      </w:r>
+    </w:p>
+    <w:p>
+      <w:pPr>
+        <w:pStyle w:val="Normal"/>
+        <w:widowControl/>
+        <w:numPr>
+          <w:ilvl w:val="0"/>
+          <w:numId w:val="0"/>
+        </w:numPr>
+        <w:spacing w:before="0" w:after="0"/>
+        <w:ind w:hanging="0" w:left="850" w:right="0"/>
+        <w:rPr>
+          <w:b w:val="false"/>
+          <w:i w:val="false"/>
+          <w:i w:val="false"/>
+          <w:caps w:val="false"/>
+          <w:smallCaps w:val="false"/>
+          <w:spacing w:val="0"/>
+        </w:rPr>
+      </w:pPr>
+      <w:r>
+        <w:rPr>
+          <w:b w:val="false"/>
+          <w:i w:val="false"/>
+          <w:caps w:val="false"/>
+          <w:smallCaps w:val="false"/>
+          <w:spacing w:val="0"/>
+        </w:rPr>
+        <w:t>- конвертувати вибірку «zoo.arff» в CSV формат та завантажити в програму;</w:t>
+      </w:r>
+    </w:p>
+    <w:p>
+      <w:pPr>
+        <w:pStyle w:val="Normal"/>
+        <w:widowControl/>
+        <w:numPr>
+          <w:ilvl w:val="0"/>
+          <w:numId w:val="0"/>
+        </w:numPr>
+        <w:spacing w:before="0" w:after="0"/>
+        <w:ind w:hanging="0" w:left="850" w:right="0"/>
+        <w:rPr>
+          <w:b w:val="false"/>
+          <w:i w:val="false"/>
+          <w:i w:val="false"/>
+          <w:caps w:val="false"/>
+          <w:smallCaps w:val="false"/>
+          <w:spacing w:val="0"/>
+        </w:rPr>
+      </w:pPr>
+      <w:r>
+        <w:rPr>
+          <w:b w:val="false"/>
+          <w:i w:val="false"/>
+          <w:caps w:val="false"/>
+          <w:smallCaps w:val="false"/>
+          <w:spacing w:val="0"/>
+        </w:rPr>
+        <w:t>- застосувати алгоритм ієрархічної кластеризації (при побудові матриці зв’язків видалити атрибути animal та type);</w:t>
+      </w:r>
+    </w:p>
+    <w:p>
+      <w:pPr>
+        <w:pStyle w:val="Normal"/>
+        <w:widowControl/>
+        <w:numPr>
+          <w:ilvl w:val="0"/>
+          <w:numId w:val="0"/>
+        </w:numPr>
+        <w:spacing w:before="0" w:after="0"/>
+        <w:ind w:hanging="0" w:left="850" w:right="0"/>
+        <w:rPr>
+          <w:b w:val="false"/>
+          <w:i w:val="false"/>
+          <w:i w:val="false"/>
+          <w:caps w:val="false"/>
+          <w:smallCaps w:val="false"/>
+          <w:spacing w:val="0"/>
+        </w:rPr>
+      </w:pPr>
+      <w:r>
+        <w:rPr>
+          <w:b w:val="false"/>
+          <w:i w:val="false"/>
+          <w:caps w:val="false"/>
+          <w:smallCaps w:val="false"/>
+          <w:spacing w:val="0"/>
+        </w:rPr>
+        <w:t>- візуалізувати отримані результати (дендрограма);</w:t>
+      </w:r>
+    </w:p>
+    <w:p>
+      <w:pPr>
+        <w:pStyle w:val="Normal"/>
+        <w:widowControl/>
+        <w:numPr>
+          <w:ilvl w:val="0"/>
+          <w:numId w:val="0"/>
+        </w:numPr>
+        <w:spacing w:before="0" w:after="0"/>
+        <w:ind w:hanging="0" w:left="850" w:right="0"/>
+        <w:rPr>
+          <w:b w:val="false"/>
+          <w:i w:val="false"/>
+          <w:i w:val="false"/>
+          <w:caps w:val="false"/>
+          <w:smallCaps w:val="false"/>
+          <w:spacing w:val="0"/>
+        </w:rPr>
+      </w:pPr>
+      <w:r>
+        <w:rPr>
+          <w:b w:val="false"/>
+          <w:i w:val="false"/>
+          <w:caps w:val="false"/>
+          <w:smallCaps w:val="false"/>
+          <w:spacing w:val="0"/>
+        </w:rPr>
+        <w:t>- конвертувати вибірку, яку було згенеровано за допомогою алгоритму BIRCHCluster у WEKA в CSV формат та завантажити;</w:t>
+      </w:r>
+    </w:p>
+    <w:p>
+      <w:pPr>
+        <w:pStyle w:val="Normal"/>
+        <w:widowControl/>
+        <w:numPr>
+          <w:ilvl w:val="0"/>
+          <w:numId w:val="0"/>
+        </w:numPr>
+        <w:spacing w:before="0" w:after="0"/>
+        <w:ind w:hanging="0" w:left="850" w:right="0"/>
+        <w:rPr>
+          <w:b w:val="false"/>
+          <w:i w:val="false"/>
+          <w:i w:val="false"/>
+          <w:caps w:val="false"/>
+          <w:smallCaps w:val="false"/>
+          <w:spacing w:val="0"/>
+        </w:rPr>
+      </w:pPr>
+      <w:r>
+        <w:rPr>
+          <w:b w:val="false"/>
+          <w:i w:val="false"/>
+          <w:caps w:val="false"/>
+          <w:smallCaps w:val="false"/>
+          <w:spacing w:val="0"/>
+        </w:rPr>
+        <w:t>- виконати кластеризацію за допомогою алгоритму DBSCAN;</w:t>
+      </w:r>
+    </w:p>
+    <w:p>
+      <w:pPr>
+        <w:pStyle w:val="Normal"/>
+        <w:widowControl/>
+        <w:numPr>
+          <w:ilvl w:val="0"/>
+          <w:numId w:val="0"/>
+        </w:numPr>
+        <w:spacing w:before="0" w:after="0"/>
+        <w:ind w:hanging="0" w:left="850" w:right="0"/>
+        <w:rPr>
+          <w:b w:val="false"/>
+          <w:i w:val="false"/>
+          <w:i w:val="false"/>
+          <w:caps w:val="false"/>
+          <w:smallCaps w:val="false"/>
+          <w:spacing w:val="0"/>
+        </w:rPr>
+      </w:pPr>
+      <w:r>
+        <w:rPr>
+          <w:b w:val="false"/>
+          <w:i w:val="false"/>
+          <w:caps w:val="false"/>
+          <w:smallCaps w:val="false"/>
+          <w:spacing w:val="0"/>
+        </w:rPr>
+        <w:t>- продемонструвати та оцінити отримані результати.</w:t>
+      </w:r>
+    </w:p>
+    <w:p>
+      <w:pPr>
+        <w:pStyle w:val="Normal"/>
         <w:widowControl/>
         <w:numPr>
           <w:ilvl w:val="0"/>
@@ -651,7 +851,7 @@
     </w:p>
     <w:p>
       <w:pPr>
-        <w:pStyle w:val="p11"/>
+        <w:pStyle w:val="Normal"/>
         <w:widowControl/>
         <w:numPr>
           <w:ilvl w:val="0"/>
@@ -671,16 +871,16 @@
     </w:p>
     <w:p>
       <w:pPr>
-        <w:pStyle w:val="p11"/>
-        <w:rPr/>
-      </w:pPr>
-      <w:r>
-        <w:rPr/>
-      </w:r>
-    </w:p>
-    <w:p>
-      <w:pPr>
-        <w:pStyle w:val="h11"/>
+        <w:pStyle w:val="Normal"/>
+        <w:rPr/>
+      </w:pPr>
+      <w:r>
+        <w:rPr/>
+      </w:r>
+    </w:p>
+    <w:p>
+      <w:pPr>
+        <w:pStyle w:val="H1"/>
         <w:rPr/>
       </w:pPr>
       <w:r>
@@ -690,56 +890,135 @@
     </w:p>
     <w:p>
       <w:pPr>
+        <w:pStyle w:val="P1"/>
+        <w:rPr>
+          <w:lang w:val="en-US"/>
+        </w:rPr>
+      </w:pPr>
+      <w:r>
+        <w:rPr>
+          <w:lang w:val="en-US"/>
+        </w:rPr>
+      </w:r>
+    </w:p>
+    <w:p>
+      <w:pPr>
+        <w:pStyle w:val="P1"/>
+        <w:rPr>
+          <w:lang w:val="uk-UA"/>
+        </w:rPr>
+      </w:pPr>
+      <w:r>
+        <w:rPr>
+          <w:lang w:val="uk-UA"/>
+        </w:rPr>
+        <w:t>Код імпортування модулів:</w:t>
+      </w:r>
+    </w:p>
+    <w:p>
+      <w:pPr>
+        <w:pStyle w:val="P1"/>
+        <w:rPr>
+          <w:lang w:val="uk-UA"/>
+        </w:rPr>
+      </w:pPr>
+      <w:r>
+        <w:rPr>
+          <w:lang w:val="uk-UA"/>
+        </w:rPr>
+      </w:r>
+    </w:p>
+    <w:p>
+      <w:pPr>
+        <w:pStyle w:val="Code"/>
+        <w:rPr/>
+      </w:pPr>
+      <w:r>
+        <w:rPr/>
+        <w:t>import os</w:t>
+      </w:r>
+    </w:p>
+    <w:p>
+      <w:pPr>
+        <w:pStyle w:val="Code"/>
+        <w:rPr/>
+      </w:pPr>
+      <w:r>
+        <w:rPr/>
+        <w:t>import pandas as pd</w:t>
+      </w:r>
+    </w:p>
+    <w:p>
+      <w:pPr>
+        <w:pStyle w:val="Code"/>
+        <w:rPr/>
+      </w:pPr>
+      <w:r>
+        <w:rPr/>
+      </w:r>
+    </w:p>
+    <w:p>
+      <w:pPr>
+        <w:pStyle w:val="Code"/>
+        <w:rPr/>
+      </w:pPr>
+      <w:r>
+        <w:rPr/>
+        <w:t>from sklearn.model_selection import train_test_split</w:t>
+      </w:r>
+    </w:p>
+    <w:p>
+      <w:pPr>
+        <w:pStyle w:val="Code"/>
+        <w:rPr/>
+      </w:pPr>
+      <w:r>
+        <w:rPr/>
+        <w:t>from sklearn.cluster import KMeans</w:t>
+      </w:r>
+    </w:p>
+    <w:p>
+      <w:pPr>
+        <w:pStyle w:val="Code"/>
+        <w:rPr/>
+      </w:pPr>
+      <w:r>
+        <w:rPr/>
+        <w:t>from sklearn.metrics.cluster import contingency_matrix</w:t>
+      </w:r>
+    </w:p>
+    <w:p>
+      <w:pPr>
+        <w:pStyle w:val="P1"/>
+        <w:rPr/>
+      </w:pPr>
+      <w:r>
+        <w:rPr/>
+      </w:r>
+    </w:p>
+    <w:p>
+      <w:pPr>
         <w:pStyle w:val="H2"/>
         <w:rPr/>
       </w:pPr>
       <w:r>
         <w:rPr/>
+        <w:t xml:space="preserve">KMeans </w:t>
+      </w:r>
+    </w:p>
+    <w:p>
+      <w:pPr>
+        <w:pStyle w:val="H3"/>
+        <w:rPr/>
+      </w:pPr>
+      <w:r>
+        <w:rPr/>
         <w:t>Код</w:t>
       </w:r>
     </w:p>
     <w:p>
       <w:pPr>
-        <w:pStyle w:val="p11"/>
-        <w:rPr/>
-      </w:pPr>
-      <w:r>
-        <w:rPr/>
-      </w:r>
-    </w:p>
-    <w:p>
-      <w:pPr>
-        <w:pStyle w:val="Code"/>
-        <w:rPr/>
-      </w:pPr>
-      <w:r>
-        <w:rPr/>
-        <w:t>import os</w:t>
-      </w:r>
-    </w:p>
-    <w:p>
-      <w:pPr>
-        <w:pStyle w:val="Code"/>
-        <w:rPr/>
-      </w:pPr>
-      <w:r>
-        <w:rPr/>
-        <w:t>import pandas as pd</w:t>
-      </w:r>
-    </w:p>
-    <w:p>
-      <w:pPr>
-        <w:pStyle w:val="Code"/>
-        <w:rPr/>
-      </w:pPr>
-      <w:r>
-        <w:rPr/>
-        <w:t>from mlxtend.frequent_patterns import apriori, association_rules, fpgrowth</w:t>
-      </w:r>
-    </w:p>
-    <w:p>
-      <w:pPr>
-        <w:pStyle w:val="Code"/>
+        <w:pStyle w:val="P1"/>
         <w:rPr/>
       </w:pPr>
       <w:r>
@@ -763,7 +1042,7 @@
       </w:pPr>
       <w:r>
         <w:rPr/>
-        <w:t>file_name = "marketbasket.csv"</w:t>
+        <w:t>file_name = "vehicle.csv"</w:t>
       </w:r>
     </w:p>
     <w:p>
@@ -802,17 +1081,220 @@
       </w:pPr>
       <w:r>
         <w:rPr/>
-        <w:t>df = df.fillna(0)</w:t>
-      </w:r>
-    </w:p>
-    <w:p>
-      <w:pPr>
-        <w:pStyle w:val="Code"/>
-        <w:rPr/>
-      </w:pPr>
-      <w:r>
-        <w:rPr/>
-        <w:t>for column in df.columns:</w:t>
+        <w:t>df = df.dropna()</w:t>
+      </w:r>
+    </w:p>
+    <w:p>
+      <w:pPr>
+        <w:pStyle w:val="Code"/>
+        <w:rPr/>
+      </w:pPr>
+      <w:r>
+        <w:rPr/>
+      </w:r>
+    </w:p>
+    <w:p>
+      <w:pPr>
+        <w:pStyle w:val="Code"/>
+        <w:rPr/>
+      </w:pPr>
+      <w:r>
+        <w:rPr/>
+        <w:t>TARGET_FEATURE = "Class"</w:t>
+      </w:r>
+    </w:p>
+    <w:p>
+      <w:pPr>
+        <w:pStyle w:val="Code"/>
+        <w:rPr/>
+      </w:pPr>
+      <w:r>
+        <w:rPr/>
+        <w:t>Y = df[TARGET_FEATURE]</w:t>
+      </w:r>
+    </w:p>
+    <w:p>
+      <w:pPr>
+        <w:pStyle w:val="Code"/>
+        <w:rPr/>
+      </w:pPr>
+      <w:r>
+        <w:rPr/>
+        <w:t>X = df.drop([TARGET_FEATURE], axis=1)</w:t>
+      </w:r>
+    </w:p>
+    <w:p>
+      <w:pPr>
+        <w:pStyle w:val="Code"/>
+        <w:rPr/>
+      </w:pPr>
+      <w:r>
+        <w:rPr/>
+        <w:t>X_train, X_test, Y_train, Y_test = train_test_split(X, Y, test_size=0.33)</w:t>
+      </w:r>
+    </w:p>
+    <w:p>
+      <w:pPr>
+        <w:pStyle w:val="Code"/>
+        <w:rPr/>
+      </w:pPr>
+      <w:r>
+        <w:rPr/>
+        <w:t>print(X, Y)</w:t>
+      </w:r>
+    </w:p>
+    <w:p>
+      <w:pPr>
+        <w:pStyle w:val="Code"/>
+        <w:rPr/>
+      </w:pPr>
+      <w:r>
+        <w:rPr/>
+      </w:r>
+    </w:p>
+    <w:p>
+      <w:pPr>
+        <w:pStyle w:val="Code"/>
+        <w:rPr/>
+      </w:pPr>
+      <w:r>
+        <w:rPr/>
+        <w:t>KM = KMeans(n_clusters=</w:t>
+      </w:r>
+      <w:r>
+        <w:rPr/>
+        <w:t>len(Y_train)</w:t>
+      </w:r>
+      <w:r>
+        <w:rPr/>
+        <w:t>)</w:t>
+      </w:r>
+    </w:p>
+    <w:p>
+      <w:pPr>
+        <w:pStyle w:val="Code"/>
+        <w:rPr/>
+      </w:pPr>
+      <w:r>
+        <w:rPr/>
+        <w:t>KM.fit(X_train)</w:t>
+      </w:r>
+    </w:p>
+    <w:p>
+      <w:pPr>
+        <w:pStyle w:val="Code"/>
+        <w:rPr/>
+      </w:pPr>
+      <w:r>
+        <w:rPr/>
+      </w:r>
+    </w:p>
+    <w:p>
+      <w:pPr>
+        <w:pStyle w:val="Code"/>
+        <w:rPr/>
+      </w:pPr>
+      <w:r>
+        <w:rPr/>
+        <w:t>cluster_centers = pd.DataFrame(KM.cluster_centers_)</w:t>
+      </w:r>
+    </w:p>
+    <w:p>
+      <w:pPr>
+        <w:pStyle w:val="Code"/>
+        <w:rPr/>
+      </w:pPr>
+      <w:r>
+        <w:rPr/>
+        <w:t>cluster_centers.columns = X.columns</w:t>
+      </w:r>
+    </w:p>
+    <w:p>
+      <w:pPr>
+        <w:pStyle w:val="Code"/>
+        <w:rPr/>
+      </w:pPr>
+      <w:r>
+        <w:rPr/>
+        <w:t>print(cluster_centers)</w:t>
+      </w:r>
+    </w:p>
+    <w:p>
+      <w:pPr>
+        <w:pStyle w:val="Code"/>
+        <w:rPr/>
+      </w:pPr>
+      <w:r>
+        <w:rPr/>
+      </w:r>
+    </w:p>
+    <w:p>
+      <w:pPr>
+        <w:pStyle w:val="Code"/>
+        <w:rPr/>
+      </w:pPr>
+      <w:r>
+        <w:rPr/>
+        <w:t>Y_predict = KM.predict(X_test)</w:t>
+      </w:r>
+    </w:p>
+    <w:p>
+      <w:pPr>
+        <w:pStyle w:val="Code"/>
+        <w:rPr/>
+      </w:pPr>
+      <w:r>
+        <w:rPr/>
+        <w:t>matrix = pd.DataFrame(contingency_matrix(Y_test, Y_predict))</w:t>
+      </w:r>
+    </w:p>
+    <w:p>
+      <w:pPr>
+        <w:pStyle w:val="Code"/>
+        <w:rPr/>
+      </w:pPr>
+      <w:r>
+        <w:rPr/>
+        <w:t>matrix.index = Y.unique()</w:t>
+      </w:r>
+    </w:p>
+    <w:p>
+      <w:pPr>
+        <w:pStyle w:val="Code"/>
+        <w:rPr/>
+      </w:pPr>
+      <w:r>
+        <w:rPr/>
+        <w:t>print(matrix)</w:t>
+      </w:r>
+    </w:p>
+    <w:p>
+      <w:pPr>
+        <w:pStyle w:val="Code"/>
+        <w:rPr/>
+      </w:pPr>
+      <w:r>
+        <w:rPr/>
+      </w:r>
+    </w:p>
+    <w:p>
+      <w:pPr>
+        <w:pStyle w:val="Code"/>
+        <w:rPr/>
+      </w:pPr>
+      <w:r>
+        <w:rPr/>
+        <w:t>right_cluster_count = 0</w:t>
+      </w:r>
+    </w:p>
+    <w:p>
+      <w:pPr>
+        <w:pStyle w:val="Code"/>
+        <w:rPr/>
+      </w:pPr>
+      <w:r>
+        <w:rPr/>
+        <w:t>for column in matrix.columns:</w:t>
       </w:r>
     </w:p>
     <w:p>
@@ -826,212 +1308,106 @@
       </w:r>
       <w:r>
         <w:rPr/>
-        <w:t>df[column] = df[column].astype("bool")</w:t>
-      </w:r>
-    </w:p>
-    <w:p>
-      <w:pPr>
-        <w:pStyle w:val="Code"/>
-        <w:rPr/>
-      </w:pPr>
-      <w:r>
-        <w:rPr/>
-        <w:t>print(df.head())</w:t>
-      </w:r>
-    </w:p>
-    <w:p>
-      <w:pPr>
-        <w:pStyle w:val="Code"/>
-        <w:rPr/>
-      </w:pPr>
-      <w:r>
-        <w:rPr/>
-      </w:r>
-    </w:p>
-    <w:p>
-      <w:pPr>
-        <w:pStyle w:val="Code"/>
-        <w:rPr/>
-      </w:pPr>
-      <w:r>
-        <w:rPr/>
-        <w:t># --- Apriori ---</w:t>
-      </w:r>
-    </w:p>
-    <w:p>
-      <w:pPr>
-        <w:pStyle w:val="Code"/>
-        <w:rPr/>
-      </w:pPr>
-      <w:r>
-        <w:rPr/>
-        <w:t>apriori_result = apriori(df, min_support=0.01, use_colnames=True)</w:t>
-      </w:r>
-    </w:p>
-    <w:p>
-      <w:pPr>
-        <w:pStyle w:val="Code"/>
-        <w:rPr/>
-      </w:pPr>
-      <w:r>
-        <w:rPr/>
-        <w:t>print(apriori_result)</w:t>
-      </w:r>
-    </w:p>
-    <w:p>
-      <w:pPr>
-        <w:pStyle w:val="Code"/>
-        <w:rPr/>
-      </w:pPr>
-      <w:r>
-        <w:rPr/>
-      </w:r>
-    </w:p>
-    <w:p>
-      <w:pPr>
-        <w:pStyle w:val="Code"/>
-        <w:rPr/>
-      </w:pPr>
-      <w:r>
-        <w:rPr/>
-        <w:t>RULES_COUNT = 3</w:t>
-      </w:r>
-    </w:p>
-    <w:p>
-      <w:pPr>
-        <w:pStyle w:val="Code"/>
-        <w:rPr/>
-      </w:pPr>
-      <w:r>
-        <w:rPr/>
-        <w:t>rules = association_rules(apriori_result, metric="confidence", min_threshold=0.1)</w:t>
-      </w:r>
-    </w:p>
-    <w:p>
-      <w:pPr>
-        <w:pStyle w:val="Code"/>
-        <w:rPr/>
-      </w:pPr>
-      <w:r>
-        <w:rPr/>
-        <w:t>sorted_rules = rules.sort_values("confidence", ascending=False)</w:t>
-      </w:r>
-    </w:p>
-    <w:p>
-      <w:pPr>
-        <w:pStyle w:val="Code"/>
-        <w:rPr/>
-      </w:pPr>
-      <w:r>
-        <w:rPr/>
-        <w:t>results_matrix = rules[["antecedents", "consequents", "confidence"]]</w:t>
-      </w:r>
-    </w:p>
-    <w:p>
-      <w:pPr>
-        <w:pStyle w:val="Code"/>
-        <w:rPr/>
-      </w:pPr>
-      <w:r>
-        <w:rPr/>
-        <w:t>print(results_matrix.head(RULES_COUNT))</w:t>
-      </w:r>
-    </w:p>
-    <w:p>
-      <w:pPr>
-        <w:pStyle w:val="Code"/>
-        <w:rPr/>
-      </w:pPr>
-      <w:r>
-        <w:rPr/>
-      </w:r>
-    </w:p>
-    <w:p>
-      <w:pPr>
-        <w:pStyle w:val="Code"/>
-        <w:rPr/>
-      </w:pPr>
-      <w:r>
-        <w:rPr/>
-        <w:t># --- FP-Growth ---</w:t>
-      </w:r>
-    </w:p>
-    <w:p>
-      <w:pPr>
-        <w:pStyle w:val="Code"/>
-        <w:rPr/>
-      </w:pPr>
-      <w:r>
-        <w:rPr/>
-        <w:t>fpgrowth_result = fpgrowth(df, min_support=0.01, use_colnames=True)</w:t>
-      </w:r>
-    </w:p>
-    <w:p>
-      <w:pPr>
-        <w:pStyle w:val="Code"/>
-        <w:rPr/>
-      </w:pPr>
-      <w:r>
-        <w:rPr/>
-        <w:t>rules = association_rules(fpgrowth_result, metric="confidence", min_threshold=0.1)</w:t>
-      </w:r>
-    </w:p>
-    <w:p>
-      <w:pPr>
-        <w:pStyle w:val="Code"/>
-        <w:rPr/>
-      </w:pPr>
-      <w:r>
-        <w:rPr/>
-        <w:t>sorted_rules = rules.sort_values("confidence", ascending=False)</w:t>
-      </w:r>
-    </w:p>
-    <w:p>
-      <w:pPr>
-        <w:pStyle w:val="Code"/>
-        <w:rPr/>
-      </w:pPr>
-      <w:r>
-        <w:rPr/>
-        <w:t>results_matrix = rules[["antecedents", "consequents", "confidence"]]</w:t>
-      </w:r>
-    </w:p>
-    <w:p>
-      <w:pPr>
-        <w:pStyle w:val="Code"/>
-        <w:rPr/>
-      </w:pPr>
-      <w:r>
-        <w:rPr/>
-        <w:t>print(results_matrix.head(7))</w:t>
-      </w:r>
-    </w:p>
-    <w:p>
-      <w:pPr>
-        <w:pStyle w:val="p11"/>
-        <w:rPr/>
-      </w:pPr>
-      <w:r>
-        <w:rPr/>
-      </w:r>
-    </w:p>
-    <w:p>
-      <w:pPr>
-        <w:pStyle w:val="H2"/>
-        <w:rPr/>
-      </w:pPr>
-      <w:r>
-        <w:rPr/>
-        <w:t>Результати</w:t>
-      </w:r>
-    </w:p>
-    <w:p>
-      <w:pPr>
-        <w:pStyle w:val="IMG1"/>
-        <w:rPr/>
-      </w:pPr>
-      <w:r>
-        <w:rPr/>
+        <w:t>right_cluster_count += matrix[column].max()</w:t>
+      </w:r>
+    </w:p>
+    <w:p>
+      <w:pPr>
+        <w:pStyle w:val="Code"/>
+        <w:rPr/>
+      </w:pPr>
+      <w:r>
+        <w:rPr/>
+        <w:t xml:space="preserve">    </w:t>
+      </w:r>
+      <w:r>
+        <w:rPr/>
+        <w:t>accuracy = right_cluster_count / matrix.sum().sum()</w:t>
+      </w:r>
+    </w:p>
+    <w:p>
+      <w:pPr>
+        <w:pStyle w:val="Code"/>
+        <w:rPr/>
+      </w:pPr>
+      <w:r>
+        <w:rPr/>
+        <w:t xml:space="preserve">    </w:t>
+      </w:r>
+      <w:r>
+        <w:rPr/>
+        <w:t>error_rate = 1 - accuracy</w:t>
+      </w:r>
+    </w:p>
+    <w:p>
+      <w:pPr>
+        <w:pStyle w:val="Code"/>
+        <w:rPr/>
+      </w:pPr>
+      <w:r>
+        <w:rPr/>
+      </w:r>
+    </w:p>
+    <w:p>
+      <w:pPr>
+        <w:pStyle w:val="Code"/>
+        <w:rPr/>
+      </w:pPr>
+      <w:r>
+        <w:rPr/>
+        <w:t>print(f"{right_cluster_count=}")</w:t>
+      </w:r>
+    </w:p>
+    <w:p>
+      <w:pPr>
+        <w:pStyle w:val="Code"/>
+        <w:rPr/>
+      </w:pPr>
+      <w:r>
+        <w:rPr/>
+        <w:t>print(f"{accuracy=}")</w:t>
+      </w:r>
+    </w:p>
+    <w:p>
+      <w:pPr>
+        <w:pStyle w:val="Code"/>
+        <w:rPr/>
+      </w:pPr>
+      <w:r>
+        <w:rPr/>
+        <w:t>print(f"{error_rate=}")</w:t>
+      </w:r>
+    </w:p>
+    <w:p>
+      <w:pPr>
+        <w:pStyle w:val="P1"/>
+        <w:rPr/>
+      </w:pPr>
+      <w:r>
+        <w:rPr/>
+      </w:r>
+    </w:p>
+    <w:p>
+      <w:pPr>
+        <w:pStyle w:val="H3"/>
+        <w:rPr/>
+      </w:pPr>
+      <w:r>
+        <w:rPr/>
+        <w:t>Результат</w:t>
+      </w:r>
+    </w:p>
+    <w:p>
+      <w:pPr>
+        <w:pStyle w:val="P1"/>
+        <w:rPr>
+          <w:lang w:val="en-US"/>
+        </w:rPr>
+      </w:pPr>
+      <w:r>
+        <w:rPr>
+          <w:lang w:val="en-US"/>
+        </w:rPr>
       </w:r>
     </w:p>
     <w:p>
@@ -1043,7 +1419,7 @@
         <w:rPr/>
         <w:drawing>
           <wp:inline distT="0" distB="0" distL="0" distR="0">
-            <wp:extent cx="5731510" cy="4611370"/>
+            <wp:extent cx="5731510" cy="2687320"/>
             <wp:effectExtent l="0" t="0" r="0" b="0"/>
             <wp:docPr id="1" name="Зображення1"/>
             <wp:cNvGraphicFramePr>
@@ -1067,7 +1443,7 @@
                   <pic:spPr bwMode="auto">
                     <a:xfrm>
                       <a:off x="0" y="0"/>
-                      <a:ext cx="5731510" cy="4611370"/>
+                      <a:ext cx="5731510" cy="2687320"/>
                     </a:xfrm>
                     <a:prstGeom prst="rect">
                       <a:avLst/>
@@ -1088,12 +1464,18 @@
       </w:pPr>
       <w:r>
         <w:rPr/>
-        <w:t>Рисунок 1.1 — Виведення у консоль</w:t>
-      </w:r>
-    </w:p>
-    <w:p>
-      <w:pPr>
-        <w:pStyle w:val="p11"/>
+        <w:t xml:space="preserve">Рисунок 1.1 — Результати роботи </w:t>
+      </w:r>
+      <w:r>
+        <w:rPr>
+          <w:lang w:val="en-US"/>
+        </w:rPr>
+        <w:t>KMeans</w:t>
+      </w:r>
+    </w:p>
+    <w:p>
+      <w:pPr>
+        <w:pStyle w:val="P1"/>
         <w:rPr/>
       </w:pPr>
       <w:r>
@@ -1117,7 +1499,7 @@
       </w:pPr>
       <w:r>
         <w:rPr/>
-        <w:t xml:space="preserve">Що таке задача пошуку асоціативних правил? Наведіть практичний приклад. </w:t>
+        <w:t>Що таке задача кластеризації? Наведіть практичний приклад.</w:t>
       </w:r>
     </w:p>
     <w:p>
@@ -1136,7 +1518,7 @@
       </w:pPr>
       <w:r>
         <w:rPr/>
-        <w:t>Пошук асоціативних правил є методом пошуку нетривіальних відношень у великих базах даних.</w:t>
+        <w:t>Задача кластеризації є розподілення вхідної вибірки на кластери — схожі між собою купки об’єктів.</w:t>
       </w:r>
     </w:p>
     <w:p>
@@ -1146,7 +1528,7 @@
       </w:pPr>
       <w:r>
         <w:rPr/>
-        <w:t>Практичним прикладом є визначення шаблонів покупців на сайті інтернет магазину.</w:t>
+        <w:t>Прикладом кластеризації є алгоритм К-найближчих сусідів.</w:t>
       </w:r>
     </w:p>
     <w:p>
@@ -1165,7 +1547,7 @@
       </w:pPr>
       <w:r>
         <w:rPr/>
-        <w:t>Що таке частий набір?</w:t>
+        <w:t>Що таке навчання з учителем і без учителя? До якої стратегії відноситься задача кластеризації?</w:t>
       </w:r>
     </w:p>
     <w:p>
@@ -1180,15 +1562,11 @@
     <w:p>
       <w:pPr>
         <w:pStyle w:val="P1"/>
-        <w:rPr>
-          <w:lang w:val="uk-UA"/>
-        </w:rPr>
-      </w:pPr>
-      <w:r>
-        <w:rPr>
-          <w:lang w:val="uk-UA"/>
-        </w:rPr>
-        <w:t>Частий набір є множиною елементів, що зустрічаються у транзакціях.</w:t>
+        <w:rPr/>
+      </w:pPr>
+      <w:r>
+        <w:rPr/>
+        <w:t>Навчання з учителем це коли у вибірці є вихідний параметр.</w:t>
       </w:r>
     </w:p>
     <w:p>
@@ -1198,6 +1576,26 @@
       </w:pPr>
       <w:r>
         <w:rPr/>
+        <w:t>Навчання без учителя це коли вибірка містить лише вхідні параметри.</w:t>
+      </w:r>
+    </w:p>
+    <w:p>
+      <w:pPr>
+        <w:pStyle w:val="P1"/>
+        <w:rPr/>
+      </w:pPr>
+      <w:r>
+        <w:rPr/>
+        <w:t>Кластеризація відноситься до навчання без учителя.</w:t>
+      </w:r>
+    </w:p>
+    <w:p>
+      <w:pPr>
+        <w:pStyle w:val="P1"/>
+        <w:rPr/>
+      </w:pPr>
+      <w:r>
+        <w:rPr/>
       </w:r>
     </w:p>
     <w:p>
@@ -1207,7 +1605,7 @@
       </w:pPr>
       <w:r>
         <w:rPr/>
-        <w:t>Що таке сильне асоціативне правило?</w:t>
+        <w:t>В  чому схожість та відмінність задач класифікації та кластеризації?</w:t>
       </w:r>
     </w:p>
     <w:p>
@@ -1226,27 +1624,7 @@
       </w:pPr>
       <w:r>
         <w:rPr/>
-        <w:t>Правило називається сильним, якщо воно має високу підтримку (</w:t>
-      </w:r>
-      <w:r>
-        <w:rPr>
-          <w:lang w:val="en-US"/>
-        </w:rPr>
-        <w:t xml:space="preserve">support) </w:t>
-      </w:r>
-      <w:r>
-        <w:rPr/>
-        <w:t xml:space="preserve">та достовірність </w:t>
-      </w:r>
-      <w:r>
-        <w:rPr>
-          <w:lang w:val="en-US"/>
-        </w:rPr>
-        <w:t>(confidence)</w:t>
-      </w:r>
-      <w:r>
-        <w:rPr/>
-        <w:t>.</w:t>
+        <w:t>Обидві розділяють вибірку на окремі купки об’єктів.</w:t>
       </w:r>
     </w:p>
     <w:p>
@@ -1256,6 +1634,16 @@
       </w:pPr>
       <w:r>
         <w:rPr/>
+        <w:t>Кластеризація є навчанням без учителя.</w:t>
+      </w:r>
+    </w:p>
+    <w:p>
+      <w:pPr>
+        <w:pStyle w:val="P1"/>
+        <w:rPr/>
+      </w:pPr>
+      <w:r>
+        <w:rPr/>
       </w:r>
     </w:p>
     <w:p>
@@ -1265,7 +1653,7 @@
       </w:pPr>
       <w:r>
         <w:rPr/>
-        <w:t>З яких двох кроків складається пошук асоціативних правил?</w:t>
+        <w:t>Чим  визначається  «схожість»  об’єктів  при  вирішенні  задачі кластеризації?</w:t>
       </w:r>
     </w:p>
     <w:p>
@@ -1284,7 +1672,7 @@
       </w:pPr>
       <w:r>
         <w:rPr/>
-        <w:t>Пошук асоціативних правил містить такі кроки:</w:t>
+        <w:t>Метрикою відстані, зазвичай Евклідової.</w:t>
       </w:r>
     </w:p>
     <w:p>
@@ -1298,12 +1686,21 @@
     </w:p>
     <w:p>
       <w:pPr>
+        <w:pStyle w:val="H2"/>
+        <w:rPr/>
+      </w:pPr>
+      <w:r>
+        <w:rPr/>
+        <w:t>Які  метрики  застосовують  для  розрахунку  відстані  між екземплярами та кластерами?</w:t>
+      </w:r>
+    </w:p>
+    <w:p>
+      <w:pPr>
         <w:pStyle w:val="P1"/>
         <w:rPr/>
       </w:pPr>
       <w:r>
         <w:rPr/>
-        <w:t>1. Пошук частих наборів;</w:t>
       </w:r>
     </w:p>
     <w:p>
@@ -1313,7 +1710,7 @@
       </w:pPr>
       <w:r>
         <w:rPr/>
-        <w:t>2. Генерація правил на їх основі.</w:t>
+        <w:t>Відомі метрики:</w:t>
       </w:r>
     </w:p>
     <w:p>
@@ -1327,27 +1724,12 @@
     </w:p>
     <w:p>
       <w:pPr>
-        <w:pStyle w:val="H2"/>
-        <w:rPr/>
-      </w:pPr>
-      <w:r>
-        <w:rPr>
-          <w:lang w:val="uk-UA"/>
-        </w:rPr>
-        <w:t>Я</w:t>
-      </w:r>
-      <w:r>
-        <w:rPr/>
-        <w:t>кі алгоритми пошуку асоціативних правил ви знаєте?</w:t>
-      </w:r>
-    </w:p>
-    <w:p>
-      <w:pPr>
         <w:pStyle w:val="P1"/>
         <w:rPr/>
       </w:pPr>
       <w:r>
         <w:rPr/>
+        <w:t>- Мангетенова відстань;</w:t>
       </w:r>
     </w:p>
     <w:p>
@@ -1357,46 +1739,7 @@
       </w:pPr>
       <w:r>
         <w:rPr/>
-        <w:t>Відомі алгоритми пошуку асоціативних правил:</w:t>
-      </w:r>
-    </w:p>
-    <w:p>
-      <w:pPr>
-        <w:pStyle w:val="P1"/>
-        <w:rPr/>
-      </w:pPr>
-      <w:r>
-        <w:rPr/>
-      </w:r>
-    </w:p>
-    <w:p>
-      <w:pPr>
-        <w:pStyle w:val="P1"/>
-        <w:rPr/>
-      </w:pPr>
-      <w:r>
-        <w:rPr/>
-        <w:t xml:space="preserve">1. </w:t>
-      </w:r>
-      <w:r>
-        <w:rPr>
-          <w:lang w:val="en-US"/>
-        </w:rPr>
-        <w:t>APriori;</w:t>
-      </w:r>
-    </w:p>
-    <w:p>
-      <w:pPr>
-        <w:pStyle w:val="P1"/>
-        <w:rPr>
-          <w:lang w:val="en-US"/>
-        </w:rPr>
-      </w:pPr>
-      <w:r>
-        <w:rPr>
-          <w:lang w:val="en-US"/>
-        </w:rPr>
-        <w:t>2. FP-Growth.</w:t>
+        <w:t>- Евклідова відстань.</w:t>
       </w:r>
     </w:p>
     <w:sectPr>
@@ -2817,23 +3160,9 @@
       <w:lang w:val="en-US"/>
     </w:rPr>
   </w:style>
-  <w:style w:type="paragraph" w:styleId="p11">
-    <w:name w:val="p1"/>
-    <w:basedOn w:val="Normal"/>
-    <w:qFormat/>
-    <w:pPr>
-      <w:spacing w:lineRule="auto" w:line="360" w:before="0" w:after="0"/>
-      <w:ind w:firstLine="851"/>
-    </w:pPr>
-    <w:rPr>
-      <w:rFonts w:ascii="Times New Roman" w:hAnsi="Times New Roman"/>
-      <w:sz w:val="28"/>
-    </w:rPr>
-  </w:style>
   <w:style w:type="paragraph" w:styleId="h11">
     <w:name w:val="h11"/>
     <w:basedOn w:val="Heading2"/>
-    <w:next w:val="p11"/>
     <w:qFormat/>
     <w:pPr>
       <w:spacing w:lineRule="auto" w:line="360" w:before="0" w:after="0"/>
@@ -2849,14 +3178,26 @@
   </w:style>
   <w:style w:type="paragraph" w:styleId="img11">
     <w:name w:val="img1"/>
-    <w:basedOn w:val="p11"/>
-    <w:next w:val="p11"/>
+    <w:basedOn w:val="Normal"/>
     <w:qFormat/>
     <w:pPr>
       <w:ind w:hanging="0"/>
       <w:jc w:val="center"/>
     </w:pPr>
     <w:rPr/>
+  </w:style>
+  <w:style w:type="paragraph" w:styleId="p11">
+    <w:name w:val="p1"/>
+    <w:basedOn w:val="Normal"/>
+    <w:qFormat/>
+    <w:pPr>
+      <w:spacing w:lineRule="auto" w:line="360" w:before="0" w:after="0"/>
+      <w:ind w:firstLine="851"/>
+    </w:pPr>
+    <w:rPr>
+      <w:rFonts w:ascii="Times New Roman" w:hAnsi="Times New Roman"/>
+      <w:sz w:val="28"/>
+    </w:rPr>
   </w:style>
   <w:style w:type="numbering" w:styleId="user3" w:default="1">
     <w:name w:val="Без маркерів (user)"/>

</xml_diff>

<commit_message>
IA6 almost done HALLELUJAH
</commit_message>
<xml_diff>
--- a/41IA Intelektualnyj analiz danyh/6/IA_KNT-122_Onyshchenko_19_PR6.docx
+++ b/41IA Intelektualnyj analiz danyh/6/IA_KNT-122_Onyshchenko_19_PR6.docx
@@ -1471,6 +1471,351 @@
           <w:lang w:val="en-US"/>
         </w:rPr>
         <w:t>KMeans</w:t>
+      </w:r>
+    </w:p>
+    <w:p>
+      <w:pPr>
+        <w:pStyle w:val="P1"/>
+        <w:rPr/>
+      </w:pPr>
+      <w:r>
+        <w:rPr/>
+      </w:r>
+    </w:p>
+    <w:p>
+      <w:pPr>
+        <w:pStyle w:val="H2"/>
+        <w:rPr/>
+      </w:pPr>
+      <w:r>
+        <w:rPr/>
+        <w:t xml:space="preserve">Метод </w:t>
+      </w:r>
+      <w:r>
+        <w:rPr>
+          <w:lang w:val="en-US"/>
+        </w:rPr>
+        <w:t>DBSCAN</w:t>
+      </w:r>
+    </w:p>
+    <w:p>
+      <w:pPr>
+        <w:pStyle w:val="H3"/>
+        <w:rPr/>
+      </w:pPr>
+      <w:r>
+        <w:rPr/>
+        <w:t>Код</w:t>
+      </w:r>
+    </w:p>
+    <w:p>
+      <w:pPr>
+        <w:pStyle w:val="H3"/>
+        <w:rPr/>
+      </w:pPr>
+      <w:r>
+        <w:rPr/>
+        <w:t>Результати</w:t>
+      </w:r>
+    </w:p>
+    <w:p>
+      <w:pPr>
+        <w:pStyle w:val="H2"/>
+        <w:rPr/>
+      </w:pPr>
+      <w:r>
+        <w:rPr/>
+        <w:t>Ієрархічна кластеризація</w:t>
+      </w:r>
+    </w:p>
+    <w:p>
+      <w:pPr>
+        <w:pStyle w:val="H3"/>
+        <w:rPr/>
+      </w:pPr>
+      <w:r>
+        <w:rPr/>
+        <w:t>Код</w:t>
+      </w:r>
+    </w:p>
+    <w:p>
+      <w:pPr>
+        <w:pStyle w:val="P1"/>
+        <w:rPr/>
+      </w:pPr>
+      <w:r>
+        <w:rPr/>
+      </w:r>
+    </w:p>
+    <w:p>
+      <w:pPr>
+        <w:pStyle w:val="Code"/>
+        <w:rPr/>
+      </w:pPr>
+      <w:r>
+        <w:rPr/>
+        <w:t>import os</w:t>
+      </w:r>
+    </w:p>
+    <w:p>
+      <w:pPr>
+        <w:pStyle w:val="Code"/>
+        <w:rPr/>
+      </w:pPr>
+      <w:r>
+        <w:rPr/>
+        <w:t>import pandas as pd</w:t>
+      </w:r>
+    </w:p>
+    <w:p>
+      <w:pPr>
+        <w:pStyle w:val="Code"/>
+        <w:rPr/>
+      </w:pPr>
+      <w:r>
+        <w:rPr/>
+        <w:t>from matplotlib import pyplot as plt</w:t>
+      </w:r>
+    </w:p>
+    <w:p>
+      <w:pPr>
+        <w:pStyle w:val="Code"/>
+        <w:rPr/>
+      </w:pPr>
+      <w:r>
+        <w:rPr/>
+      </w:r>
+    </w:p>
+    <w:p>
+      <w:pPr>
+        <w:pStyle w:val="Code"/>
+        <w:rPr/>
+      </w:pPr>
+      <w:r>
+        <w:rPr/>
+        <w:t>from scipy.cluster.hierarchy import linkage, dendrogram</w:t>
+      </w:r>
+    </w:p>
+    <w:p>
+      <w:pPr>
+        <w:pStyle w:val="Code"/>
+        <w:rPr/>
+      </w:pPr>
+      <w:r>
+        <w:rPr/>
+      </w:r>
+    </w:p>
+    <w:p>
+      <w:pPr>
+        <w:pStyle w:val="Code"/>
+        <w:rPr/>
+      </w:pPr>
+      <w:r>
+        <w:rPr/>
+        <w:t>current_dir = os.path.dirname(os.path.abspath(__file__))</w:t>
+      </w:r>
+    </w:p>
+    <w:p>
+      <w:pPr>
+        <w:pStyle w:val="Code"/>
+        <w:rPr/>
+      </w:pPr>
+      <w:r>
+        <w:rPr/>
+        <w:t>file_name = "zoo.csv"</w:t>
+      </w:r>
+    </w:p>
+    <w:p>
+      <w:pPr>
+        <w:pStyle w:val="Code"/>
+        <w:rPr/>
+      </w:pPr>
+      <w:r>
+        <w:rPr/>
+        <w:t>file_path = os.path.join(current_dir, file_name)</w:t>
+      </w:r>
+    </w:p>
+    <w:p>
+      <w:pPr>
+        <w:pStyle w:val="Code"/>
+        <w:rPr/>
+      </w:pPr>
+      <w:r>
+        <w:rPr/>
+      </w:r>
+    </w:p>
+    <w:p>
+      <w:pPr>
+        <w:pStyle w:val="Code"/>
+        <w:rPr/>
+      </w:pPr>
+      <w:r>
+        <w:rPr/>
+        <w:t>df = pd.read_csv(file_path)</w:t>
+      </w:r>
+    </w:p>
+    <w:p>
+      <w:pPr>
+        <w:pStyle w:val="Code"/>
+        <w:rPr/>
+      </w:pPr>
+      <w:r>
+        <w:rPr/>
+        <w:t>TARGET_FEATURE = "type"</w:t>
+      </w:r>
+    </w:p>
+    <w:p>
+      <w:pPr>
+        <w:pStyle w:val="Code"/>
+        <w:rPr/>
+      </w:pPr>
+      <w:r>
+        <w:rPr/>
+        <w:t>Y = df[TARGET_FEATURE]</w:t>
+      </w:r>
+    </w:p>
+    <w:p>
+      <w:pPr>
+        <w:pStyle w:val="Code"/>
+        <w:rPr/>
+      </w:pPr>
+      <w:r>
+        <w:rPr/>
+        <w:t>X = df.drop([TARGET_FEATURE, "animal"], axis=1)</w:t>
+      </w:r>
+    </w:p>
+    <w:p>
+      <w:pPr>
+        <w:pStyle w:val="Code"/>
+        <w:rPr/>
+      </w:pPr>
+      <w:r>
+        <w:rPr/>
+        <w:t>print(X)</w:t>
+      </w:r>
+    </w:p>
+    <w:p>
+      <w:pPr>
+        <w:pStyle w:val="Code"/>
+        <w:rPr/>
+      </w:pPr>
+      <w:r>
+        <w:rPr/>
+      </w:r>
+    </w:p>
+    <w:p>
+      <w:pPr>
+        <w:pStyle w:val="Code"/>
+        <w:rPr/>
+      </w:pPr>
+      <w:r>
+        <w:rPr/>
+        <w:t>mergins = linkage(X, method="complete")</w:t>
+      </w:r>
+    </w:p>
+    <w:p>
+      <w:pPr>
+        <w:pStyle w:val="Code"/>
+        <w:rPr/>
+      </w:pPr>
+      <w:r>
+        <w:rPr/>
+        <w:t>dendrogram(mergins, labels=Y.tolist())</w:t>
+      </w:r>
+    </w:p>
+    <w:p>
+      <w:pPr>
+        <w:pStyle w:val="Code"/>
+        <w:rPr/>
+      </w:pPr>
+      <w:r>
+        <w:rPr/>
+        <w:t>plt.show()</w:t>
+      </w:r>
+    </w:p>
+    <w:p>
+      <w:pPr>
+        <w:pStyle w:val="P1"/>
+        <w:rPr/>
+      </w:pPr>
+      <w:r>
+        <w:rPr/>
+      </w:r>
+    </w:p>
+    <w:p>
+      <w:pPr>
+        <w:pStyle w:val="H3"/>
+        <w:rPr/>
+      </w:pPr>
+      <w:r>
+        <w:rPr/>
+        <w:t>Результати</w:t>
+      </w:r>
+    </w:p>
+    <w:p>
+      <w:pPr>
+        <w:pStyle w:val="IMG1"/>
+        <w:rPr/>
+      </w:pPr>
+      <w:r>
+        <w:rPr/>
+      </w:r>
+    </w:p>
+    <w:p>
+      <w:pPr>
+        <w:pStyle w:val="IMG1"/>
+        <w:rPr/>
+      </w:pPr>
+      <w:r>
+        <w:rPr/>
+        <w:drawing>
+          <wp:inline distT="0" distB="0" distL="0" distR="0">
+            <wp:extent cx="5731510" cy="2999740"/>
+            <wp:effectExtent l="0" t="0" r="0" b="0"/>
+            <wp:docPr id="2" name="Зображення2"/>
+            <wp:cNvGraphicFramePr>
+              <a:graphicFrameLocks xmlns:a="http://schemas.openxmlformats.org/drawingml/2006/main" noChangeAspect="1"/>
+            </wp:cNvGraphicFramePr>
+            <a:graphic xmlns:a="http://schemas.openxmlformats.org/drawingml/2006/main">
+              <a:graphicData uri="http://schemas.openxmlformats.org/drawingml/2006/picture">
+                <pic:pic xmlns:pic="http://schemas.openxmlformats.org/drawingml/2006/picture">
+                  <pic:nvPicPr>
+                    <pic:cNvPr id="2" name="Зображення2"/>
+                    <pic:cNvPicPr>
+                      <a:picLocks noChangeAspect="1" noChangeArrowheads="1"/>
+                    </pic:cNvPicPr>
+                  </pic:nvPicPr>
+                  <pic:blipFill>
+                    <a:blip r:embed="rId3"/>
+                    <a:stretch>
+                      <a:fillRect/>
+                    </a:stretch>
+                  </pic:blipFill>
+                  <pic:spPr bwMode="auto">
+                    <a:xfrm>
+                      <a:off x="0" y="0"/>
+                      <a:ext cx="5731510" cy="2999740"/>
+                    </a:xfrm>
+                    <a:prstGeom prst="rect">
+                      <a:avLst/>
+                    </a:prstGeom>
+                    <a:noFill/>
+                  </pic:spPr>
+                </pic:pic>
+              </a:graphicData>
+            </a:graphic>
+          </wp:inline>
+        </w:drawing>
+      </w:r>
+    </w:p>
+    <w:p>
+      <w:pPr>
+        <w:pStyle w:val="IMG1"/>
+        <w:rPr/>
+      </w:pPr>
+      <w:r>
+        <w:rPr/>
+        <w:t>Рисунок 3.1 — Дендрограма, отримана в результаті роботи</w:t>
       </w:r>
     </w:p>
     <w:p>

</xml_diff>

<commit_message>
IA finished praise KING JESUS CHRIST our LORD
</commit_message>
<xml_diff>
--- a/41IA Intelektualnyj analiz danyh/6/IA_KNT-122_Onyshchenko_19_PR6.docx
+++ b/41IA Intelektualnyj analiz danyh/6/IA_KNT-122_Onyshchenko_19_PR6.docx
@@ -1510,6 +1510,269 @@
     </w:p>
     <w:p>
       <w:pPr>
+        <w:pStyle w:val="P1"/>
+        <w:rPr/>
+      </w:pPr>
+      <w:r>
+        <w:rPr/>
+      </w:r>
+    </w:p>
+    <w:p>
+      <w:pPr>
+        <w:pStyle w:val="Code"/>
+        <w:rPr/>
+      </w:pPr>
+      <w:r>
+        <w:rPr/>
+        <w:t>import os</w:t>
+      </w:r>
+    </w:p>
+    <w:p>
+      <w:pPr>
+        <w:pStyle w:val="Code"/>
+        <w:rPr/>
+      </w:pPr>
+      <w:r>
+        <w:rPr/>
+        <w:t>import pandas as pd</w:t>
+      </w:r>
+    </w:p>
+    <w:p>
+      <w:pPr>
+        <w:pStyle w:val="Code"/>
+        <w:rPr/>
+      </w:pPr>
+      <w:r>
+        <w:rPr/>
+        <w:t>import numpy as np</w:t>
+      </w:r>
+    </w:p>
+    <w:p>
+      <w:pPr>
+        <w:pStyle w:val="Code"/>
+        <w:rPr/>
+      </w:pPr>
+      <w:r>
+        <w:rPr/>
+      </w:r>
+    </w:p>
+    <w:p>
+      <w:pPr>
+        <w:pStyle w:val="Code"/>
+        <w:rPr/>
+      </w:pPr>
+      <w:r>
+        <w:rPr/>
+        <w:t>from sklearn.model_selection import train_test_split</w:t>
+      </w:r>
+    </w:p>
+    <w:p>
+      <w:pPr>
+        <w:pStyle w:val="Code"/>
+        <w:rPr/>
+      </w:pPr>
+      <w:r>
+        <w:rPr/>
+        <w:t>from sklearn.metrics.cluster import contingency_matrix</w:t>
+      </w:r>
+    </w:p>
+    <w:p>
+      <w:pPr>
+        <w:pStyle w:val="Code"/>
+        <w:rPr/>
+      </w:pPr>
+      <w:r>
+        <w:rPr/>
+        <w:t>from sklearn.cluster import DBSCAN</w:t>
+      </w:r>
+    </w:p>
+    <w:p>
+      <w:pPr>
+        <w:pStyle w:val="Code"/>
+        <w:rPr/>
+      </w:pPr>
+      <w:r>
+        <w:rPr/>
+      </w:r>
+    </w:p>
+    <w:p>
+      <w:pPr>
+        <w:pStyle w:val="Code"/>
+        <w:rPr/>
+      </w:pPr>
+      <w:r>
+        <w:rPr/>
+        <w:t>current_dir = os.path.dirname(os.path.abspath(__file__))</w:t>
+      </w:r>
+    </w:p>
+    <w:p>
+      <w:pPr>
+        <w:pStyle w:val="Code"/>
+        <w:rPr/>
+      </w:pPr>
+      <w:r>
+        <w:rPr/>
+        <w:t>file_name = "zoo.csv"</w:t>
+      </w:r>
+    </w:p>
+    <w:p>
+      <w:pPr>
+        <w:pStyle w:val="Code"/>
+        <w:rPr/>
+      </w:pPr>
+      <w:r>
+        <w:rPr/>
+        <w:t>file_path = os.path.join(current_dir, file_name)</w:t>
+      </w:r>
+    </w:p>
+    <w:p>
+      <w:pPr>
+        <w:pStyle w:val="Code"/>
+        <w:rPr/>
+      </w:pPr>
+      <w:r>
+        <w:rPr/>
+      </w:r>
+    </w:p>
+    <w:p>
+      <w:pPr>
+        <w:pStyle w:val="Code"/>
+        <w:rPr/>
+      </w:pPr>
+      <w:r>
+        <w:rPr/>
+        <w:t>df = pd.read_csv(file_path)</w:t>
+      </w:r>
+    </w:p>
+    <w:p>
+      <w:pPr>
+        <w:pStyle w:val="Code"/>
+        <w:rPr/>
+      </w:pPr>
+      <w:r>
+        <w:rPr/>
+        <w:t>TARGET_FEATURE = "type"</w:t>
+      </w:r>
+    </w:p>
+    <w:p>
+      <w:pPr>
+        <w:pStyle w:val="Code"/>
+        <w:rPr/>
+      </w:pPr>
+      <w:r>
+        <w:rPr/>
+        <w:t>Y = df[TARGET_FEATURE]</w:t>
+      </w:r>
+    </w:p>
+    <w:p>
+      <w:pPr>
+        <w:pStyle w:val="Code"/>
+        <w:rPr/>
+      </w:pPr>
+      <w:r>
+        <w:rPr/>
+        <w:t>X = df.drop([TARGET_FEATURE, "animal"], axis=1)</w:t>
+      </w:r>
+    </w:p>
+    <w:p>
+      <w:pPr>
+        <w:pStyle w:val="Code"/>
+        <w:rPr/>
+      </w:pPr>
+      <w:r>
+        <w:rPr/>
+        <w:t>print(X)</w:t>
+      </w:r>
+    </w:p>
+    <w:p>
+      <w:pPr>
+        <w:pStyle w:val="Code"/>
+        <w:rPr/>
+      </w:pPr>
+      <w:r>
+        <w:rPr/>
+      </w:r>
+    </w:p>
+    <w:p>
+      <w:pPr>
+        <w:pStyle w:val="Code"/>
+        <w:rPr/>
+      </w:pPr>
+      <w:r>
+        <w:rPr/>
+        <w:t>model = DBSCAN(eps=0.5, min_samples=5)</w:t>
+      </w:r>
+    </w:p>
+    <w:p>
+      <w:pPr>
+        <w:pStyle w:val="Code"/>
+        <w:rPr/>
+      </w:pPr>
+      <w:r>
+        <w:rPr/>
+        <w:t>Y_predict = model.fit_predict(X)</w:t>
+      </w:r>
+    </w:p>
+    <w:p>
+      <w:pPr>
+        <w:pStyle w:val="Code"/>
+        <w:rPr/>
+      </w:pPr>
+      <w:r>
+        <w:rPr/>
+      </w:r>
+    </w:p>
+    <w:p>
+      <w:pPr>
+        <w:pStyle w:val="Code"/>
+        <w:rPr/>
+      </w:pPr>
+      <w:r>
+        <w:rPr/>
+        <w:t>matrix = pd.DataFrame(contingency_matrix(Y, Y_predict))</w:t>
+      </w:r>
+    </w:p>
+    <w:p>
+      <w:pPr>
+        <w:pStyle w:val="Code"/>
+        <w:rPr/>
+      </w:pPr>
+      <w:r>
+        <w:rPr/>
+        <w:t>matrix.index = Y.unique()</w:t>
+      </w:r>
+    </w:p>
+    <w:p>
+      <w:pPr>
+        <w:pStyle w:val="Code"/>
+        <w:rPr/>
+      </w:pPr>
+      <w:r>
+        <w:rPr/>
+        <w:t>matrix.columns = np.unique(Y_predict)</w:t>
+      </w:r>
+    </w:p>
+    <w:p>
+      <w:pPr>
+        <w:pStyle w:val="Code"/>
+        <w:rPr/>
+      </w:pPr>
+      <w:r>
+        <w:rPr/>
+        <w:t>print(matrix)</w:t>
+      </w:r>
+    </w:p>
+    <w:p>
+      <w:pPr>
+        <w:pStyle w:val="P1"/>
+        <w:rPr/>
+      </w:pPr>
+      <w:r>
+        <w:rPr/>
+      </w:r>
+    </w:p>
+    <w:p>
+      <w:pPr>
         <w:pStyle w:val="H3"/>
         <w:rPr/>
       </w:pPr>
@@ -1520,241 +1783,7 @@
     </w:p>
     <w:p>
       <w:pPr>
-        <w:pStyle w:val="H2"/>
-        <w:rPr/>
-      </w:pPr>
-      <w:r>
-        <w:rPr/>
-        <w:t>Ієрархічна кластеризація</w:t>
-      </w:r>
-    </w:p>
-    <w:p>
-      <w:pPr>
-        <w:pStyle w:val="H3"/>
-        <w:rPr/>
-      </w:pPr>
-      <w:r>
-        <w:rPr/>
-        <w:t>Код</w:t>
-      </w:r>
-    </w:p>
-    <w:p>
-      <w:pPr>
         <w:pStyle w:val="P1"/>
-        <w:rPr/>
-      </w:pPr>
-      <w:r>
-        <w:rPr/>
-      </w:r>
-    </w:p>
-    <w:p>
-      <w:pPr>
-        <w:pStyle w:val="Code"/>
-        <w:rPr/>
-      </w:pPr>
-      <w:r>
-        <w:rPr/>
-        <w:t>import os</w:t>
-      </w:r>
-    </w:p>
-    <w:p>
-      <w:pPr>
-        <w:pStyle w:val="Code"/>
-        <w:rPr/>
-      </w:pPr>
-      <w:r>
-        <w:rPr/>
-        <w:t>import pandas as pd</w:t>
-      </w:r>
-    </w:p>
-    <w:p>
-      <w:pPr>
-        <w:pStyle w:val="Code"/>
-        <w:rPr/>
-      </w:pPr>
-      <w:r>
-        <w:rPr/>
-        <w:t>from matplotlib import pyplot as plt</w:t>
-      </w:r>
-    </w:p>
-    <w:p>
-      <w:pPr>
-        <w:pStyle w:val="Code"/>
-        <w:rPr/>
-      </w:pPr>
-      <w:r>
-        <w:rPr/>
-      </w:r>
-    </w:p>
-    <w:p>
-      <w:pPr>
-        <w:pStyle w:val="Code"/>
-        <w:rPr/>
-      </w:pPr>
-      <w:r>
-        <w:rPr/>
-        <w:t>from scipy.cluster.hierarchy import linkage, dendrogram</w:t>
-      </w:r>
-    </w:p>
-    <w:p>
-      <w:pPr>
-        <w:pStyle w:val="Code"/>
-        <w:rPr/>
-      </w:pPr>
-      <w:r>
-        <w:rPr/>
-      </w:r>
-    </w:p>
-    <w:p>
-      <w:pPr>
-        <w:pStyle w:val="Code"/>
-        <w:rPr/>
-      </w:pPr>
-      <w:r>
-        <w:rPr/>
-        <w:t>current_dir = os.path.dirname(os.path.abspath(__file__))</w:t>
-      </w:r>
-    </w:p>
-    <w:p>
-      <w:pPr>
-        <w:pStyle w:val="Code"/>
-        <w:rPr/>
-      </w:pPr>
-      <w:r>
-        <w:rPr/>
-        <w:t>file_name = "zoo.csv"</w:t>
-      </w:r>
-    </w:p>
-    <w:p>
-      <w:pPr>
-        <w:pStyle w:val="Code"/>
-        <w:rPr/>
-      </w:pPr>
-      <w:r>
-        <w:rPr/>
-        <w:t>file_path = os.path.join(current_dir, file_name)</w:t>
-      </w:r>
-    </w:p>
-    <w:p>
-      <w:pPr>
-        <w:pStyle w:val="Code"/>
-        <w:rPr/>
-      </w:pPr>
-      <w:r>
-        <w:rPr/>
-      </w:r>
-    </w:p>
-    <w:p>
-      <w:pPr>
-        <w:pStyle w:val="Code"/>
-        <w:rPr/>
-      </w:pPr>
-      <w:r>
-        <w:rPr/>
-        <w:t>df = pd.read_csv(file_path)</w:t>
-      </w:r>
-    </w:p>
-    <w:p>
-      <w:pPr>
-        <w:pStyle w:val="Code"/>
-        <w:rPr/>
-      </w:pPr>
-      <w:r>
-        <w:rPr/>
-        <w:t>TARGET_FEATURE = "type"</w:t>
-      </w:r>
-    </w:p>
-    <w:p>
-      <w:pPr>
-        <w:pStyle w:val="Code"/>
-        <w:rPr/>
-      </w:pPr>
-      <w:r>
-        <w:rPr/>
-        <w:t>Y = df[TARGET_FEATURE]</w:t>
-      </w:r>
-    </w:p>
-    <w:p>
-      <w:pPr>
-        <w:pStyle w:val="Code"/>
-        <w:rPr/>
-      </w:pPr>
-      <w:r>
-        <w:rPr/>
-        <w:t>X = df.drop([TARGET_FEATURE, "animal"], axis=1)</w:t>
-      </w:r>
-    </w:p>
-    <w:p>
-      <w:pPr>
-        <w:pStyle w:val="Code"/>
-        <w:rPr/>
-      </w:pPr>
-      <w:r>
-        <w:rPr/>
-        <w:t>print(X)</w:t>
-      </w:r>
-    </w:p>
-    <w:p>
-      <w:pPr>
-        <w:pStyle w:val="Code"/>
-        <w:rPr/>
-      </w:pPr>
-      <w:r>
-        <w:rPr/>
-      </w:r>
-    </w:p>
-    <w:p>
-      <w:pPr>
-        <w:pStyle w:val="Code"/>
-        <w:rPr/>
-      </w:pPr>
-      <w:r>
-        <w:rPr/>
-        <w:t>mergins = linkage(X, method="complete")</w:t>
-      </w:r>
-    </w:p>
-    <w:p>
-      <w:pPr>
-        <w:pStyle w:val="Code"/>
-        <w:rPr/>
-      </w:pPr>
-      <w:r>
-        <w:rPr/>
-        <w:t>dendrogram(mergins, labels=Y.tolist())</w:t>
-      </w:r>
-    </w:p>
-    <w:p>
-      <w:pPr>
-        <w:pStyle w:val="Code"/>
-        <w:rPr/>
-      </w:pPr>
-      <w:r>
-        <w:rPr/>
-        <w:t>plt.show()</w:t>
-      </w:r>
-    </w:p>
-    <w:p>
-      <w:pPr>
-        <w:pStyle w:val="P1"/>
-        <w:rPr/>
-      </w:pPr>
-      <w:r>
-        <w:rPr/>
-      </w:r>
-    </w:p>
-    <w:p>
-      <w:pPr>
-        <w:pStyle w:val="H3"/>
-        <w:rPr/>
-      </w:pPr>
-      <w:r>
-        <w:rPr/>
-        <w:t>Результати</w:t>
-      </w:r>
-    </w:p>
-    <w:p>
-      <w:pPr>
-        <w:pStyle w:val="IMG1"/>
         <w:rPr/>
       </w:pPr>
       <w:r>
@@ -1770,9 +1799,9 @@
         <w:rPr/>
         <w:drawing>
           <wp:inline distT="0" distB="0" distL="0" distR="0">
-            <wp:extent cx="5731510" cy="2999740"/>
+            <wp:extent cx="5731510" cy="2731770"/>
             <wp:effectExtent l="0" t="0" r="0" b="0"/>
-            <wp:docPr id="2" name="Зображення2"/>
+            <wp:docPr id="2" name="Зображення3"/>
             <wp:cNvGraphicFramePr>
               <a:graphicFrameLocks xmlns:a="http://schemas.openxmlformats.org/drawingml/2006/main" noChangeAspect="1"/>
             </wp:cNvGraphicFramePr>
@@ -1780,13 +1809,322 @@
               <a:graphicData uri="http://schemas.openxmlformats.org/drawingml/2006/picture">
                 <pic:pic xmlns:pic="http://schemas.openxmlformats.org/drawingml/2006/picture">
                   <pic:nvPicPr>
-                    <pic:cNvPr id="2" name="Зображення2"/>
+                    <pic:cNvPr id="2" name="Зображення3"/>
                     <pic:cNvPicPr>
                       <a:picLocks noChangeAspect="1" noChangeArrowheads="1"/>
                     </pic:cNvPicPr>
                   </pic:nvPicPr>
                   <pic:blipFill>
                     <a:blip r:embed="rId3"/>
+                    <a:stretch>
+                      <a:fillRect/>
+                    </a:stretch>
+                  </pic:blipFill>
+                  <pic:spPr bwMode="auto">
+                    <a:xfrm>
+                      <a:off x="0" y="0"/>
+                      <a:ext cx="5731510" cy="2731770"/>
+                    </a:xfrm>
+                    <a:prstGeom prst="rect">
+                      <a:avLst/>
+                    </a:prstGeom>
+                    <a:noFill/>
+                  </pic:spPr>
+                </pic:pic>
+              </a:graphicData>
+            </a:graphic>
+          </wp:inline>
+        </w:drawing>
+      </w:r>
+    </w:p>
+    <w:p>
+      <w:pPr>
+        <w:pStyle w:val="IMG1"/>
+        <w:rPr/>
+      </w:pPr>
+      <w:r>
+        <w:rPr/>
+        <w:t>Рисунок 2.1 — Результати виконання</w:t>
+      </w:r>
+    </w:p>
+    <w:p>
+      <w:pPr>
+        <w:pStyle w:val="P1"/>
+        <w:rPr/>
+      </w:pPr>
+      <w:r>
+        <w:rPr/>
+      </w:r>
+    </w:p>
+    <w:p>
+      <w:pPr>
+        <w:pStyle w:val="H2"/>
+        <w:rPr/>
+      </w:pPr>
+      <w:r>
+        <w:rPr/>
+        <w:t>Ієрархічна кластеризація</w:t>
+      </w:r>
+    </w:p>
+    <w:p>
+      <w:pPr>
+        <w:pStyle w:val="H3"/>
+        <w:rPr/>
+      </w:pPr>
+      <w:r>
+        <w:rPr/>
+        <w:t>Код</w:t>
+      </w:r>
+    </w:p>
+    <w:p>
+      <w:pPr>
+        <w:pStyle w:val="P1"/>
+        <w:rPr/>
+      </w:pPr>
+      <w:r>
+        <w:rPr/>
+      </w:r>
+    </w:p>
+    <w:p>
+      <w:pPr>
+        <w:pStyle w:val="Code"/>
+        <w:rPr/>
+      </w:pPr>
+      <w:r>
+        <w:rPr/>
+        <w:t>import os</w:t>
+      </w:r>
+    </w:p>
+    <w:p>
+      <w:pPr>
+        <w:pStyle w:val="Code"/>
+        <w:rPr/>
+      </w:pPr>
+      <w:r>
+        <w:rPr/>
+        <w:t>import pandas as pd</w:t>
+      </w:r>
+    </w:p>
+    <w:p>
+      <w:pPr>
+        <w:pStyle w:val="Code"/>
+        <w:rPr/>
+      </w:pPr>
+      <w:r>
+        <w:rPr/>
+        <w:t>from matplotlib import pyplot as plt</w:t>
+      </w:r>
+    </w:p>
+    <w:p>
+      <w:pPr>
+        <w:pStyle w:val="Code"/>
+        <w:rPr/>
+      </w:pPr>
+      <w:r>
+        <w:rPr/>
+      </w:r>
+    </w:p>
+    <w:p>
+      <w:pPr>
+        <w:pStyle w:val="Code"/>
+        <w:rPr/>
+      </w:pPr>
+      <w:r>
+        <w:rPr/>
+        <w:t>from scipy.cluster.hierarchy import linkage, dendrogram</w:t>
+      </w:r>
+    </w:p>
+    <w:p>
+      <w:pPr>
+        <w:pStyle w:val="Code"/>
+        <w:rPr/>
+      </w:pPr>
+      <w:r>
+        <w:rPr/>
+      </w:r>
+    </w:p>
+    <w:p>
+      <w:pPr>
+        <w:pStyle w:val="Code"/>
+        <w:rPr/>
+      </w:pPr>
+      <w:r>
+        <w:rPr/>
+        <w:t>current_dir = os.path.dirname(os.path.abspath(__file__))</w:t>
+      </w:r>
+    </w:p>
+    <w:p>
+      <w:pPr>
+        <w:pStyle w:val="Code"/>
+        <w:rPr/>
+      </w:pPr>
+      <w:r>
+        <w:rPr/>
+        <w:t>file_name = "zoo.csv"</w:t>
+      </w:r>
+    </w:p>
+    <w:p>
+      <w:pPr>
+        <w:pStyle w:val="Code"/>
+        <w:rPr/>
+      </w:pPr>
+      <w:r>
+        <w:rPr/>
+        <w:t>file_path = os.path.join(current_dir, file_name)</w:t>
+      </w:r>
+    </w:p>
+    <w:p>
+      <w:pPr>
+        <w:pStyle w:val="Code"/>
+        <w:rPr/>
+      </w:pPr>
+      <w:r>
+        <w:rPr/>
+      </w:r>
+    </w:p>
+    <w:p>
+      <w:pPr>
+        <w:pStyle w:val="Code"/>
+        <w:rPr/>
+      </w:pPr>
+      <w:r>
+        <w:rPr/>
+        <w:t>df = pd.read_csv(file_path)</w:t>
+      </w:r>
+    </w:p>
+    <w:p>
+      <w:pPr>
+        <w:pStyle w:val="Code"/>
+        <w:rPr/>
+      </w:pPr>
+      <w:r>
+        <w:rPr/>
+        <w:t>TARGET_FEATURE = "type"</w:t>
+      </w:r>
+    </w:p>
+    <w:p>
+      <w:pPr>
+        <w:pStyle w:val="Code"/>
+        <w:rPr/>
+      </w:pPr>
+      <w:r>
+        <w:rPr/>
+        <w:t>Y = df[TARGET_FEATURE]</w:t>
+      </w:r>
+    </w:p>
+    <w:p>
+      <w:pPr>
+        <w:pStyle w:val="Code"/>
+        <w:rPr/>
+      </w:pPr>
+      <w:r>
+        <w:rPr/>
+        <w:t>X = df.drop([TARGET_FEATURE, "animal"], axis=1)</w:t>
+      </w:r>
+    </w:p>
+    <w:p>
+      <w:pPr>
+        <w:pStyle w:val="Code"/>
+        <w:rPr/>
+      </w:pPr>
+      <w:r>
+        <w:rPr/>
+        <w:t>print(X)</w:t>
+      </w:r>
+    </w:p>
+    <w:p>
+      <w:pPr>
+        <w:pStyle w:val="Code"/>
+        <w:rPr/>
+      </w:pPr>
+      <w:r>
+        <w:rPr/>
+      </w:r>
+    </w:p>
+    <w:p>
+      <w:pPr>
+        <w:pStyle w:val="Code"/>
+        <w:rPr/>
+      </w:pPr>
+      <w:r>
+        <w:rPr/>
+        <w:t>mergins = linkage(X, method="complete")</w:t>
+      </w:r>
+    </w:p>
+    <w:p>
+      <w:pPr>
+        <w:pStyle w:val="Code"/>
+        <w:rPr/>
+      </w:pPr>
+      <w:r>
+        <w:rPr/>
+        <w:t>dendrogram(mergins, labels=Y.tolist())</w:t>
+      </w:r>
+    </w:p>
+    <w:p>
+      <w:pPr>
+        <w:pStyle w:val="Code"/>
+        <w:rPr/>
+      </w:pPr>
+      <w:r>
+        <w:rPr/>
+        <w:t>plt.show()</w:t>
+      </w:r>
+    </w:p>
+    <w:p>
+      <w:pPr>
+        <w:pStyle w:val="P1"/>
+        <w:rPr/>
+      </w:pPr>
+      <w:r>
+        <w:rPr/>
+      </w:r>
+    </w:p>
+    <w:p>
+      <w:pPr>
+        <w:pStyle w:val="H3"/>
+        <w:rPr/>
+      </w:pPr>
+      <w:r>
+        <w:rPr/>
+        <w:t>Результати</w:t>
+      </w:r>
+    </w:p>
+    <w:p>
+      <w:pPr>
+        <w:pStyle w:val="IMG1"/>
+        <w:rPr/>
+      </w:pPr>
+      <w:r>
+        <w:rPr/>
+      </w:r>
+    </w:p>
+    <w:p>
+      <w:pPr>
+        <w:pStyle w:val="IMG1"/>
+        <w:rPr/>
+      </w:pPr>
+      <w:r>
+        <w:rPr/>
+        <w:drawing>
+          <wp:inline distT="0" distB="0" distL="0" distR="0">
+            <wp:extent cx="5731510" cy="2999740"/>
+            <wp:effectExtent l="0" t="0" r="0" b="0"/>
+            <wp:docPr id="3" name="Зображення2"/>
+            <wp:cNvGraphicFramePr>
+              <a:graphicFrameLocks xmlns:a="http://schemas.openxmlformats.org/drawingml/2006/main" noChangeAspect="1"/>
+            </wp:cNvGraphicFramePr>
+            <a:graphic xmlns:a="http://schemas.openxmlformats.org/drawingml/2006/main">
+              <a:graphicData uri="http://schemas.openxmlformats.org/drawingml/2006/picture">
+                <pic:pic xmlns:pic="http://schemas.openxmlformats.org/drawingml/2006/picture">
+                  <pic:nvPicPr>
+                    <pic:cNvPr id="3" name="Зображення2"/>
+                    <pic:cNvPicPr>
+                      <a:picLocks noChangeAspect="1" noChangeArrowheads="1"/>
+                    </pic:cNvPicPr>
+                  </pic:nvPicPr>
+                  <pic:blipFill>
+                    <a:blip r:embed="rId4"/>
                     <a:stretch>
                       <a:fillRect/>
                     </a:stretch>

</xml_diff>

<commit_message>
praise King Jesus Christ our LORD
</commit_message>
<xml_diff>
--- a/41IA Intelektualnyj analiz danyh/6/IA_KNT-122_Onyshchenko_19_PR6.docx
+++ b/41IA Intelektualnyj analiz danyh/6/IA_KNT-122_Onyshchenko_19_PR6.docx
@@ -404,6 +404,7 @@
     <w:p>
       <w:pPr>
         <w:pStyle w:val="H1"/>
+        <w:spacing w:before="0" w:after="0"/>
         <w:rPr/>
       </w:pPr>
       <w:r>
@@ -730,17 +731,7 @@
           <w:smallCaps w:val="false"/>
           <w:spacing w:val="0"/>
         </w:rPr>
-        <w:t xml:space="preserve">2. </w:t>
-      </w:r>
-      <w:r>
-        <w:rPr>
-          <w:b w:val="false"/>
-          <w:i w:val="false"/>
-          <w:caps w:val="false"/>
-          <w:smallCaps w:val="false"/>
-          <w:spacing w:val="0"/>
-        </w:rPr>
-        <w:t>Вирішити задачу кластеризації  за  допомогою  засобів  мови програмування Python:</w:t>
+        <w:t>2. Вирішити задачу кластеризації  за  допомогою  засобів  мови програмування Python:</w:t>
       </w:r>
     </w:p>
     <w:p>
@@ -1077,15 +1068,11 @@
         <w:pStyle w:val="H2"/>
         <w:rPr/>
       </w:pPr>
-      <w:bookmarkStart w:id="0" w:name="%25D0%25B7%25D0%25B0%25D0%25B2%25D0%25B0"/>
+      <w:bookmarkStart w:id="0" w:name="%2525D0%2525B7%2525D0%2525B0%2525D0%2525"/>
       <w:bookmarkEnd w:id="0"/>
       <w:r>
         <w:rPr/>
-        <w:t xml:space="preserve">1 </w:t>
-      </w:r>
-      <w:r>
-        <w:rPr/>
-        <w:t>Завантажити вибірку «bank.arff»</w:t>
+        <w:t>1 Завантажити вибірку «bank.arff»</w:t>
       </w:r>
     </w:p>
     <w:p>
@@ -1121,16 +1108,16 @@
     </w:p>
     <w:p>
       <w:pPr>
-        <w:pStyle w:val="P1"/>
-        <w:rPr/>
-      </w:pPr>
-      <w:r>
-        <w:rPr/>
-      </w:r>
-    </w:p>
-    <w:p>
-      <w:pPr>
-        <w:pStyle w:val="P1"/>
+        <w:pStyle w:val="IMG1"/>
+        <w:rPr/>
+      </w:pPr>
+      <w:r>
+        <w:rPr/>
+      </w:r>
+    </w:p>
+    <w:p>
+      <w:pPr>
+        <w:pStyle w:val="IMG1"/>
         <w:rPr/>
       </w:pPr>
       <w:r>
@@ -1177,7 +1164,7 @@
     </w:p>
     <w:p>
       <w:pPr>
-        <w:pStyle w:val="P1"/>
+        <w:pStyle w:val="IMG1"/>
         <w:rPr/>
       </w:pPr>
       <w:r>
@@ -1199,15 +1186,11 @@
         <w:pStyle w:val="H2"/>
         <w:rPr/>
       </w:pPr>
-      <w:bookmarkStart w:id="1" w:name="%25D0%25B0%25D0%25BB%25D0%25B3%25D0%25BE"/>
+      <w:bookmarkStart w:id="1" w:name="%2525D0%2525B0%2525D0%2525BB%2525D0%2525"/>
       <w:bookmarkEnd w:id="1"/>
       <w:r>
         <w:rPr/>
-        <w:t xml:space="preserve">2 </w:t>
-      </w:r>
-      <w:r>
-        <w:rPr/>
-        <w:t>Алгоритм кластеризації SimpleKMeans</w:t>
+        <w:t>2 Алгоритм кластеризації SimpleKMeans</w:t>
       </w:r>
     </w:p>
     <w:p>
@@ -1345,15 +1328,11 @@
         <w:pStyle w:val="H2"/>
         <w:rPr/>
       </w:pPr>
-      <w:bookmarkStart w:id="2" w:name="%25D1%2582%25D0%25B0%25D0%25B1%25D0%25BB"/>
+      <w:bookmarkStart w:id="2" w:name="%2525D1%252582%2525D0%2525B0%2525D0%2525"/>
       <w:bookmarkEnd w:id="2"/>
       <w:r>
         <w:rPr/>
-        <w:t xml:space="preserve">3 </w:t>
-      </w:r>
-      <w:r>
-        <w:rPr/>
-        <w:t>Таблиця значень сум квадратичних помилок, одержуваних при різних значеннях</w:t>
+        <w:t>3 Таблиця значень сум квадратичних помилок, одержуваних при різних значеннях</w:t>
       </w:r>
     </w:p>
     <w:p>
@@ -1417,8 +1396,8 @@
         </w:tblCellMar>
       </w:tblPr>
       <w:tblGrid>
-        <w:gridCol w:w="2665"/>
-        <w:gridCol w:w="2581"/>
+        <w:gridCol w:w="2664"/>
+        <w:gridCol w:w="2582"/>
       </w:tblGrid>
       <w:tr>
         <w:trPr>
@@ -1426,7 +1405,7 @@
         </w:trPr>
         <w:tc>
           <w:tcPr>
-            <w:tcW w:w="2665" w:type="dxa"/>
+            <w:tcW w:w="2664" w:type="dxa"/>
             <w:tcBorders>
               <w:top w:val="single" w:sz="4" w:space="0" w:color="000000"/>
               <w:left w:val="single" w:sz="4" w:space="0" w:color="000000"/>
@@ -1436,7 +1415,7 @@
           </w:tcPr>
           <w:p>
             <w:pPr>
-              <w:pStyle w:val="Style16"/>
+              <w:pStyle w:val="user4"/>
               <w:spacing w:lineRule="auto" w:line="240"/>
               <w:ind w:hanging="0" w:left="0" w:right="0"/>
               <w:jc w:val="left"/>
@@ -1450,7 +1429,7 @@
         </w:tc>
         <w:tc>
           <w:tcPr>
-            <w:tcW w:w="2581" w:type="dxa"/>
+            <w:tcW w:w="2582" w:type="dxa"/>
             <w:tcBorders>
               <w:top w:val="single" w:sz="4" w:space="0" w:color="000000"/>
               <w:left w:val="single" w:sz="4" w:space="0" w:color="000000"/>
@@ -1461,7 +1440,7 @@
           </w:tcPr>
           <w:p>
             <w:pPr>
-              <w:pStyle w:val="Style16"/>
+              <w:pStyle w:val="user4"/>
               <w:spacing w:lineRule="auto" w:line="240"/>
               <w:ind w:hanging="0" w:left="0" w:right="0"/>
               <w:jc w:val="left"/>
@@ -1478,7 +1457,7 @@
         <w:trPr/>
         <w:tc>
           <w:tcPr>
-            <w:tcW w:w="2665" w:type="dxa"/>
+            <w:tcW w:w="2664" w:type="dxa"/>
             <w:tcBorders>
               <w:left w:val="single" w:sz="4" w:space="0" w:color="000000"/>
               <w:bottom w:val="single" w:sz="4" w:space="0" w:color="000000"/>
@@ -1487,7 +1466,7 @@
           </w:tcPr>
           <w:p>
             <w:pPr>
-              <w:pStyle w:val="Style15"/>
+              <w:pStyle w:val="user3"/>
               <w:spacing w:lineRule="auto" w:line="240"/>
               <w:ind w:hanging="0" w:left="0" w:right="0"/>
               <w:rPr/>
@@ -1500,7 +1479,7 @@
         </w:tc>
         <w:tc>
           <w:tcPr>
-            <w:tcW w:w="2581" w:type="dxa"/>
+            <w:tcW w:w="2582" w:type="dxa"/>
             <w:tcBorders>
               <w:left w:val="single" w:sz="4" w:space="0" w:color="000000"/>
               <w:bottom w:val="single" w:sz="4" w:space="0" w:color="000000"/>
@@ -1510,7 +1489,7 @@
           </w:tcPr>
           <w:p>
             <w:pPr>
-              <w:pStyle w:val="Style15"/>
+              <w:pStyle w:val="user3"/>
               <w:spacing w:lineRule="auto" w:line="240"/>
               <w:ind w:hanging="0" w:left="0" w:right="0"/>
               <w:rPr/>
@@ -1526,7 +1505,7 @@
         <w:trPr/>
         <w:tc>
           <w:tcPr>
-            <w:tcW w:w="2665" w:type="dxa"/>
+            <w:tcW w:w="2664" w:type="dxa"/>
             <w:tcBorders>
               <w:left w:val="single" w:sz="4" w:space="0" w:color="000000"/>
               <w:bottom w:val="single" w:sz="4" w:space="0" w:color="000000"/>
@@ -1535,7 +1514,7 @@
           </w:tcPr>
           <w:p>
             <w:pPr>
-              <w:pStyle w:val="Style15"/>
+              <w:pStyle w:val="user3"/>
               <w:spacing w:lineRule="auto" w:line="240"/>
               <w:ind w:hanging="0" w:left="0" w:right="0"/>
               <w:rPr/>
@@ -1548,7 +1527,7 @@
         </w:tc>
         <w:tc>
           <w:tcPr>
-            <w:tcW w:w="2581" w:type="dxa"/>
+            <w:tcW w:w="2582" w:type="dxa"/>
             <w:tcBorders>
               <w:left w:val="single" w:sz="4" w:space="0" w:color="000000"/>
               <w:bottom w:val="single" w:sz="4" w:space="0" w:color="000000"/>
@@ -1558,7 +1537,7 @@
           </w:tcPr>
           <w:p>
             <w:pPr>
-              <w:pStyle w:val="Style15"/>
+              <w:pStyle w:val="user3"/>
               <w:spacing w:lineRule="auto" w:line="240"/>
               <w:ind w:hanging="0" w:left="0" w:right="0"/>
               <w:rPr/>
@@ -1574,7 +1553,7 @@
         <w:trPr/>
         <w:tc>
           <w:tcPr>
-            <w:tcW w:w="2665" w:type="dxa"/>
+            <w:tcW w:w="2664" w:type="dxa"/>
             <w:tcBorders>
               <w:left w:val="single" w:sz="4" w:space="0" w:color="000000"/>
               <w:bottom w:val="single" w:sz="4" w:space="0" w:color="000000"/>
@@ -1583,7 +1562,7 @@
           </w:tcPr>
           <w:p>
             <w:pPr>
-              <w:pStyle w:val="Style15"/>
+              <w:pStyle w:val="user3"/>
               <w:spacing w:lineRule="auto" w:line="240"/>
               <w:ind w:hanging="0" w:left="0" w:right="0"/>
               <w:rPr/>
@@ -1596,7 +1575,7 @@
         </w:tc>
         <w:tc>
           <w:tcPr>
-            <w:tcW w:w="2581" w:type="dxa"/>
+            <w:tcW w:w="2582" w:type="dxa"/>
             <w:tcBorders>
               <w:left w:val="single" w:sz="4" w:space="0" w:color="000000"/>
               <w:bottom w:val="single" w:sz="4" w:space="0" w:color="000000"/>
@@ -1606,7 +1585,7 @@
           </w:tcPr>
           <w:p>
             <w:pPr>
-              <w:pStyle w:val="Style15"/>
+              <w:pStyle w:val="user3"/>
               <w:spacing w:lineRule="auto" w:line="240"/>
               <w:ind w:hanging="0" w:left="0" w:right="0"/>
               <w:rPr/>
@@ -1622,7 +1601,7 @@
         <w:trPr/>
         <w:tc>
           <w:tcPr>
-            <w:tcW w:w="2665" w:type="dxa"/>
+            <w:tcW w:w="2664" w:type="dxa"/>
             <w:tcBorders>
               <w:left w:val="single" w:sz="4" w:space="0" w:color="000000"/>
               <w:bottom w:val="single" w:sz="4" w:space="0" w:color="000000"/>
@@ -1631,7 +1610,7 @@
           </w:tcPr>
           <w:p>
             <w:pPr>
-              <w:pStyle w:val="Style15"/>
+              <w:pStyle w:val="user3"/>
               <w:spacing w:lineRule="auto" w:line="240"/>
               <w:ind w:hanging="0" w:left="0" w:right="0"/>
               <w:rPr/>
@@ -1644,7 +1623,7 @@
         </w:tc>
         <w:tc>
           <w:tcPr>
-            <w:tcW w:w="2581" w:type="dxa"/>
+            <w:tcW w:w="2582" w:type="dxa"/>
             <w:tcBorders>
               <w:left w:val="single" w:sz="4" w:space="0" w:color="000000"/>
               <w:bottom w:val="single" w:sz="4" w:space="0" w:color="000000"/>
@@ -1654,7 +1633,7 @@
           </w:tcPr>
           <w:p>
             <w:pPr>
-              <w:pStyle w:val="Style15"/>
+              <w:pStyle w:val="user3"/>
               <w:spacing w:lineRule="auto" w:line="240"/>
               <w:ind w:hanging="0" w:left="0" w:right="0"/>
               <w:rPr/>
@@ -1670,7 +1649,7 @@
         <w:trPr/>
         <w:tc>
           <w:tcPr>
-            <w:tcW w:w="2665" w:type="dxa"/>
+            <w:tcW w:w="2664" w:type="dxa"/>
             <w:tcBorders>
               <w:left w:val="single" w:sz="4" w:space="0" w:color="000000"/>
               <w:bottom w:val="single" w:sz="4" w:space="0" w:color="000000"/>
@@ -1679,7 +1658,7 @@
           </w:tcPr>
           <w:p>
             <w:pPr>
-              <w:pStyle w:val="Style15"/>
+              <w:pStyle w:val="user3"/>
               <w:spacing w:lineRule="auto" w:line="240"/>
               <w:ind w:hanging="0" w:left="0" w:right="0"/>
               <w:rPr/>
@@ -1692,7 +1671,7 @@
         </w:tc>
         <w:tc>
           <w:tcPr>
-            <w:tcW w:w="2581" w:type="dxa"/>
+            <w:tcW w:w="2582" w:type="dxa"/>
             <w:tcBorders>
               <w:left w:val="single" w:sz="4" w:space="0" w:color="000000"/>
               <w:bottom w:val="single" w:sz="4" w:space="0" w:color="000000"/>
@@ -1702,7 +1681,7 @@
           </w:tcPr>
           <w:p>
             <w:pPr>
-              <w:pStyle w:val="Style15"/>
+              <w:pStyle w:val="user3"/>
               <w:spacing w:lineRule="auto" w:line="240"/>
               <w:ind w:hanging="0" w:left="0" w:right="0"/>
               <w:rPr/>
@@ -1718,7 +1697,7 @@
         <w:trPr/>
         <w:tc>
           <w:tcPr>
-            <w:tcW w:w="2665" w:type="dxa"/>
+            <w:tcW w:w="2664" w:type="dxa"/>
             <w:tcBorders>
               <w:left w:val="single" w:sz="4" w:space="0" w:color="000000"/>
               <w:bottom w:val="single" w:sz="4" w:space="0" w:color="000000"/>
@@ -1727,7 +1706,7 @@
           </w:tcPr>
           <w:p>
             <w:pPr>
-              <w:pStyle w:val="Style15"/>
+              <w:pStyle w:val="user3"/>
               <w:spacing w:lineRule="auto" w:line="240"/>
               <w:ind w:hanging="0" w:left="0" w:right="0"/>
               <w:rPr/>
@@ -1740,7 +1719,7 @@
         </w:tc>
         <w:tc>
           <w:tcPr>
-            <w:tcW w:w="2581" w:type="dxa"/>
+            <w:tcW w:w="2582" w:type="dxa"/>
             <w:tcBorders>
               <w:left w:val="single" w:sz="4" w:space="0" w:color="000000"/>
               <w:bottom w:val="single" w:sz="4" w:space="0" w:color="000000"/>
@@ -1750,7 +1729,7 @@
           </w:tcPr>
           <w:p>
             <w:pPr>
-              <w:pStyle w:val="Style15"/>
+              <w:pStyle w:val="user3"/>
               <w:spacing w:lineRule="auto" w:line="240"/>
               <w:ind w:hanging="0" w:left="0" w:right="0"/>
               <w:rPr/>
@@ -1766,7 +1745,7 @@
         <w:trPr/>
         <w:tc>
           <w:tcPr>
-            <w:tcW w:w="2665" w:type="dxa"/>
+            <w:tcW w:w="2664" w:type="dxa"/>
             <w:tcBorders>
               <w:left w:val="single" w:sz="4" w:space="0" w:color="000000"/>
               <w:bottom w:val="single" w:sz="4" w:space="0" w:color="000000"/>
@@ -1775,7 +1754,7 @@
           </w:tcPr>
           <w:p>
             <w:pPr>
-              <w:pStyle w:val="Style15"/>
+              <w:pStyle w:val="user3"/>
               <w:spacing w:lineRule="auto" w:line="240"/>
               <w:ind w:hanging="0" w:left="0" w:right="0"/>
               <w:rPr/>
@@ -1788,7 +1767,7 @@
         </w:tc>
         <w:tc>
           <w:tcPr>
-            <w:tcW w:w="2581" w:type="dxa"/>
+            <w:tcW w:w="2582" w:type="dxa"/>
             <w:tcBorders>
               <w:left w:val="single" w:sz="4" w:space="0" w:color="000000"/>
               <w:bottom w:val="single" w:sz="4" w:space="0" w:color="000000"/>
@@ -1798,7 +1777,7 @@
           </w:tcPr>
           <w:p>
             <w:pPr>
-              <w:pStyle w:val="Style15"/>
+              <w:pStyle w:val="user3"/>
               <w:spacing w:lineRule="auto" w:line="240"/>
               <w:ind w:hanging="0" w:left="0" w:right="0"/>
               <w:rPr/>
@@ -1814,7 +1793,7 @@
         <w:trPr/>
         <w:tc>
           <w:tcPr>
-            <w:tcW w:w="2665" w:type="dxa"/>
+            <w:tcW w:w="2664" w:type="dxa"/>
             <w:tcBorders>
               <w:left w:val="single" w:sz="4" w:space="0" w:color="000000"/>
               <w:bottom w:val="single" w:sz="4" w:space="0" w:color="000000"/>
@@ -1823,7 +1802,7 @@
           </w:tcPr>
           <w:p>
             <w:pPr>
-              <w:pStyle w:val="Style15"/>
+              <w:pStyle w:val="user3"/>
               <w:spacing w:lineRule="auto" w:line="240"/>
               <w:ind w:hanging="0" w:left="0" w:right="0"/>
               <w:rPr/>
@@ -1836,7 +1815,7 @@
         </w:tc>
         <w:tc>
           <w:tcPr>
-            <w:tcW w:w="2581" w:type="dxa"/>
+            <w:tcW w:w="2582" w:type="dxa"/>
             <w:tcBorders>
               <w:left w:val="single" w:sz="4" w:space="0" w:color="000000"/>
               <w:bottom w:val="single" w:sz="4" w:space="0" w:color="000000"/>
@@ -1846,7 +1825,7 @@
           </w:tcPr>
           <w:p>
             <w:pPr>
-              <w:pStyle w:val="Style15"/>
+              <w:pStyle w:val="user3"/>
               <w:spacing w:lineRule="auto" w:line="240"/>
               <w:ind w:hanging="0" w:left="0" w:right="0"/>
               <w:rPr/>
@@ -1862,7 +1841,7 @@
         <w:trPr/>
         <w:tc>
           <w:tcPr>
-            <w:tcW w:w="2665" w:type="dxa"/>
+            <w:tcW w:w="2664" w:type="dxa"/>
             <w:tcBorders>
               <w:left w:val="single" w:sz="4" w:space="0" w:color="000000"/>
               <w:bottom w:val="single" w:sz="4" w:space="0" w:color="000000"/>
@@ -1871,7 +1850,7 @@
           </w:tcPr>
           <w:p>
             <w:pPr>
-              <w:pStyle w:val="Style15"/>
+              <w:pStyle w:val="user3"/>
               <w:spacing w:lineRule="auto" w:line="240"/>
               <w:ind w:hanging="0" w:left="0" w:right="0"/>
               <w:rPr/>
@@ -1884,7 +1863,7 @@
         </w:tc>
         <w:tc>
           <w:tcPr>
-            <w:tcW w:w="2581" w:type="dxa"/>
+            <w:tcW w:w="2582" w:type="dxa"/>
             <w:tcBorders>
               <w:left w:val="single" w:sz="4" w:space="0" w:color="000000"/>
               <w:bottom w:val="single" w:sz="4" w:space="0" w:color="000000"/>
@@ -1894,7 +1873,7 @@
           </w:tcPr>
           <w:p>
             <w:pPr>
-              <w:pStyle w:val="Style15"/>
+              <w:pStyle w:val="user3"/>
               <w:spacing w:lineRule="auto" w:line="240"/>
               <w:ind w:hanging="0" w:left="0" w:right="0"/>
               <w:rPr/>
@@ -1910,7 +1889,7 @@
         <w:trPr/>
         <w:tc>
           <w:tcPr>
-            <w:tcW w:w="2665" w:type="dxa"/>
+            <w:tcW w:w="2664" w:type="dxa"/>
             <w:tcBorders>
               <w:left w:val="single" w:sz="4" w:space="0" w:color="000000"/>
               <w:bottom w:val="single" w:sz="4" w:space="0" w:color="000000"/>
@@ -1919,7 +1898,7 @@
           </w:tcPr>
           <w:p>
             <w:pPr>
-              <w:pStyle w:val="Style15"/>
+              <w:pStyle w:val="user3"/>
               <w:spacing w:lineRule="auto" w:line="240"/>
               <w:ind w:hanging="0" w:left="0" w:right="0"/>
               <w:rPr/>
@@ -1932,7 +1911,7 @@
         </w:tc>
         <w:tc>
           <w:tcPr>
-            <w:tcW w:w="2581" w:type="dxa"/>
+            <w:tcW w:w="2582" w:type="dxa"/>
             <w:tcBorders>
               <w:left w:val="single" w:sz="4" w:space="0" w:color="000000"/>
               <w:bottom w:val="single" w:sz="4" w:space="0" w:color="000000"/>
@@ -1942,7 +1921,7 @@
           </w:tcPr>
           <w:p>
             <w:pPr>
-              <w:pStyle w:val="Style15"/>
+              <w:pStyle w:val="user3"/>
               <w:spacing w:lineRule="auto" w:line="240"/>
               <w:ind w:hanging="0" w:left="0" w:right="0"/>
               <w:rPr/>
@@ -1958,7 +1937,7 @@
         <w:trPr/>
         <w:tc>
           <w:tcPr>
-            <w:tcW w:w="2665" w:type="dxa"/>
+            <w:tcW w:w="2664" w:type="dxa"/>
             <w:tcBorders>
               <w:left w:val="single" w:sz="4" w:space="0" w:color="000000"/>
               <w:bottom w:val="single" w:sz="4" w:space="0" w:color="000000"/>
@@ -1967,7 +1946,7 @@
           </w:tcPr>
           <w:p>
             <w:pPr>
-              <w:pStyle w:val="Style15"/>
+              <w:pStyle w:val="user3"/>
               <w:spacing w:lineRule="auto" w:line="240"/>
               <w:ind w:hanging="0" w:left="0" w:right="0"/>
               <w:rPr/>
@@ -1980,7 +1959,7 @@
         </w:tc>
         <w:tc>
           <w:tcPr>
-            <w:tcW w:w="2581" w:type="dxa"/>
+            <w:tcW w:w="2582" w:type="dxa"/>
             <w:tcBorders>
               <w:left w:val="single" w:sz="4" w:space="0" w:color="000000"/>
               <w:bottom w:val="single" w:sz="4" w:space="0" w:color="000000"/>
@@ -1990,7 +1969,7 @@
           </w:tcPr>
           <w:p>
             <w:pPr>
-              <w:pStyle w:val="Style15"/>
+              <w:pStyle w:val="user3"/>
               <w:spacing w:lineRule="auto" w:line="240"/>
               <w:ind w:hanging="0" w:left="0" w:right="0"/>
               <w:rPr/>
@@ -2006,7 +1985,7 @@
         <w:trPr/>
         <w:tc>
           <w:tcPr>
-            <w:tcW w:w="2665" w:type="dxa"/>
+            <w:tcW w:w="2664" w:type="dxa"/>
             <w:tcBorders>
               <w:left w:val="single" w:sz="4" w:space="0" w:color="000000"/>
               <w:bottom w:val="single" w:sz="4" w:space="0" w:color="000000"/>
@@ -2015,7 +1994,7 @@
           </w:tcPr>
           <w:p>
             <w:pPr>
-              <w:pStyle w:val="Style15"/>
+              <w:pStyle w:val="user3"/>
               <w:spacing w:lineRule="auto" w:line="240"/>
               <w:ind w:hanging="0" w:left="0" w:right="0"/>
               <w:rPr/>
@@ -2028,7 +2007,7 @@
         </w:tc>
         <w:tc>
           <w:tcPr>
-            <w:tcW w:w="2581" w:type="dxa"/>
+            <w:tcW w:w="2582" w:type="dxa"/>
             <w:tcBorders>
               <w:left w:val="single" w:sz="4" w:space="0" w:color="000000"/>
               <w:bottom w:val="single" w:sz="4" w:space="0" w:color="000000"/>
@@ -2038,7 +2017,7 @@
           </w:tcPr>
           <w:p>
             <w:pPr>
-              <w:pStyle w:val="Style15"/>
+              <w:pStyle w:val="user3"/>
               <w:spacing w:lineRule="auto" w:line="240"/>
               <w:ind w:hanging="0" w:left="0"/>
               <w:rPr/>
@@ -2084,15 +2063,11 @@
         <w:pStyle w:val="H2"/>
         <w:rPr/>
       </w:pPr>
-      <w:bookmarkStart w:id="3" w:name="%25D0%25B2%25D1%2596%25D0%25B7%25D1%2583"/>
+      <w:bookmarkStart w:id="3" w:name="%2525D0%2525B2%2525D1%252596%2525D0%2525"/>
       <w:bookmarkEnd w:id="3"/>
       <w:r>
         <w:rPr/>
-        <w:t xml:space="preserve">4 </w:t>
-      </w:r>
-      <w:r>
-        <w:rPr/>
-        <w:t>Візуалізувати результати кластеризації</w:t>
+        <w:t>4 Візуалізувати результати кластеризації</w:t>
       </w:r>
     </w:p>
     <w:p>
@@ -2194,15 +2169,11 @@
         <w:pStyle w:val="H2"/>
         <w:rPr/>
       </w:pPr>
-      <w:bookmarkStart w:id="4" w:name="%25D0%25BE%25D0%25BF%25D0%25B8%25D1%2581"/>
+      <w:bookmarkStart w:id="4" w:name="%2525D0%2525BE%2525D0%2525BF%2525D0%2525"/>
       <w:bookmarkEnd w:id="4"/>
       <w:r>
         <w:rPr/>
-        <w:t xml:space="preserve">5 </w:t>
-      </w:r>
-      <w:r>
-        <w:rPr/>
-        <w:t>Описати скільки примірників потрапило в кожен із кластерів</w:t>
+        <w:t>5 Описати скільки примірників потрапило в кожен із кластерів</w:t>
       </w:r>
     </w:p>
     <w:p>
@@ -2297,15 +2268,11 @@
         <w:pStyle w:val="H2"/>
         <w:rPr/>
       </w:pPr>
-      <w:bookmarkStart w:id="5" w:name="%25D1%2582%25D0%25B0%25D0%25B1%25D0%25B1"/>
+      <w:bookmarkStart w:id="5" w:name="%2525D1%252582%2525D0%2525B0%2525D0%2521"/>
       <w:bookmarkEnd w:id="5"/>
       <w:r>
         <w:rPr/>
-        <w:t xml:space="preserve">6 </w:t>
-      </w:r>
-      <w:r>
-        <w:rPr/>
-        <w:t>Таблиця з характеристиками центроїдів</w:t>
+        <w:t>6 Таблиця з характеристиками центроїдів</w:t>
       </w:r>
     </w:p>
     <w:p>
@@ -2407,15 +2374,11 @@
         <w:pStyle w:val="H2"/>
         <w:rPr/>
       </w:pPr>
-      <w:bookmarkStart w:id="6" w:name="%25D0%25B7%25D0%25B0%25D0%25B2%25D0%25B1"/>
+      <w:bookmarkStart w:id="6" w:name="%2525D0%2525B7%2525D0%2525B0%2525D0%2521"/>
       <w:bookmarkEnd w:id="6"/>
       <w:r>
         <w:rPr/>
-        <w:t xml:space="preserve">7 </w:t>
-      </w:r>
-      <w:r>
-        <w:rPr/>
-        <w:t>Завантажити вибірку «iris.arff»</w:t>
+        <w:t>7 Завантажити вибірку «iris.arff»</w:t>
       </w:r>
     </w:p>
     <w:p>
@@ -2517,15 +2480,11 @@
         <w:pStyle w:val="H2"/>
         <w:rPr/>
       </w:pPr>
-      <w:bookmarkStart w:id="7" w:name="%25D0%25B0%25D0%25BB%25D0%25B3%25D0%25B1"/>
+      <w:bookmarkStart w:id="7" w:name="%2525D0%2525B0%2525D0%2525BB%2525D0%2521"/>
       <w:bookmarkEnd w:id="7"/>
       <w:r>
         <w:rPr/>
-        <w:t xml:space="preserve">8 </w:t>
-      </w:r>
-      <w:r>
-        <w:rPr/>
-        <w:t>Алгоритм кластеризації SimpleKMeans з K = 3</w:t>
+        <w:t>8 Алгоритм кластеризації SimpleKMeans з K = 3</w:t>
       </w:r>
     </w:p>
     <w:p>
@@ -2637,15 +2596,11 @@
         <w:pStyle w:val="H2"/>
         <w:rPr/>
       </w:pPr>
-      <w:bookmarkStart w:id="8" w:name="%25D0%25B7%25D0%25B0%25D0%25BF%25D0%25B8"/>
+      <w:bookmarkStart w:id="8" w:name="%2525D0%2525B7%2525D0%2525B0%2525D0%2522"/>
       <w:bookmarkEnd w:id="8"/>
       <w:r>
         <w:rPr/>
-        <w:t xml:space="preserve">9 </w:t>
-      </w:r>
-      <w:r>
-        <w:rPr/>
-        <w:t>Записати характеристики кожного центроїду</w:t>
+        <w:t>9 Записати характеристики кожного центроїду</w:t>
       </w:r>
     </w:p>
     <w:p>
@@ -2747,15 +2702,11 @@
         <w:pStyle w:val="H2"/>
         <w:rPr/>
       </w:pPr>
-      <w:bookmarkStart w:id="9" w:name="%25D0%25BE%25D0%25BF%25D0%25B8%25D1%2582"/>
+      <w:bookmarkStart w:id="9" w:name="%2525D0%2525BE%2525D0%2525BF%2525D0%2521"/>
       <w:bookmarkEnd w:id="9"/>
       <w:r>
         <w:rPr/>
-        <w:t xml:space="preserve">10 </w:t>
-      </w:r>
-      <w:r>
-        <w:rPr/>
-        <w:t>Описати як співвідносяться кластери та значення цільового атрибуту</w:t>
+        <w:t>10 Описати як співвідносяться кластери та значення цільового атрибуту</w:t>
       </w:r>
     </w:p>
     <w:p>
@@ -2795,15 +2746,11 @@
         <w:pStyle w:val="H2"/>
         <w:rPr/>
       </w:pPr>
-      <w:bookmarkStart w:id="10" w:name="%25D0%25B2%25D1%2596%25D0%25B7%25D1%2581"/>
+      <w:bookmarkStart w:id="10" w:name="%2525D0%2525B2%2525D1%252596%2525D0%2521"/>
       <w:bookmarkEnd w:id="10"/>
       <w:r>
         <w:rPr/>
-        <w:t xml:space="preserve">11 </w:t>
-      </w:r>
-      <w:r>
-        <w:rPr/>
-        <w:t>Візуалізувати результати</w:t>
+        <w:t>11 Візуалізувати результати</w:t>
       </w:r>
     </w:p>
     <w:p>
@@ -2905,15 +2852,11 @@
         <w:pStyle w:val="H2"/>
         <w:rPr/>
       </w:pPr>
-      <w:bookmarkStart w:id="11" w:name="%25D0%25BD%25D0%25B8%25D0%25B7%25D0%25BD"/>
+      <w:bookmarkStart w:id="11" w:name="%2525D0%2525BD%2525D0%2525B8%2525D0%2525"/>
       <w:bookmarkEnd w:id="11"/>
       <w:r>
         <w:rPr/>
-        <w:t>12 В</w:t>
-      </w:r>
-      <w:r>
-        <w:rPr/>
-        <w:t>изначити, на що впливає параметр «seed»</w:t>
+        <w:t>12 Визначити, на що впливає параметр «seed»</w:t>
       </w:r>
     </w:p>
     <w:p>
@@ -2961,15 +2904,11 @@
         <w:pStyle w:val="H2"/>
         <w:rPr/>
       </w:pPr>
-      <w:bookmarkStart w:id="12" w:name="%25D0%25B7%25D0%25B0%25D0%25B2%25D0%25B2"/>
+      <w:bookmarkStart w:id="12" w:name="%2525D0%2525B7%2525D0%2525B0%2525D0%2523"/>
       <w:bookmarkEnd w:id="12"/>
       <w:r>
         <w:rPr/>
-        <w:t xml:space="preserve">13 </w:t>
-      </w:r>
-      <w:r>
-        <w:rPr/>
-        <w:t>Завантажити вибірку «flagdata.arff»</w:t>
+        <w:t>13 Завантажити вибірку «flagdata.arff»</w:t>
       </w:r>
     </w:p>
     <w:p>
@@ -3071,15 +3010,11 @@
         <w:pStyle w:val="H2"/>
         <w:rPr/>
       </w:pPr>
-      <w:bookmarkStart w:id="13" w:name="%25D0%25B0%25D0%25BB%25D0%25B3%25D0%25B2"/>
+      <w:bookmarkStart w:id="13" w:name="%2525D0%2525B0%2525D0%2525BB%2525D0%2522"/>
       <w:bookmarkEnd w:id="13"/>
       <w:r>
         <w:rPr/>
-        <w:t xml:space="preserve">14 </w:t>
-      </w:r>
-      <w:r>
-        <w:rPr/>
-        <w:t>Алгоритм COBWEB</w:t>
+        <w:t>14 Алгоритм COBWEB</w:t>
       </w:r>
     </w:p>
     <w:p>
@@ -3181,15 +3116,11 @@
         <w:pStyle w:val="H2"/>
         <w:rPr/>
       </w:pPr>
-      <w:bookmarkStart w:id="14" w:name="%25D0%25B2%25D1%2596%25D0%25B7%25D1%2582"/>
+      <w:bookmarkStart w:id="14" w:name="%2525D0%2525B2%2525D1%252596%2525D0%2522"/>
       <w:bookmarkEnd w:id="14"/>
       <w:r>
         <w:rPr/>
-        <w:t xml:space="preserve">15 </w:t>
-      </w:r>
-      <w:r>
-        <w:rPr/>
-        <w:t>Візуалізувати отриману дендрограму</w:t>
+        <w:t>15 Візуалізувати отриману дендрограму</w:t>
       </w:r>
     </w:p>
     <w:p>
@@ -3291,15 +3222,11 @@
         <w:pStyle w:val="H2"/>
         <w:rPr/>
       </w:pPr>
-      <w:bookmarkStart w:id="15" w:name="%25D0%25B7%25D0%25B0%25D0%25B2%25D0%25B3"/>
+      <w:bookmarkStart w:id="15" w:name="%2525D0%2525B7%2525D0%2525B0%2525D0%2524"/>
       <w:bookmarkEnd w:id="15"/>
       <w:r>
         <w:rPr/>
-        <w:t xml:space="preserve">16 </w:t>
-      </w:r>
-      <w:r>
-        <w:rPr/>
-        <w:t>Завантажити вибірку «zoo.arff»</w:t>
+        <w:t>16 Завантажити вибірку «zoo.arff»</w:t>
       </w:r>
     </w:p>
     <w:p>
@@ -3401,15 +3328,11 @@
         <w:pStyle w:val="H2"/>
         <w:rPr/>
       </w:pPr>
-      <w:bookmarkStart w:id="16" w:name="%25D0%25BE%25D0%25B1%25D1%2580%25D0%25B0"/>
+      <w:bookmarkStart w:id="16" w:name="%2525D0%2525BE%2525D0%2525B1%2525D1%2525"/>
       <w:bookmarkEnd w:id="16"/>
       <w:r>
         <w:rPr/>
-        <w:t xml:space="preserve">17 </w:t>
-      </w:r>
-      <w:r>
-        <w:rPr/>
-        <w:t>Обрати з вибірки частину тварин</w:t>
+        <w:t>17 Обрати з вибірки частину тварин</w:t>
       </w:r>
     </w:p>
     <w:p>
@@ -3523,15 +3446,11 @@
         <w:pStyle w:val="H2"/>
         <w:rPr/>
       </w:pPr>
-      <w:bookmarkStart w:id="17" w:name="%25D0%25B0%25D0%25BB%25D0%25B3%25D0%25B3"/>
+      <w:bookmarkStart w:id="17" w:name="%2525D0%2525B0%2525D0%2525BB%2525D0%2523"/>
       <w:bookmarkEnd w:id="17"/>
       <w:r>
         <w:rPr/>
-        <w:t xml:space="preserve">18 </w:t>
-      </w:r>
-      <w:r>
-        <w:rPr/>
-        <w:t>Алгоритм Hierarchical Clusterer</w:t>
+        <w:t>18 Алгоритм Hierarchical Clusterer</w:t>
       </w:r>
     </w:p>
     <w:p>
@@ -3649,15 +3568,11 @@
         <w:pStyle w:val="H2"/>
         <w:rPr/>
       </w:pPr>
-      <w:bookmarkStart w:id="18" w:name="%25D0%25B2%25D1%2596%25D0%25B7%25D1%2584"/>
+      <w:bookmarkStart w:id="18" w:name="%2525D0%2525B2%2525D1%252596%2525D0%2523"/>
       <w:bookmarkEnd w:id="18"/>
       <w:r>
         <w:rPr/>
-        <w:t xml:space="preserve">19 </w:t>
-      </w:r>
-      <w:r>
-        <w:rPr/>
-        <w:t>Візуалізувати результати роботи алгоритму та оцінити, чи є логічний сенс в створюваних кластерах</w:t>
+        <w:t>19 Візуалізувати результати роботи алгоритму та оцінити, чи є логічний сенс в створюваних кластерах</w:t>
       </w:r>
     </w:p>
     <w:p>
@@ -3759,15 +3674,11 @@
         <w:pStyle w:val="H2"/>
         <w:rPr/>
       </w:pPr>
-      <w:bookmarkStart w:id="19" w:name="%25D0%25B7%25D0%25B3%25D0%25B5%25D0%25BD"/>
+      <w:bookmarkStart w:id="19" w:name="%2525D0%2525B7%2525D0%2525B3%2525D0%2525"/>
       <w:bookmarkEnd w:id="19"/>
       <w:r>
         <w:rPr/>
-        <w:t xml:space="preserve">20 </w:t>
-      </w:r>
-      <w:r>
-        <w:rPr/>
-        <w:t>Згенерувати вибірку за допомогою алгоритму BIRCHCluster</w:t>
+        <w:t>20 Згенерувати вибірку за допомогою алгоритму BIRCHCluster</w:t>
       </w:r>
     </w:p>
     <w:p>
@@ -3893,15 +3804,11 @@
         <w:pStyle w:val="H2"/>
         <w:rPr/>
       </w:pPr>
-      <w:bookmarkStart w:id="20" w:name="%25D0%25B7%25D0%25B0-%25D0%25B4%25D0%25B"/>
+      <w:bookmarkStart w:id="20" w:name="%2525D0%2525B7%2525D0%2525B0-%2525D0%252"/>
       <w:bookmarkEnd w:id="20"/>
       <w:r>
         <w:rPr/>
-        <w:t xml:space="preserve">21 </w:t>
-      </w:r>
-      <w:r>
-        <w:rPr/>
-        <w:t>За допомогою налаштувань методу DBSCAN досягнути найкращої кластеризації даних</w:t>
+        <w:t>21 За допомогою налаштувань методу DBSCAN досягнути найкращої кластеризації даних</w:t>
       </w:r>
     </w:p>
     <w:p>
@@ -5480,13 +5387,13 @@
       <w:lang w:val="en-US" w:eastAsia="uk-UA"/>
     </w:rPr>
   </w:style>
-  <w:style w:type="character" w:styleId="user">
-    <w:name w:val="Символ нумерації (user)"/>
+  <w:style w:type="character" w:styleId="Style12">
+    <w:name w:val="Символ нумерації"/>
     <w:qFormat/>
     <w:rPr/>
   </w:style>
-  <w:style w:type="character" w:styleId="Style12">
-    <w:name w:val="Маркери"/>
+  <w:style w:type="character" w:styleId="user">
+    <w:name w:val="Маркери (user)"/>
     <w:qFormat/>
     <w:rPr>
       <w:rFonts w:ascii="OpenSymbol" w:hAnsi="OpenSymbol" w:eastAsia="OpenSymbol" w:cs="OpenSymbol"/>
@@ -5509,7 +5416,7 @@
       <w:spacing w:before="240" w:after="120"/>
     </w:pPr>
     <w:rPr>
-      <w:rFonts w:ascii="Liberation Sans" w:hAnsi="Liberation Sans" w:eastAsia="Microsoft YaHei" w:cs="Arial Unicode MS"/>
+      <w:rFonts w:ascii="Liberation Sans" w:hAnsi="Liberation Sans" w:eastAsia="Microsoft YaHei" w:cs="Lucida Sans"/>
       <w:sz w:val="28"/>
       <w:szCs w:val="28"/>
     </w:rPr>
@@ -5554,7 +5461,7 @@
       <w:suppressLineNumbers/>
     </w:pPr>
     <w:rPr>
-      <w:rFonts w:cs="Arial Unicode MS"/>
+      <w:rFonts w:cs="Lucida Sans"/>
     </w:rPr>
   </w:style>
   <w:style w:type="paragraph" w:styleId="user1">
@@ -5567,7 +5474,7 @@
       <w:spacing w:before="240" w:after="120"/>
     </w:pPr>
     <w:rPr>
-      <w:rFonts w:ascii="Liberation Sans" w:hAnsi="Liberation Sans" w:eastAsia="Microsoft YaHei" w:cs="Lucida Sans"/>
+      <w:rFonts w:ascii="Liberation Sans" w:hAnsi="Liberation Sans" w:eastAsia="Microsoft YaHei" w:cs="Arial Unicode MS"/>
       <w:sz w:val="28"/>
       <w:szCs w:val="28"/>
     </w:rPr>
@@ -5580,12 +5487,12 @@
       <w:suppressLineNumbers/>
     </w:pPr>
     <w:rPr>
-      <w:rFonts w:cs="Lucida Sans"/>
+      <w:rFonts w:cs="Arial Unicode MS"/>
     </w:rPr>
   </w:style>
   <w:style w:type="paragraph" w:styleId="IndexHeading">
     <w:name w:val="index heading"/>
-    <w:basedOn w:val="Style13"/>
+    <w:basedOn w:val="user1"/>
     <w:pPr/>
     <w:rPr/>
   </w:style>
@@ -5888,8 +5795,8 @@
       <w:sz w:val="28"/>
     </w:rPr>
   </w:style>
-  <w:style w:type="paragraph" w:styleId="Style15">
-    <w:name w:val="Вміст таблиці"/>
+  <w:style w:type="paragraph" w:styleId="user3">
+    <w:name w:val="Вміст таблиці (user)"/>
     <w:basedOn w:val="Normal"/>
     <w:qFormat/>
     <w:pPr>
@@ -5898,9 +5805,9 @@
     </w:pPr>
     <w:rPr/>
   </w:style>
-  <w:style w:type="paragraph" w:styleId="Style16">
-    <w:name w:val="Заголовок таблиці"/>
-    <w:basedOn w:val="Style15"/>
+  <w:style w:type="paragraph" w:styleId="user4">
+    <w:name w:val="Заголовок таблиці (user)"/>
+    <w:basedOn w:val="user3"/>
     <w:qFormat/>
     <w:pPr>
       <w:suppressLineNumbers/>
@@ -5911,8 +5818,8 @@
       <w:bCs/>
     </w:rPr>
   </w:style>
-  <w:style w:type="numbering" w:styleId="Style17" w:default="1">
-    <w:name w:val="Без маркерів"/>
+  <w:style w:type="numbering" w:styleId="user5" w:default="1">
+    <w:name w:val="Без маркерів (user)"/>
     <w:uiPriority w:val="99"/>
     <w:semiHidden/>
     <w:unhideWhenUsed/>

</xml_diff>

<commit_message>
feat: Jesus thank you Hallelujah
</commit_message>
<xml_diff>
--- a/41IA Intelektualnyj analiz danyh/6/IA_KNT-122_Onyshchenko_19_PR6.docx
+++ b/41IA Intelektualnyj analiz danyh/6/IA_KNT-122_Onyshchenko_19_PR6.docx
@@ -1068,11 +1068,59 @@
         <w:pStyle w:val="H2"/>
         <w:rPr/>
       </w:pPr>
-      <w:bookmarkStart w:id="0" w:name="%25252525D0%25252525B7%25252525D0%252525"/>
+      <w:bookmarkStart w:id="0" w:name="%2525252525D0%2525252525B7%2525252525D0%"/>
       <w:bookmarkEnd w:id="0"/>
       <w:r>
         <w:rPr/>
         <w:t>1 Завантажити вибірку «bank.arff»</w:t>
+      </w:r>
+    </w:p>
+    <w:p>
+      <w:pPr>
+        <w:pStyle w:val="H3"/>
+        <w:rPr/>
+      </w:pPr>
+      <w:r>
+        <w:rPr/>
+        <w:t xml:space="preserve">Завдання </w:t>
+      </w:r>
+    </w:p>
+    <w:p>
+      <w:pPr>
+        <w:pStyle w:val="P1"/>
+        <w:rPr/>
+      </w:pPr>
+      <w:r>
+        <w:rPr/>
+      </w:r>
+    </w:p>
+    <w:p>
+      <w:pPr>
+        <w:pStyle w:val="P1"/>
+        <w:rPr/>
+      </w:pPr>
+      <w:r>
+        <w:rPr/>
+        <w:t>Вирішити  задачу  кластеризації  за  допомогою  програми WEKA завантажити вибірку «bank.arff».</w:t>
+      </w:r>
+    </w:p>
+    <w:p>
+      <w:pPr>
+        <w:pStyle w:val="P1"/>
+        <w:rPr/>
+      </w:pPr>
+      <w:r>
+        <w:rPr/>
+      </w:r>
+    </w:p>
+    <w:p>
+      <w:pPr>
+        <w:pStyle w:val="H3"/>
+        <w:rPr/>
+      </w:pPr>
+      <w:r>
+        <w:rPr/>
+        <w:t>Виконання</w:t>
       </w:r>
     </w:p>
     <w:p>
@@ -1186,11 +1234,68 @@
         <w:pStyle w:val="H2"/>
         <w:rPr/>
       </w:pPr>
-      <w:bookmarkStart w:id="1" w:name="%25252525D0%25252525B0%25252525D0%252525"/>
+      <w:bookmarkStart w:id="1" w:name="%2525252525D0%2525252525B0%2525252525D0%"/>
       <w:bookmarkEnd w:id="1"/>
       <w:r>
         <w:rPr/>
         <w:t>2 Алгоритм кластеризації SimpleKMeans</w:t>
+      </w:r>
+    </w:p>
+    <w:p>
+      <w:pPr>
+        <w:pStyle w:val="H3"/>
+        <w:rPr/>
+      </w:pPr>
+      <w:r>
+        <w:rPr/>
+        <w:t>Завдання</w:t>
+      </w:r>
+    </w:p>
+    <w:p>
+      <w:pPr>
+        <w:pStyle w:val="P1"/>
+        <w:rPr/>
+      </w:pPr>
+      <w:r>
+        <w:rPr/>
+      </w:r>
+    </w:p>
+    <w:p>
+      <w:pPr>
+        <w:pStyle w:val="P1"/>
+        <w:rPr/>
+      </w:pPr>
+      <w:r>
+        <w:rPr>
+          <w:rFonts w:ascii="Times New Roman" w:hAnsi="Times New Roman"/>
+          <w:b w:val="false"/>
+          <w:i w:val="false"/>
+          <w:caps w:val="false"/>
+          <w:smallCaps w:val="false"/>
+          <w:color w:val="000000"/>
+          <w:spacing w:val="0"/>
+          <w:sz w:val="27"/>
+        </w:rPr>
+        <w:t>Запустити алгоритм кластеризації SimpleKMeans, задаючи значення параметра K (кількість кластерів) від 1 до 12.</w:t>
+      </w:r>
+    </w:p>
+    <w:p>
+      <w:pPr>
+        <w:pStyle w:val="P1"/>
+        <w:rPr/>
+      </w:pPr>
+      <w:r>
+        <w:rPr/>
+      </w:r>
+    </w:p>
+    <w:p>
+      <w:pPr>
+        <w:pStyle w:val="H3"/>
+        <w:rPr/>
+      </w:pPr>
+      <w:r>
+        <w:rPr/>
+        <w:t>Виконання</w:t>
       </w:r>
     </w:p>
     <w:p>
@@ -1328,7 +1433,7 @@
         <w:pStyle w:val="H2"/>
         <w:rPr/>
       </w:pPr>
-      <w:bookmarkStart w:id="2" w:name="%25252525D1%2525252582%25252525D0%252525"/>
+      <w:bookmarkStart w:id="2" w:name="%2525252525D1%252525252582%2525252525D0%"/>
       <w:bookmarkEnd w:id="2"/>
       <w:r>
         <w:rPr/>
@@ -1337,6 +1442,63 @@
     </w:p>
     <w:p>
       <w:pPr>
+        <w:pStyle w:val="H3"/>
+        <w:rPr/>
+      </w:pPr>
+      <w:r>
+        <w:rPr/>
+        <w:t>Завдання</w:t>
+      </w:r>
+    </w:p>
+    <w:p>
+      <w:pPr>
+        <w:pStyle w:val="P1"/>
+        <w:rPr/>
+      </w:pPr>
+      <w:r>
+        <w:rPr/>
+      </w:r>
+    </w:p>
+    <w:p>
+      <w:pPr>
+        <w:pStyle w:val="P1"/>
+        <w:rPr/>
+      </w:pPr>
+      <w:r>
+        <w:rPr>
+          <w:rFonts w:ascii="Times New Roman" w:hAnsi="Times New Roman"/>
+          <w:b w:val="false"/>
+          <w:i w:val="false"/>
+          <w:caps w:val="false"/>
+          <w:smallCaps w:val="false"/>
+          <w:color w:val="000000"/>
+          <w:spacing w:val="0"/>
+          <w:sz w:val="27"/>
+        </w:rPr>
+        <w:t>Записати в таблицю значення сум квадратичних помилок, одержуваних при різних значеннях. Проаналізувати результат.</w:t>
+      </w:r>
+    </w:p>
+    <w:p>
+      <w:pPr>
+        <w:pStyle w:val="P1"/>
+        <w:rPr/>
+      </w:pPr>
+      <w:r>
+        <w:rPr/>
+      </w:r>
+    </w:p>
+    <w:p>
+      <w:pPr>
+        <w:pStyle w:val="H3"/>
+        <w:rPr/>
+      </w:pPr>
+      <w:r>
+        <w:rPr/>
+        <w:t>Виконання</w:t>
+      </w:r>
+    </w:p>
+    <w:p>
+      <w:pPr>
         <w:pStyle w:val="P1"/>
         <w:rPr/>
       </w:pPr>
@@ -1352,15 +1514,6 @@
       <w:r>
         <w:rPr/>
         <w:t>Суми квадратичних помилок наведено нижче на таблиці:</w:t>
-      </w:r>
-    </w:p>
-    <w:p>
-      <w:pPr>
-        <w:pStyle w:val="P1"/>
-        <w:rPr/>
-      </w:pPr>
-      <w:r>
-        <w:rPr/>
       </w:r>
     </w:p>
     <w:p>
@@ -1396,8 +1549,8 @@
         </w:tblCellMar>
       </w:tblPr>
       <w:tblGrid>
-        <w:gridCol w:w="2662"/>
-        <w:gridCol w:w="2584"/>
+        <w:gridCol w:w="2661"/>
+        <w:gridCol w:w="2585"/>
       </w:tblGrid>
       <w:tr>
         <w:trPr>
@@ -1405,7 +1558,7 @@
         </w:trPr>
         <w:tc>
           <w:tcPr>
-            <w:tcW w:w="2662" w:type="dxa"/>
+            <w:tcW w:w="2661" w:type="dxa"/>
             <w:tcBorders>
               <w:top w:val="single" w:sz="4" w:space="0" w:color="000000"/>
               <w:left w:val="single" w:sz="4" w:space="0" w:color="000000"/>
@@ -1415,7 +1568,7 @@
           </w:tcPr>
           <w:p>
             <w:pPr>
-              <w:pStyle w:val="user4"/>
+              <w:pStyle w:val="Style16"/>
               <w:spacing w:lineRule="auto" w:line="240"/>
               <w:ind w:hanging="0" w:left="0" w:right="0"/>
               <w:jc w:val="left"/>
@@ -1429,7 +1582,7 @@
         </w:tc>
         <w:tc>
           <w:tcPr>
-            <w:tcW w:w="2584" w:type="dxa"/>
+            <w:tcW w:w="2585" w:type="dxa"/>
             <w:tcBorders>
               <w:top w:val="single" w:sz="4" w:space="0" w:color="000000"/>
               <w:left w:val="single" w:sz="4" w:space="0" w:color="000000"/>
@@ -1440,7 +1593,7 @@
           </w:tcPr>
           <w:p>
             <w:pPr>
-              <w:pStyle w:val="user4"/>
+              <w:pStyle w:val="Style16"/>
               <w:spacing w:lineRule="auto" w:line="240"/>
               <w:ind w:hanging="0" w:left="0" w:right="0"/>
               <w:jc w:val="left"/>
@@ -1457,7 +1610,7 @@
         <w:trPr/>
         <w:tc>
           <w:tcPr>
-            <w:tcW w:w="2662" w:type="dxa"/>
+            <w:tcW w:w="2661" w:type="dxa"/>
             <w:tcBorders>
               <w:left w:val="single" w:sz="4" w:space="0" w:color="000000"/>
               <w:bottom w:val="single" w:sz="4" w:space="0" w:color="000000"/>
@@ -1466,7 +1619,7 @@
           </w:tcPr>
           <w:p>
             <w:pPr>
-              <w:pStyle w:val="user3"/>
+              <w:pStyle w:val="Style15"/>
               <w:spacing w:lineRule="auto" w:line="240"/>
               <w:ind w:hanging="0" w:left="0" w:right="0"/>
               <w:rPr/>
@@ -1479,7 +1632,7 @@
         </w:tc>
         <w:tc>
           <w:tcPr>
-            <w:tcW w:w="2584" w:type="dxa"/>
+            <w:tcW w:w="2585" w:type="dxa"/>
             <w:tcBorders>
               <w:left w:val="single" w:sz="4" w:space="0" w:color="000000"/>
               <w:bottom w:val="single" w:sz="4" w:space="0" w:color="000000"/>
@@ -1489,7 +1642,7 @@
           </w:tcPr>
           <w:p>
             <w:pPr>
-              <w:pStyle w:val="user3"/>
+              <w:pStyle w:val="Style15"/>
               <w:spacing w:lineRule="auto" w:line="240"/>
               <w:ind w:hanging="0" w:left="0" w:right="0"/>
               <w:rPr/>
@@ -1505,7 +1658,7 @@
         <w:trPr/>
         <w:tc>
           <w:tcPr>
-            <w:tcW w:w="2662" w:type="dxa"/>
+            <w:tcW w:w="2661" w:type="dxa"/>
             <w:tcBorders>
               <w:left w:val="single" w:sz="4" w:space="0" w:color="000000"/>
               <w:bottom w:val="single" w:sz="4" w:space="0" w:color="000000"/>
@@ -1514,7 +1667,7 @@
           </w:tcPr>
           <w:p>
             <w:pPr>
-              <w:pStyle w:val="user3"/>
+              <w:pStyle w:val="Style15"/>
               <w:spacing w:lineRule="auto" w:line="240"/>
               <w:ind w:hanging="0" w:left="0" w:right="0"/>
               <w:rPr/>
@@ -1527,7 +1680,7 @@
         </w:tc>
         <w:tc>
           <w:tcPr>
-            <w:tcW w:w="2584" w:type="dxa"/>
+            <w:tcW w:w="2585" w:type="dxa"/>
             <w:tcBorders>
               <w:left w:val="single" w:sz="4" w:space="0" w:color="000000"/>
               <w:bottom w:val="single" w:sz="4" w:space="0" w:color="000000"/>
@@ -1537,7 +1690,7 @@
           </w:tcPr>
           <w:p>
             <w:pPr>
-              <w:pStyle w:val="user3"/>
+              <w:pStyle w:val="Style15"/>
               <w:spacing w:lineRule="auto" w:line="240"/>
               <w:ind w:hanging="0" w:left="0" w:right="0"/>
               <w:rPr/>
@@ -1553,7 +1706,7 @@
         <w:trPr/>
         <w:tc>
           <w:tcPr>
-            <w:tcW w:w="2662" w:type="dxa"/>
+            <w:tcW w:w="2661" w:type="dxa"/>
             <w:tcBorders>
               <w:left w:val="single" w:sz="4" w:space="0" w:color="000000"/>
               <w:bottom w:val="single" w:sz="4" w:space="0" w:color="000000"/>
@@ -1562,7 +1715,7 @@
           </w:tcPr>
           <w:p>
             <w:pPr>
-              <w:pStyle w:val="user3"/>
+              <w:pStyle w:val="Style15"/>
               <w:spacing w:lineRule="auto" w:line="240"/>
               <w:ind w:hanging="0" w:left="0" w:right="0"/>
               <w:rPr/>
@@ -1575,7 +1728,7 @@
         </w:tc>
         <w:tc>
           <w:tcPr>
-            <w:tcW w:w="2584" w:type="dxa"/>
+            <w:tcW w:w="2585" w:type="dxa"/>
             <w:tcBorders>
               <w:left w:val="single" w:sz="4" w:space="0" w:color="000000"/>
               <w:bottom w:val="single" w:sz="4" w:space="0" w:color="000000"/>
@@ -1585,7 +1738,7 @@
           </w:tcPr>
           <w:p>
             <w:pPr>
-              <w:pStyle w:val="user3"/>
+              <w:pStyle w:val="Style15"/>
               <w:spacing w:lineRule="auto" w:line="240"/>
               <w:ind w:hanging="0" w:left="0" w:right="0"/>
               <w:rPr/>
@@ -1601,7 +1754,7 @@
         <w:trPr/>
         <w:tc>
           <w:tcPr>
-            <w:tcW w:w="2662" w:type="dxa"/>
+            <w:tcW w:w="2661" w:type="dxa"/>
             <w:tcBorders>
               <w:left w:val="single" w:sz="4" w:space="0" w:color="000000"/>
               <w:bottom w:val="single" w:sz="4" w:space="0" w:color="000000"/>
@@ -1610,7 +1763,7 @@
           </w:tcPr>
           <w:p>
             <w:pPr>
-              <w:pStyle w:val="user3"/>
+              <w:pStyle w:val="Style15"/>
               <w:spacing w:lineRule="auto" w:line="240"/>
               <w:ind w:hanging="0" w:left="0" w:right="0"/>
               <w:rPr/>
@@ -1623,7 +1776,7 @@
         </w:tc>
         <w:tc>
           <w:tcPr>
-            <w:tcW w:w="2584" w:type="dxa"/>
+            <w:tcW w:w="2585" w:type="dxa"/>
             <w:tcBorders>
               <w:left w:val="single" w:sz="4" w:space="0" w:color="000000"/>
               <w:bottom w:val="single" w:sz="4" w:space="0" w:color="000000"/>
@@ -1633,7 +1786,7 @@
           </w:tcPr>
           <w:p>
             <w:pPr>
-              <w:pStyle w:val="user3"/>
+              <w:pStyle w:val="Style15"/>
               <w:spacing w:lineRule="auto" w:line="240"/>
               <w:ind w:hanging="0" w:left="0" w:right="0"/>
               <w:rPr/>
@@ -1649,7 +1802,7 @@
         <w:trPr/>
         <w:tc>
           <w:tcPr>
-            <w:tcW w:w="2662" w:type="dxa"/>
+            <w:tcW w:w="2661" w:type="dxa"/>
             <w:tcBorders>
               <w:left w:val="single" w:sz="4" w:space="0" w:color="000000"/>
               <w:bottom w:val="single" w:sz="4" w:space="0" w:color="000000"/>
@@ -1658,7 +1811,7 @@
           </w:tcPr>
           <w:p>
             <w:pPr>
-              <w:pStyle w:val="user3"/>
+              <w:pStyle w:val="Style15"/>
               <w:spacing w:lineRule="auto" w:line="240"/>
               <w:ind w:hanging="0" w:left="0" w:right="0"/>
               <w:rPr/>
@@ -1671,7 +1824,7 @@
         </w:tc>
         <w:tc>
           <w:tcPr>
-            <w:tcW w:w="2584" w:type="dxa"/>
+            <w:tcW w:w="2585" w:type="dxa"/>
             <w:tcBorders>
               <w:left w:val="single" w:sz="4" w:space="0" w:color="000000"/>
               <w:bottom w:val="single" w:sz="4" w:space="0" w:color="000000"/>
@@ -1681,7 +1834,7 @@
           </w:tcPr>
           <w:p>
             <w:pPr>
-              <w:pStyle w:val="user3"/>
+              <w:pStyle w:val="Style15"/>
               <w:spacing w:lineRule="auto" w:line="240"/>
               <w:ind w:hanging="0" w:left="0" w:right="0"/>
               <w:rPr/>
@@ -1697,7 +1850,7 @@
         <w:trPr/>
         <w:tc>
           <w:tcPr>
-            <w:tcW w:w="2662" w:type="dxa"/>
+            <w:tcW w:w="2661" w:type="dxa"/>
             <w:tcBorders>
               <w:left w:val="single" w:sz="4" w:space="0" w:color="000000"/>
               <w:bottom w:val="single" w:sz="4" w:space="0" w:color="000000"/>
@@ -1706,7 +1859,7 @@
           </w:tcPr>
           <w:p>
             <w:pPr>
-              <w:pStyle w:val="user3"/>
+              <w:pStyle w:val="Style15"/>
               <w:spacing w:lineRule="auto" w:line="240"/>
               <w:ind w:hanging="0" w:left="0" w:right="0"/>
               <w:rPr/>
@@ -1719,7 +1872,7 @@
         </w:tc>
         <w:tc>
           <w:tcPr>
-            <w:tcW w:w="2584" w:type="dxa"/>
+            <w:tcW w:w="2585" w:type="dxa"/>
             <w:tcBorders>
               <w:left w:val="single" w:sz="4" w:space="0" w:color="000000"/>
               <w:bottom w:val="single" w:sz="4" w:space="0" w:color="000000"/>
@@ -1729,7 +1882,7 @@
           </w:tcPr>
           <w:p>
             <w:pPr>
-              <w:pStyle w:val="user3"/>
+              <w:pStyle w:val="Style15"/>
               <w:spacing w:lineRule="auto" w:line="240"/>
               <w:ind w:hanging="0" w:left="0" w:right="0"/>
               <w:rPr/>
@@ -1745,7 +1898,7 @@
         <w:trPr/>
         <w:tc>
           <w:tcPr>
-            <w:tcW w:w="2662" w:type="dxa"/>
+            <w:tcW w:w="2661" w:type="dxa"/>
             <w:tcBorders>
               <w:left w:val="single" w:sz="4" w:space="0" w:color="000000"/>
               <w:bottom w:val="single" w:sz="4" w:space="0" w:color="000000"/>
@@ -1754,7 +1907,7 @@
           </w:tcPr>
           <w:p>
             <w:pPr>
-              <w:pStyle w:val="user3"/>
+              <w:pStyle w:val="Style15"/>
               <w:spacing w:lineRule="auto" w:line="240"/>
               <w:ind w:hanging="0" w:left="0" w:right="0"/>
               <w:rPr/>
@@ -1767,7 +1920,7 @@
         </w:tc>
         <w:tc>
           <w:tcPr>
-            <w:tcW w:w="2584" w:type="dxa"/>
+            <w:tcW w:w="2585" w:type="dxa"/>
             <w:tcBorders>
               <w:left w:val="single" w:sz="4" w:space="0" w:color="000000"/>
               <w:bottom w:val="single" w:sz="4" w:space="0" w:color="000000"/>
@@ -1777,7 +1930,7 @@
           </w:tcPr>
           <w:p>
             <w:pPr>
-              <w:pStyle w:val="user3"/>
+              <w:pStyle w:val="Style15"/>
               <w:spacing w:lineRule="auto" w:line="240"/>
               <w:ind w:hanging="0" w:left="0" w:right="0"/>
               <w:rPr/>
@@ -1793,7 +1946,7 @@
         <w:trPr/>
         <w:tc>
           <w:tcPr>
-            <w:tcW w:w="2662" w:type="dxa"/>
+            <w:tcW w:w="2661" w:type="dxa"/>
             <w:tcBorders>
               <w:left w:val="single" w:sz="4" w:space="0" w:color="000000"/>
               <w:bottom w:val="single" w:sz="4" w:space="0" w:color="000000"/>
@@ -1802,7 +1955,7 @@
           </w:tcPr>
           <w:p>
             <w:pPr>
-              <w:pStyle w:val="user3"/>
+              <w:pStyle w:val="Style15"/>
               <w:spacing w:lineRule="auto" w:line="240"/>
               <w:ind w:hanging="0" w:left="0" w:right="0"/>
               <w:rPr/>
@@ -1815,7 +1968,7 @@
         </w:tc>
         <w:tc>
           <w:tcPr>
-            <w:tcW w:w="2584" w:type="dxa"/>
+            <w:tcW w:w="2585" w:type="dxa"/>
             <w:tcBorders>
               <w:left w:val="single" w:sz="4" w:space="0" w:color="000000"/>
               <w:bottom w:val="single" w:sz="4" w:space="0" w:color="000000"/>
@@ -1825,7 +1978,7 @@
           </w:tcPr>
           <w:p>
             <w:pPr>
-              <w:pStyle w:val="user3"/>
+              <w:pStyle w:val="Style15"/>
               <w:spacing w:lineRule="auto" w:line="240"/>
               <w:ind w:hanging="0" w:left="0" w:right="0"/>
               <w:rPr/>
@@ -1841,7 +1994,7 @@
         <w:trPr/>
         <w:tc>
           <w:tcPr>
-            <w:tcW w:w="2662" w:type="dxa"/>
+            <w:tcW w:w="2661" w:type="dxa"/>
             <w:tcBorders>
               <w:left w:val="single" w:sz="4" w:space="0" w:color="000000"/>
               <w:bottom w:val="single" w:sz="4" w:space="0" w:color="000000"/>
@@ -1850,7 +2003,7 @@
           </w:tcPr>
           <w:p>
             <w:pPr>
-              <w:pStyle w:val="user3"/>
+              <w:pStyle w:val="Style15"/>
               <w:spacing w:lineRule="auto" w:line="240"/>
               <w:ind w:hanging="0" w:left="0" w:right="0"/>
               <w:rPr/>
@@ -1863,7 +2016,7 @@
         </w:tc>
         <w:tc>
           <w:tcPr>
-            <w:tcW w:w="2584" w:type="dxa"/>
+            <w:tcW w:w="2585" w:type="dxa"/>
             <w:tcBorders>
               <w:left w:val="single" w:sz="4" w:space="0" w:color="000000"/>
               <w:bottom w:val="single" w:sz="4" w:space="0" w:color="000000"/>
@@ -1873,7 +2026,7 @@
           </w:tcPr>
           <w:p>
             <w:pPr>
-              <w:pStyle w:val="user3"/>
+              <w:pStyle w:val="Style15"/>
               <w:spacing w:lineRule="auto" w:line="240"/>
               <w:ind w:hanging="0" w:left="0" w:right="0"/>
               <w:rPr/>
@@ -1889,7 +2042,7 @@
         <w:trPr/>
         <w:tc>
           <w:tcPr>
-            <w:tcW w:w="2662" w:type="dxa"/>
+            <w:tcW w:w="2661" w:type="dxa"/>
             <w:tcBorders>
               <w:left w:val="single" w:sz="4" w:space="0" w:color="000000"/>
               <w:bottom w:val="single" w:sz="4" w:space="0" w:color="000000"/>
@@ -1898,7 +2051,7 @@
           </w:tcPr>
           <w:p>
             <w:pPr>
-              <w:pStyle w:val="user3"/>
+              <w:pStyle w:val="Style15"/>
               <w:spacing w:lineRule="auto" w:line="240"/>
               <w:ind w:hanging="0" w:left="0" w:right="0"/>
               <w:rPr/>
@@ -1911,7 +2064,7 @@
         </w:tc>
         <w:tc>
           <w:tcPr>
-            <w:tcW w:w="2584" w:type="dxa"/>
+            <w:tcW w:w="2585" w:type="dxa"/>
             <w:tcBorders>
               <w:left w:val="single" w:sz="4" w:space="0" w:color="000000"/>
               <w:bottom w:val="single" w:sz="4" w:space="0" w:color="000000"/>
@@ -1921,7 +2074,7 @@
           </w:tcPr>
           <w:p>
             <w:pPr>
-              <w:pStyle w:val="user3"/>
+              <w:pStyle w:val="Style15"/>
               <w:spacing w:lineRule="auto" w:line="240"/>
               <w:ind w:hanging="0" w:left="0" w:right="0"/>
               <w:rPr/>
@@ -1937,7 +2090,7 @@
         <w:trPr/>
         <w:tc>
           <w:tcPr>
-            <w:tcW w:w="2662" w:type="dxa"/>
+            <w:tcW w:w="2661" w:type="dxa"/>
             <w:tcBorders>
               <w:left w:val="single" w:sz="4" w:space="0" w:color="000000"/>
               <w:bottom w:val="single" w:sz="4" w:space="0" w:color="000000"/>
@@ -1946,7 +2099,7 @@
           </w:tcPr>
           <w:p>
             <w:pPr>
-              <w:pStyle w:val="user3"/>
+              <w:pStyle w:val="Style15"/>
               <w:spacing w:lineRule="auto" w:line="240"/>
               <w:ind w:hanging="0" w:left="0" w:right="0"/>
               <w:rPr/>
@@ -1959,7 +2112,7 @@
         </w:tc>
         <w:tc>
           <w:tcPr>
-            <w:tcW w:w="2584" w:type="dxa"/>
+            <w:tcW w:w="2585" w:type="dxa"/>
             <w:tcBorders>
               <w:left w:val="single" w:sz="4" w:space="0" w:color="000000"/>
               <w:bottom w:val="single" w:sz="4" w:space="0" w:color="000000"/>
@@ -1969,7 +2122,7 @@
           </w:tcPr>
           <w:p>
             <w:pPr>
-              <w:pStyle w:val="user3"/>
+              <w:pStyle w:val="Style15"/>
               <w:spacing w:lineRule="auto" w:line="240"/>
               <w:ind w:hanging="0" w:left="0" w:right="0"/>
               <w:rPr/>
@@ -1985,7 +2138,7 @@
         <w:trPr/>
         <w:tc>
           <w:tcPr>
-            <w:tcW w:w="2662" w:type="dxa"/>
+            <w:tcW w:w="2661" w:type="dxa"/>
             <w:tcBorders>
               <w:left w:val="single" w:sz="4" w:space="0" w:color="000000"/>
               <w:bottom w:val="single" w:sz="4" w:space="0" w:color="000000"/>
@@ -1994,7 +2147,7 @@
           </w:tcPr>
           <w:p>
             <w:pPr>
-              <w:pStyle w:val="user3"/>
+              <w:pStyle w:val="Style15"/>
               <w:spacing w:lineRule="auto" w:line="240"/>
               <w:ind w:hanging="0" w:left="0" w:right="0"/>
               <w:rPr/>
@@ -2007,7 +2160,7 @@
         </w:tc>
         <w:tc>
           <w:tcPr>
-            <w:tcW w:w="2584" w:type="dxa"/>
+            <w:tcW w:w="2585" w:type="dxa"/>
             <w:tcBorders>
               <w:left w:val="single" w:sz="4" w:space="0" w:color="000000"/>
               <w:bottom w:val="single" w:sz="4" w:space="0" w:color="000000"/>
@@ -2017,7 +2170,7 @@
           </w:tcPr>
           <w:p>
             <w:pPr>
-              <w:pStyle w:val="user3"/>
+              <w:pStyle w:val="Style15"/>
               <w:spacing w:lineRule="auto" w:line="240"/>
               <w:ind w:hanging="0" w:left="0"/>
               <w:rPr/>
@@ -2063,7 +2216,7 @@
         <w:pStyle w:val="H2"/>
         <w:rPr/>
       </w:pPr>
-      <w:bookmarkStart w:id="3" w:name="%25252525D0%25252525B2%25252525D1%252525"/>
+      <w:bookmarkStart w:id="3" w:name="%2525252525D0%2525252525B2%2525252525D1%"/>
       <w:bookmarkEnd w:id="3"/>
       <w:r>
         <w:rPr/>
@@ -2072,21 +2225,122 @@
     </w:p>
     <w:p>
       <w:pPr>
-        <w:pStyle w:val="P1"/>
-        <w:rPr/>
-      </w:pPr>
-      <w:r>
-        <w:rPr/>
-      </w:r>
-    </w:p>
-    <w:p>
-      <w:pPr>
-        <w:pStyle w:val="P1"/>
-        <w:rPr/>
-      </w:pPr>
-      <w:r>
-        <w:rPr/>
-        <w:t>Візуалізація надана на рисунку нижче:</w:t>
+        <w:pStyle w:val="H3"/>
+        <w:spacing w:before="0" w:after="0"/>
+        <w:rPr/>
+      </w:pPr>
+      <w:r>
+        <w:rPr/>
+        <w:t>Завдання</w:t>
+      </w:r>
+    </w:p>
+    <w:p>
+      <w:pPr>
+        <w:pStyle w:val="P1"/>
+        <w:rPr/>
+      </w:pPr>
+      <w:r>
+        <w:rPr/>
+      </w:r>
+    </w:p>
+    <w:p>
+      <w:pPr>
+        <w:pStyle w:val="P1"/>
+        <w:rPr/>
+      </w:pPr>
+      <w:r>
+        <w:rPr>
+          <w:rFonts w:ascii="Times New Roman" w:hAnsi="Times New Roman"/>
+          <w:b w:val="false"/>
+          <w:i w:val="false"/>
+          <w:caps w:val="false"/>
+          <w:smallCaps w:val="false"/>
+          <w:color w:val="000000"/>
+          <w:spacing w:val="0"/>
+          <w:sz w:val="27"/>
+        </w:rPr>
+        <w:t>Для значення K = 5 візуалізувати результати кластеризації (по осі абсцис відкласти назву (номер) кластера, по осі ординат – номер примірника в кластері).</w:t>
+      </w:r>
+    </w:p>
+    <w:p>
+      <w:pPr>
+        <w:pStyle w:val="P1"/>
+        <w:rPr/>
+      </w:pPr>
+      <w:r>
+        <w:rPr/>
+      </w:r>
+    </w:p>
+    <w:p>
+      <w:pPr>
+        <w:pStyle w:val="H3"/>
+        <w:spacing w:before="0" w:after="0"/>
+        <w:rPr/>
+      </w:pPr>
+      <w:r>
+        <w:rPr/>
+        <w:t>Виконання</w:t>
+      </w:r>
+    </w:p>
+    <w:p>
+      <w:pPr>
+        <w:pStyle w:val="P1"/>
+        <w:spacing w:before="0" w:after="0"/>
+        <w:rPr/>
+      </w:pPr>
+      <w:r>
+        <w:rPr/>
+      </w:r>
+    </w:p>
+    <w:p>
+      <w:pPr>
+        <w:pStyle w:val="P1"/>
+        <w:spacing w:before="0" w:after="0"/>
+        <w:rPr/>
+      </w:pPr>
+      <w:r>
+        <w:rPr/>
+        <w:t xml:space="preserve">Для візуалізації було запущено алгоритм </w:t>
+      </w:r>
+      <w:r>
+        <w:rPr>
+          <w:lang w:val="en-US"/>
+        </w:rPr>
+        <w:t xml:space="preserve">SimpleKMeans </w:t>
+      </w:r>
+      <w:r>
+        <w:rPr>
+          <w:lang w:val="uk-UA"/>
+        </w:rPr>
+        <w:t xml:space="preserve">з параметром </w:t>
+      </w:r>
+      <w:r>
+        <w:rPr>
+          <w:lang w:val="en-US"/>
+        </w:rPr>
+        <w:t xml:space="preserve">NumClusters = 5. </w:t>
+      </w:r>
+      <w:r>
+        <w:rPr>
+          <w:lang w:val="uk-UA"/>
+        </w:rPr>
+        <w:t xml:space="preserve">Далі було натиснуто правою кнопкою миші по результатам і обрано пункт </w:t>
+      </w:r>
+      <w:r>
+        <w:rPr>
+          <w:lang w:val="en-US"/>
+        </w:rPr>
+        <w:t>“Visualize cluster assignments.”</w:t>
+      </w:r>
+    </w:p>
+    <w:p>
+      <w:pPr>
+        <w:pStyle w:val="P1"/>
+        <w:rPr/>
+      </w:pPr>
+      <w:r>
+        <w:rPr/>
+        <w:t>Візуалізація на рисунку нижче:</w:t>
       </w:r>
     </w:p>
     <w:p>
@@ -2169,7 +2423,7 @@
         <w:pStyle w:val="H2"/>
         <w:rPr/>
       </w:pPr>
-      <w:bookmarkStart w:id="4" w:name="%25252525D0%25252525BE%25252525D0%252525"/>
+      <w:bookmarkStart w:id="4" w:name="%2525252525D0%2525252525BE%2525252525D0%"/>
       <w:bookmarkEnd w:id="4"/>
       <w:r>
         <w:rPr/>
@@ -2178,11 +2432,84 @@
     </w:p>
     <w:p>
       <w:pPr>
-        <w:pStyle w:val="P1"/>
-        <w:rPr/>
-      </w:pPr>
-      <w:r>
-        <w:rPr/>
+        <w:pStyle w:val="H3"/>
+        <w:rPr/>
+      </w:pPr>
+      <w:r>
+        <w:rPr/>
+        <w:t>Завдання</w:t>
+      </w:r>
+    </w:p>
+    <w:p>
+      <w:pPr>
+        <w:pStyle w:val="P1"/>
+        <w:rPr/>
+      </w:pPr>
+      <w:r>
+        <w:rPr/>
+      </w:r>
+    </w:p>
+    <w:p>
+      <w:pPr>
+        <w:pStyle w:val="P1"/>
+        <w:rPr/>
+      </w:pPr>
+      <w:r>
+        <w:rPr>
+          <w:rFonts w:ascii="Times New Roman" w:hAnsi="Times New Roman"/>
+          <w:b w:val="false"/>
+          <w:i w:val="false"/>
+          <w:caps w:val="false"/>
+          <w:smallCaps w:val="false"/>
+          <w:color w:val="000000"/>
+          <w:spacing w:val="0"/>
+          <w:sz w:val="27"/>
+        </w:rPr>
+        <w:t>Описати скільки примірників потрапило в кожен із кластерів, скільки ітерацій знадобилося для кластеризації даних.</w:t>
+      </w:r>
+    </w:p>
+    <w:p>
+      <w:pPr>
+        <w:pStyle w:val="P1"/>
+        <w:rPr/>
+      </w:pPr>
+      <w:r>
+        <w:rPr/>
+      </w:r>
+    </w:p>
+    <w:p>
+      <w:pPr>
+        <w:pStyle w:val="H3"/>
+        <w:rPr/>
+      </w:pPr>
+      <w:r>
+        <w:rPr/>
+        <w:t>Виконання</w:t>
+      </w:r>
+    </w:p>
+    <w:p>
+      <w:pPr>
+        <w:pStyle w:val="P1"/>
+        <w:rPr/>
+      </w:pPr>
+      <w:r>
+        <w:rPr/>
+      </w:r>
+    </w:p>
+    <w:p>
+      <w:pPr>
+        <w:pStyle w:val="P1"/>
+        <w:rPr/>
+      </w:pPr>
+      <w:r>
+        <w:rPr/>
+        <w:t xml:space="preserve">Кількість кластерів видно на сторінці результатів під назвою </w:t>
+      </w:r>
+      <w:r>
+        <w:rPr>
+          <w:lang w:val="en-US"/>
+        </w:rPr>
+        <w:t>“Number of iterations.”</w:t>
       </w:r>
     </w:p>
     <w:p>
@@ -2268,7 +2595,7 @@
         <w:pStyle w:val="H2"/>
         <w:rPr/>
       </w:pPr>
-      <w:bookmarkStart w:id="5" w:name="%25252525D1%2525252582%25252525D0%252521"/>
+      <w:bookmarkStart w:id="5" w:name="%2525252525D1%252525252582%2525252525D01"/>
       <w:bookmarkEnd w:id="5"/>
       <w:r>
         <w:rPr/>
@@ -2277,21 +2604,94 @@
     </w:p>
     <w:p>
       <w:pPr>
-        <w:pStyle w:val="P1"/>
-        <w:rPr/>
-      </w:pPr>
-      <w:r>
-        <w:rPr/>
-      </w:r>
-    </w:p>
-    <w:p>
-      <w:pPr>
-        <w:pStyle w:val="P1"/>
-        <w:rPr/>
-      </w:pPr>
-      <w:r>
-        <w:rPr/>
-        <w:t>Таблиця наведена нижче на рисунку:</w:t>
+        <w:pStyle w:val="H3"/>
+        <w:rPr/>
+      </w:pPr>
+      <w:r>
+        <w:rPr/>
+        <w:t>Завдання</w:t>
+      </w:r>
+    </w:p>
+    <w:p>
+      <w:pPr>
+        <w:pStyle w:val="P1"/>
+        <w:rPr/>
+      </w:pPr>
+      <w:r>
+        <w:rPr/>
+      </w:r>
+    </w:p>
+    <w:p>
+      <w:pPr>
+        <w:pStyle w:val="P1"/>
+        <w:rPr/>
+      </w:pPr>
+      <w:r>
+        <w:rPr>
+          <w:rFonts w:ascii="Times New Roman" w:hAnsi="Times New Roman"/>
+          <w:b w:val="false"/>
+          <w:i w:val="false"/>
+          <w:caps w:val="false"/>
+          <w:smallCaps w:val="false"/>
+          <w:color w:val="000000"/>
+          <w:spacing w:val="0"/>
+          <w:sz w:val="27"/>
+        </w:rPr>
+        <w:t>Скласти таблицю з характеристиками центроїдів.</w:t>
+      </w:r>
+    </w:p>
+    <w:p>
+      <w:pPr>
+        <w:pStyle w:val="P1"/>
+        <w:rPr/>
+      </w:pPr>
+      <w:r>
+        <w:rPr/>
+      </w:r>
+    </w:p>
+    <w:p>
+      <w:pPr>
+        <w:pStyle w:val="H3"/>
+        <w:rPr/>
+      </w:pPr>
+      <w:r>
+        <w:rPr/>
+        <w:t>Виконання</w:t>
+      </w:r>
+    </w:p>
+    <w:p>
+      <w:pPr>
+        <w:pStyle w:val="P1"/>
+        <w:rPr/>
+      </w:pPr>
+      <w:r>
+        <w:rPr/>
+      </w:r>
+    </w:p>
+    <w:p>
+      <w:pPr>
+        <w:pStyle w:val="P1"/>
+        <w:rPr/>
+      </w:pPr>
+      <w:r>
+        <w:rPr/>
+        <w:t>Таблиц</w:t>
+      </w:r>
+      <w:r>
+        <w:rPr/>
+        <w:t>ю</w:t>
+      </w:r>
+      <w:r>
+        <w:rPr/>
+        <w:t xml:space="preserve"> наведен</w:t>
+      </w:r>
+      <w:r>
+        <w:rPr/>
+        <w:t>о</w:t>
+      </w:r>
+      <w:r>
+        <w:rPr/>
+        <w:t xml:space="preserve"> нижче на рисунку:</w:t>
       </w:r>
     </w:p>
     <w:p>
@@ -2374,11 +2774,68 @@
         <w:pStyle w:val="H2"/>
         <w:rPr/>
       </w:pPr>
-      <w:bookmarkStart w:id="6" w:name="%25252525D0%25252525B7%25252525D0%252521"/>
+      <w:bookmarkStart w:id="6" w:name="%2525252525D0%2525252525B7%2525252525D01"/>
       <w:bookmarkEnd w:id="6"/>
       <w:r>
         <w:rPr/>
         <w:t>7 Завантажити вибірку «iris.arff»</w:t>
+      </w:r>
+    </w:p>
+    <w:p>
+      <w:pPr>
+        <w:pStyle w:val="H3"/>
+        <w:rPr/>
+      </w:pPr>
+      <w:r>
+        <w:rPr/>
+        <w:t>Завдання</w:t>
+      </w:r>
+    </w:p>
+    <w:p>
+      <w:pPr>
+        <w:pStyle w:val="P1"/>
+        <w:rPr/>
+      </w:pPr>
+      <w:r>
+        <w:rPr/>
+      </w:r>
+    </w:p>
+    <w:p>
+      <w:pPr>
+        <w:pStyle w:val="P1"/>
+        <w:rPr/>
+      </w:pPr>
+      <w:r>
+        <w:rPr>
+          <w:rFonts w:ascii="Times New Roman" w:hAnsi="Times New Roman"/>
+          <w:b w:val="false"/>
+          <w:i w:val="false"/>
+          <w:caps w:val="false"/>
+          <w:smallCaps w:val="false"/>
+          <w:color w:val="000000"/>
+          <w:spacing w:val="0"/>
+          <w:sz w:val="27"/>
+        </w:rPr>
+        <w:t>Завантажити вибірку «iris.arff».</w:t>
+      </w:r>
+    </w:p>
+    <w:p>
+      <w:pPr>
+        <w:pStyle w:val="P1"/>
+        <w:rPr/>
+      </w:pPr>
+      <w:r>
+        <w:rPr/>
+      </w:r>
+    </w:p>
+    <w:p>
+      <w:pPr>
+        <w:pStyle w:val="H3"/>
+        <w:rPr/>
+      </w:pPr>
+      <w:r>
+        <w:rPr/>
+        <w:t>Виконання</w:t>
       </w:r>
     </w:p>
     <w:p>
@@ -2480,7 +2937,7 @@
         <w:pStyle w:val="H2"/>
         <w:rPr/>
       </w:pPr>
-      <w:bookmarkStart w:id="7" w:name="%25252525D0%25252525B0%25252525D0%252521"/>
+      <w:bookmarkStart w:id="7" w:name="%2525252525D0%2525252525B0%2525252525D01"/>
       <w:bookmarkEnd w:id="7"/>
       <w:r>
         <w:rPr/>
@@ -2489,6 +2946,63 @@
     </w:p>
     <w:p>
       <w:pPr>
+        <w:pStyle w:val="H3"/>
+        <w:rPr/>
+      </w:pPr>
+      <w:r>
+        <w:rPr/>
+        <w:t>Завдання</w:t>
+      </w:r>
+    </w:p>
+    <w:p>
+      <w:pPr>
+        <w:pStyle w:val="P1"/>
+        <w:rPr/>
+      </w:pPr>
+      <w:r>
+        <w:rPr/>
+      </w:r>
+    </w:p>
+    <w:p>
+      <w:pPr>
+        <w:pStyle w:val="P1"/>
+        <w:rPr/>
+      </w:pPr>
+      <w:r>
+        <w:rPr>
+          <w:rFonts w:ascii="Times New Roman" w:hAnsi="Times New Roman"/>
+          <w:b w:val="false"/>
+          <w:i w:val="false"/>
+          <w:caps w:val="false"/>
+          <w:smallCaps w:val="false"/>
+          <w:color w:val="000000"/>
+          <w:spacing w:val="0"/>
+          <w:sz w:val="27"/>
+        </w:rPr>
+        <w:t>Запустити алгоритм кластеризації SimpleKMeans з K = 3 та оцінити якість кластеризації, порівнюючи кластери з попередньо заданими класами.</w:t>
+      </w:r>
+    </w:p>
+    <w:p>
+      <w:pPr>
+        <w:pStyle w:val="P1"/>
+        <w:rPr/>
+      </w:pPr>
+      <w:r>
+        <w:rPr/>
+      </w:r>
+    </w:p>
+    <w:p>
+      <w:pPr>
+        <w:pStyle w:val="H3"/>
+        <w:rPr/>
+      </w:pPr>
+      <w:r>
+        <w:rPr/>
+        <w:t>Виконання</w:t>
+      </w:r>
+    </w:p>
+    <w:p>
+      <w:pPr>
         <w:pStyle w:val="P1"/>
         <w:rPr/>
       </w:pPr>
@@ -2513,7 +3027,7 @@
       </w:pPr>
       <w:r>
         <w:rPr/>
-        <w:t>Вигляд результатів кластеризації видно нижче на рисунку:</w:t>
+        <w:t>Вигляд результатів кластеризації нижче на рисунку:</w:t>
       </w:r>
     </w:p>
     <w:p>
@@ -2596,30 +3110,97 @@
         <w:pStyle w:val="H2"/>
         <w:rPr/>
       </w:pPr>
-      <w:bookmarkStart w:id="8" w:name="%25252525D0%25252525B7%25252525D0%252522"/>
+      <w:bookmarkStart w:id="8" w:name="%2525252525D0%2525252525B7%2525252525D02"/>
       <w:bookmarkEnd w:id="8"/>
       <w:r>
         <w:rPr/>
-        <w:t>9 Записати характеристики кожного центроїду</w:t>
-      </w:r>
-    </w:p>
-    <w:p>
-      <w:pPr>
-        <w:pStyle w:val="P1"/>
-        <w:rPr/>
-      </w:pPr>
-      <w:r>
-        <w:rPr/>
-      </w:r>
-    </w:p>
-    <w:p>
-      <w:pPr>
-        <w:pStyle w:val="P1"/>
-        <w:rPr/>
-      </w:pPr>
-      <w:r>
-        <w:rPr/>
-        <w:t>Характеристика центроїдів наведена нижче на рисунку:</w:t>
+        <w:t xml:space="preserve">9 </w:t>
+      </w:r>
+      <w:r>
+        <w:rPr>
+          <w:lang w:val="uk-UA"/>
+        </w:rPr>
+        <w:t>Х</w:t>
+      </w:r>
+      <w:r>
+        <w:rPr/>
+        <w:t>арактеристики кожного центроїду</w:t>
+      </w:r>
+    </w:p>
+    <w:p>
+      <w:pPr>
+        <w:pStyle w:val="H3"/>
+        <w:rPr/>
+      </w:pPr>
+      <w:r>
+        <w:rPr/>
+        <w:t>Завдання</w:t>
+      </w:r>
+    </w:p>
+    <w:p>
+      <w:pPr>
+        <w:pStyle w:val="P1"/>
+        <w:rPr/>
+      </w:pPr>
+      <w:r>
+        <w:rPr/>
+      </w:r>
+    </w:p>
+    <w:p>
+      <w:pPr>
+        <w:pStyle w:val="P1"/>
+        <w:rPr/>
+      </w:pPr>
+      <w:r>
+        <w:rPr>
+          <w:rFonts w:ascii="Times New Roman" w:hAnsi="Times New Roman"/>
+          <w:b w:val="false"/>
+          <w:i w:val="false"/>
+          <w:caps w:val="false"/>
+          <w:smallCaps w:val="false"/>
+          <w:color w:val="000000"/>
+          <w:spacing w:val="0"/>
+          <w:sz w:val="27"/>
+        </w:rPr>
+        <w:t>Записати характеристики кожного центроїду.</w:t>
+      </w:r>
+    </w:p>
+    <w:p>
+      <w:pPr>
+        <w:pStyle w:val="P1"/>
+        <w:rPr/>
+      </w:pPr>
+      <w:r>
+        <w:rPr/>
+      </w:r>
+    </w:p>
+    <w:p>
+      <w:pPr>
+        <w:pStyle w:val="H3"/>
+        <w:rPr/>
+      </w:pPr>
+      <w:r>
+        <w:rPr/>
+        <w:t>Виконання</w:t>
+      </w:r>
+    </w:p>
+    <w:p>
+      <w:pPr>
+        <w:pStyle w:val="P1"/>
+        <w:rPr/>
+      </w:pPr>
+      <w:r>
+        <w:rPr/>
+      </w:r>
+    </w:p>
+    <w:p>
+      <w:pPr>
+        <w:pStyle w:val="P1"/>
+        <w:rPr/>
+      </w:pPr>
+      <w:r>
+        <w:rPr/>
+        <w:t>Характеристика центроїдів нижче на рисунку:</w:t>
       </w:r>
     </w:p>
     <w:p>
@@ -2702,7 +3283,7 @@
         <w:pStyle w:val="H2"/>
         <w:rPr/>
       </w:pPr>
-      <w:bookmarkStart w:id="9" w:name="%25252525D0%25252525BE%25252525D0%252521"/>
+      <w:bookmarkStart w:id="9" w:name="%2525252525D0%2525252525BE%2525252525D01"/>
       <w:bookmarkEnd w:id="9"/>
       <w:r>
         <w:rPr/>
@@ -2711,6 +3292,63 @@
     </w:p>
     <w:p>
       <w:pPr>
+        <w:pStyle w:val="H3"/>
+        <w:rPr/>
+      </w:pPr>
+      <w:r>
+        <w:rPr/>
+        <w:t>Завдання</w:t>
+      </w:r>
+    </w:p>
+    <w:p>
+      <w:pPr>
+        <w:pStyle w:val="P1"/>
+        <w:rPr/>
+      </w:pPr>
+      <w:r>
+        <w:rPr/>
+      </w:r>
+    </w:p>
+    <w:p>
+      <w:pPr>
+        <w:pStyle w:val="P1"/>
+        <w:rPr/>
+      </w:pPr>
+      <w:r>
+        <w:rPr>
+          <w:rFonts w:ascii="Times New Roman" w:hAnsi="Times New Roman"/>
+          <w:b w:val="false"/>
+          <w:i w:val="false"/>
+          <w:caps w:val="false"/>
+          <w:smallCaps w:val="false"/>
+          <w:color w:val="000000"/>
+          <w:spacing w:val="0"/>
+          <w:sz w:val="27"/>
+        </w:rPr>
+        <w:t>Описати як співвідносяться кластери та значення цільового атрибуту, скільки екземплярів було віднесено до «невірних» кластерів, а який клас виявився «легким» для виділення.</w:t>
+      </w:r>
+    </w:p>
+    <w:p>
+      <w:pPr>
+        <w:pStyle w:val="P1"/>
+        <w:rPr/>
+      </w:pPr>
+      <w:r>
+        <w:rPr/>
+      </w:r>
+    </w:p>
+    <w:p>
+      <w:pPr>
+        <w:pStyle w:val="H3"/>
+        <w:rPr/>
+      </w:pPr>
+      <w:r>
+        <w:rPr/>
+        <w:t>Виконання</w:t>
+      </w:r>
+    </w:p>
+    <w:p>
+      <w:pPr>
         <w:pStyle w:val="P1"/>
         <w:rPr/>
       </w:pPr>
@@ -2729,7 +3367,13 @@
         <w:rPr>
           <w:lang w:val="uk-UA"/>
         </w:rPr>
-        <w:t>При значенні кластерів 3, кожен кластер відповідає одному зі значень цільової ознаки.</w:t>
+        <w:t xml:space="preserve">При значенні кластерів 3, кожен кластер відповідає одному зі значень цільової ознаки. </w:t>
+      </w:r>
+      <w:r>
+        <w:rPr>
+          <w:lang w:val="uk-UA"/>
+        </w:rPr>
+        <w:t>Всі екземпляри було віднесено до вірних кластерів. Перший кластер виявився найбільш легким для виділення, бо він є найбільш компактним (Це видно з графіку).</w:t>
       </w:r>
     </w:p>
     <w:p>
@@ -2746,11 +3390,68 @@
         <w:pStyle w:val="H2"/>
         <w:rPr/>
       </w:pPr>
-      <w:bookmarkStart w:id="10" w:name="%25252525D0%25252525B2%25252525D1%252521"/>
+      <w:bookmarkStart w:id="10" w:name="%2525252525D0%2525252525B2%2525252525D11"/>
       <w:bookmarkEnd w:id="10"/>
       <w:r>
         <w:rPr/>
         <w:t>11 Візуалізувати результати</w:t>
+      </w:r>
+    </w:p>
+    <w:p>
+      <w:pPr>
+        <w:pStyle w:val="H3"/>
+        <w:rPr/>
+      </w:pPr>
+      <w:r>
+        <w:rPr/>
+        <w:t>Завдання</w:t>
+      </w:r>
+    </w:p>
+    <w:p>
+      <w:pPr>
+        <w:pStyle w:val="P1"/>
+        <w:rPr/>
+      </w:pPr>
+      <w:r>
+        <w:rPr/>
+      </w:r>
+    </w:p>
+    <w:p>
+      <w:pPr>
+        <w:pStyle w:val="P1"/>
+        <w:rPr/>
+      </w:pPr>
+      <w:r>
+        <w:rPr>
+          <w:rFonts w:ascii="Times New Roman" w:hAnsi="Times New Roman"/>
+          <w:b w:val="false"/>
+          <w:i w:val="false"/>
+          <w:caps w:val="false"/>
+          <w:smallCaps w:val="false"/>
+          <w:color w:val="000000"/>
+          <w:spacing w:val="0"/>
+          <w:sz w:val="27"/>
+        </w:rPr>
+        <w:t>Візуалізувати результати, використовуючи різні атрибути для осі ординат (при візуалізації екземпляри, позначені квадратами мають бути віднесені до «невірного» кластеру).</w:t>
+      </w:r>
+    </w:p>
+    <w:p>
+      <w:pPr>
+        <w:pStyle w:val="P1"/>
+        <w:rPr/>
+      </w:pPr>
+      <w:r>
+        <w:rPr/>
+      </w:r>
+    </w:p>
+    <w:p>
+      <w:pPr>
+        <w:pStyle w:val="H3"/>
+        <w:rPr/>
+      </w:pPr>
+      <w:r>
+        <w:rPr/>
+        <w:t>Виконання</w:t>
       </w:r>
     </w:p>
     <w:p>
@@ -2790,7 +3491,7 @@
         <w:rPr/>
         <w:drawing>
           <wp:inline distT="0" distB="0" distL="0" distR="0">
-            <wp:extent cx="5731510" cy="4327525"/>
+            <wp:extent cx="5654040" cy="4269105"/>
             <wp:effectExtent l="0" t="0" r="0" b="0"/>
             <wp:docPr id="8" name="Зображення8"/>
             <wp:cNvGraphicFramePr>
@@ -2814,7 +3515,7 @@
                   <pic:spPr bwMode="auto">
                     <a:xfrm>
                       <a:off x="0" y="0"/>
-                      <a:ext cx="5731510" cy="4327525"/>
+                      <a:ext cx="5654040" cy="4269105"/>
                     </a:xfrm>
                     <a:prstGeom prst="rect">
                       <a:avLst/>
@@ -2852,7 +3553,7 @@
         <w:pStyle w:val="H2"/>
         <w:rPr/>
       </w:pPr>
-      <w:bookmarkStart w:id="11" w:name="%25252525D0%25252525BD%25252525D0%252525"/>
+      <w:bookmarkStart w:id="11" w:name="%2525252525D0%2525252525BD%2525252525D0%"/>
       <w:bookmarkEnd w:id="11"/>
       <w:r>
         <w:rPr/>
@@ -2861,6 +3562,90 @@
     </w:p>
     <w:p>
       <w:pPr>
+        <w:pStyle w:val="H3"/>
+        <w:rPr/>
+      </w:pPr>
+      <w:r>
+        <w:rPr/>
+        <w:t>Завдання</w:t>
+      </w:r>
+    </w:p>
+    <w:p>
+      <w:pPr>
+        <w:pStyle w:val="P1"/>
+        <w:rPr/>
+      </w:pPr>
+      <w:r>
+        <w:rPr/>
+      </w:r>
+    </w:p>
+    <w:p>
+      <w:pPr>
+        <w:pStyle w:val="P1"/>
+        <w:rPr>
+          <w:rFonts w:ascii="Times New Roman" w:hAnsi="Times New Roman"/>
+          <w:b w:val="false"/>
+          <w:i w:val="false"/>
+          <w:caps w:val="false"/>
+          <w:smallCaps w:val="false"/>
+          <w:color w:val="000000"/>
+          <w:spacing w:val="0"/>
+          <w:sz w:val="27"/>
+        </w:rPr>
+      </w:pPr>
+      <w:r>
+        <w:rPr>
+          <w:rFonts w:ascii="Times New Roman" w:hAnsi="Times New Roman"/>
+          <w:b w:val="false"/>
+          <w:i w:val="false"/>
+          <w:caps w:val="false"/>
+          <w:smallCaps w:val="false"/>
+          <w:color w:val="000000"/>
+          <w:spacing w:val="0"/>
+          <w:sz w:val="27"/>
+        </w:rPr>
+        <w:t>Визначити, на що впливає параметр «seed».</w:t>
+      </w:r>
+    </w:p>
+    <w:p>
+      <w:pPr>
+        <w:pStyle w:val="P1"/>
+        <w:rPr>
+          <w:rFonts w:ascii="Times New Roman" w:hAnsi="Times New Roman"/>
+          <w:b w:val="false"/>
+          <w:i w:val="false"/>
+          <w:caps w:val="false"/>
+          <w:smallCaps w:val="false"/>
+          <w:color w:val="000000"/>
+          <w:spacing w:val="0"/>
+          <w:sz w:val="27"/>
+        </w:rPr>
+      </w:pPr>
+      <w:r>
+        <w:rPr>
+          <w:rFonts w:ascii="Times New Roman" w:hAnsi="Times New Roman"/>
+          <w:b w:val="false"/>
+          <w:i w:val="false"/>
+          <w:caps w:val="false"/>
+          <w:smallCaps w:val="false"/>
+          <w:color w:val="000000"/>
+          <w:spacing w:val="0"/>
+          <w:sz w:val="27"/>
+        </w:rPr>
+      </w:r>
+    </w:p>
+    <w:p>
+      <w:pPr>
+        <w:pStyle w:val="H3"/>
+        <w:rPr/>
+      </w:pPr>
+      <w:r>
+        <w:rPr/>
+        <w:t>Виконання</w:t>
+      </w:r>
+    </w:p>
+    <w:p>
+      <w:pPr>
         <w:pStyle w:val="P1"/>
         <w:rPr/>
       </w:pPr>
@@ -2887,7 +3672,25 @@
         <w:rPr>
           <w:lang w:val="uk-UA"/>
         </w:rPr>
-        <w:t>впливає на випадковість розподілу.</w:t>
+        <w:t xml:space="preserve">впливає на випадковість розподілу. </w:t>
+      </w:r>
+      <w:r>
+        <w:rPr>
+          <w:lang w:val="uk-UA"/>
+        </w:rPr>
+        <w:t xml:space="preserve">Його метою є забезпечити відтворюваність результатів. (Щоб можна було, задавши певний </w:t>
+      </w:r>
+      <w:r>
+        <w:rPr>
+          <w:lang w:val="en-US"/>
+        </w:rPr>
+        <w:t xml:space="preserve">seed, </w:t>
+      </w:r>
+      <w:r>
+        <w:rPr>
+          <w:lang w:val="uk-UA"/>
+        </w:rPr>
+        <w:t>отримати такі ж результати.)</w:t>
       </w:r>
     </w:p>
     <w:p>
@@ -2904,11 +3707,95 @@
         <w:pStyle w:val="H2"/>
         <w:rPr/>
       </w:pPr>
-      <w:bookmarkStart w:id="12" w:name="%25252525D0%25252525B7%25252525D0%252523"/>
+      <w:bookmarkStart w:id="12" w:name="%2525252525D0%2525252525B7%2525252525D03"/>
       <w:bookmarkEnd w:id="12"/>
       <w:r>
         <w:rPr/>
         <w:t>13 Завантажити вибірку «flagdata.arff»</w:t>
+      </w:r>
+    </w:p>
+    <w:p>
+      <w:pPr>
+        <w:pStyle w:val="H3"/>
+        <w:rPr/>
+      </w:pPr>
+      <w:r>
+        <w:rPr/>
+        <w:t>Завдання</w:t>
+      </w:r>
+    </w:p>
+    <w:p>
+      <w:pPr>
+        <w:pStyle w:val="P1"/>
+        <w:rPr/>
+      </w:pPr>
+      <w:r>
+        <w:rPr/>
+      </w:r>
+    </w:p>
+    <w:p>
+      <w:pPr>
+        <w:pStyle w:val="P1"/>
+        <w:rPr>
+          <w:rFonts w:ascii="Times New Roman" w:hAnsi="Times New Roman"/>
+          <w:b w:val="false"/>
+          <w:i w:val="false"/>
+          <w:caps w:val="false"/>
+          <w:smallCaps w:val="false"/>
+          <w:color w:val="000000"/>
+          <w:spacing w:val="0"/>
+          <w:sz w:val="27"/>
+        </w:rPr>
+      </w:pPr>
+      <w:r>
+        <w:rPr>
+          <w:rFonts w:ascii="Times New Roman" w:hAnsi="Times New Roman"/>
+          <w:b w:val="false"/>
+          <w:i w:val="false"/>
+          <w:caps w:val="false"/>
+          <w:smallCaps w:val="false"/>
+          <w:color w:val="000000"/>
+          <w:spacing w:val="0"/>
+          <w:sz w:val="27"/>
+        </w:rPr>
+        <w:t>Завантажити вибірку «flagdata.arff».</w:t>
+      </w:r>
+    </w:p>
+    <w:p>
+      <w:pPr>
+        <w:pStyle w:val="P1"/>
+        <w:rPr>
+          <w:rFonts w:ascii="Times New Roman" w:hAnsi="Times New Roman"/>
+          <w:b w:val="false"/>
+          <w:i w:val="false"/>
+          <w:caps w:val="false"/>
+          <w:smallCaps w:val="false"/>
+          <w:color w:val="000000"/>
+          <w:spacing w:val="0"/>
+          <w:sz w:val="27"/>
+        </w:rPr>
+      </w:pPr>
+      <w:r>
+        <w:rPr>
+          <w:rFonts w:ascii="Times New Roman" w:hAnsi="Times New Roman"/>
+          <w:b w:val="false"/>
+          <w:i w:val="false"/>
+          <w:caps w:val="false"/>
+          <w:smallCaps w:val="false"/>
+          <w:color w:val="000000"/>
+          <w:spacing w:val="0"/>
+          <w:sz w:val="27"/>
+        </w:rPr>
+      </w:r>
+    </w:p>
+    <w:p>
+      <w:pPr>
+        <w:pStyle w:val="H3"/>
+        <w:rPr/>
+      </w:pPr>
+      <w:r>
+        <w:rPr/>
+        <w:t>Виконання</w:t>
       </w:r>
     </w:p>
     <w:p>
@@ -3010,7 +3897,7 @@
         <w:pStyle w:val="H2"/>
         <w:rPr/>
       </w:pPr>
-      <w:bookmarkStart w:id="13" w:name="%25252525D0%25252525B0%25252525D0%252522"/>
+      <w:bookmarkStart w:id="13" w:name="%2525252525D0%2525252525B0%2525252525D02"/>
       <w:bookmarkEnd w:id="13"/>
       <w:r>
         <w:rPr/>
@@ -3019,11 +3906,113 @@
     </w:p>
     <w:p>
       <w:pPr>
-        <w:pStyle w:val="P1"/>
-        <w:rPr/>
-      </w:pPr>
-      <w:r>
-        <w:rPr/>
+        <w:pStyle w:val="H3"/>
+        <w:rPr/>
+      </w:pPr>
+      <w:r>
+        <w:rPr/>
+        <w:t>Завдання</w:t>
+      </w:r>
+    </w:p>
+    <w:p>
+      <w:pPr>
+        <w:pStyle w:val="P1"/>
+        <w:rPr/>
+      </w:pPr>
+      <w:r>
+        <w:rPr/>
+      </w:r>
+    </w:p>
+    <w:p>
+      <w:pPr>
+        <w:pStyle w:val="P1"/>
+        <w:rPr>
+          <w:rFonts w:ascii="Times New Roman" w:hAnsi="Times New Roman"/>
+          <w:b w:val="false"/>
+          <w:i w:val="false"/>
+          <w:caps w:val="false"/>
+          <w:smallCaps w:val="false"/>
+          <w:color w:val="000000"/>
+          <w:spacing w:val="0"/>
+          <w:sz w:val="27"/>
+        </w:rPr>
+      </w:pPr>
+      <w:r>
+        <w:rPr>
+          <w:rFonts w:ascii="Times New Roman" w:hAnsi="Times New Roman"/>
+          <w:b w:val="false"/>
+          <w:i w:val="false"/>
+          <w:caps w:val="false"/>
+          <w:smallCaps w:val="false"/>
+          <w:color w:val="000000"/>
+          <w:spacing w:val="0"/>
+          <w:sz w:val="27"/>
+        </w:rPr>
+        <w:t>Запустити алгоритм COBWEB з параметрами С=0,4 (0,35), saveInstanceData = True, cluster mode = Use training set.</w:t>
+      </w:r>
+    </w:p>
+    <w:p>
+      <w:pPr>
+        <w:pStyle w:val="P1"/>
+        <w:rPr>
+          <w:rFonts w:ascii="Times New Roman" w:hAnsi="Times New Roman"/>
+          <w:b w:val="false"/>
+          <w:i w:val="false"/>
+          <w:caps w:val="false"/>
+          <w:smallCaps w:val="false"/>
+          <w:color w:val="000000"/>
+          <w:spacing w:val="0"/>
+          <w:sz w:val="27"/>
+        </w:rPr>
+      </w:pPr>
+      <w:r>
+        <w:rPr>
+          <w:rFonts w:ascii="Times New Roman" w:hAnsi="Times New Roman"/>
+          <w:b w:val="false"/>
+          <w:i w:val="false"/>
+          <w:caps w:val="false"/>
+          <w:smallCaps w:val="false"/>
+          <w:color w:val="000000"/>
+          <w:spacing w:val="0"/>
+          <w:sz w:val="27"/>
+        </w:rPr>
+      </w:r>
+    </w:p>
+    <w:p>
+      <w:pPr>
+        <w:pStyle w:val="H3"/>
+        <w:rPr/>
+      </w:pPr>
+      <w:r>
+        <w:rPr/>
+        <w:t>Виконання</w:t>
+      </w:r>
+    </w:p>
+    <w:p>
+      <w:pPr>
+        <w:pStyle w:val="P1"/>
+        <w:rPr>
+          <w:rFonts w:ascii="Times New Roman" w:hAnsi="Times New Roman"/>
+          <w:b w:val="false"/>
+          <w:i w:val="false"/>
+          <w:caps w:val="false"/>
+          <w:smallCaps w:val="false"/>
+          <w:color w:val="000000"/>
+          <w:spacing w:val="0"/>
+          <w:sz w:val="27"/>
+        </w:rPr>
+      </w:pPr>
+      <w:r>
+        <w:rPr>
+          <w:rFonts w:ascii="Times New Roman" w:hAnsi="Times New Roman"/>
+          <w:b w:val="false"/>
+          <w:i w:val="false"/>
+          <w:caps w:val="false"/>
+          <w:smallCaps w:val="false"/>
+          <w:color w:val="000000"/>
+          <w:spacing w:val="0"/>
+          <w:sz w:val="27"/>
+        </w:rPr>
       </w:r>
     </w:p>
     <w:p>
@@ -3116,7 +4105,7 @@
         <w:pStyle w:val="H2"/>
         <w:rPr/>
       </w:pPr>
-      <w:bookmarkStart w:id="14" w:name="%25252525D0%25252525B2%25252525D1%252522"/>
+      <w:bookmarkStart w:id="14" w:name="%2525252525D0%2525252525B2%2525252525D12"/>
       <w:bookmarkEnd w:id="14"/>
       <w:r>
         <w:rPr/>
@@ -3125,11 +4114,105 @@
     </w:p>
     <w:p>
       <w:pPr>
-        <w:pStyle w:val="P1"/>
-        <w:rPr/>
-      </w:pPr>
-      <w:r>
-        <w:rPr/>
+        <w:pStyle w:val="H3"/>
+        <w:rPr/>
+      </w:pPr>
+      <w:r>
+        <w:rPr/>
+        <w:t>Завдання</w:t>
+      </w:r>
+    </w:p>
+    <w:p>
+      <w:pPr>
+        <w:pStyle w:val="P1"/>
+        <w:rPr/>
+      </w:pPr>
+      <w:r>
+        <w:rPr/>
+      </w:r>
+    </w:p>
+    <w:p>
+      <w:pPr>
+        <w:pStyle w:val="P1"/>
+        <w:rPr>
+          <w:rFonts w:ascii="Times New Roman" w:hAnsi="Times New Roman"/>
+          <w:b w:val="false"/>
+          <w:i w:val="false"/>
+          <w:caps w:val="false"/>
+          <w:smallCaps w:val="false"/>
+          <w:color w:val="000000"/>
+          <w:spacing w:val="0"/>
+          <w:sz w:val="27"/>
+        </w:rPr>
+      </w:pPr>
+      <w:r>
+        <w:rPr>
+          <w:rFonts w:ascii="Times New Roman" w:hAnsi="Times New Roman"/>
+          <w:b w:val="false"/>
+          <w:i w:val="false"/>
+          <w:caps w:val="false"/>
+          <w:smallCaps w:val="false"/>
+          <w:color w:val="000000"/>
+          <w:spacing w:val="0"/>
+          <w:sz w:val="27"/>
+        </w:rPr>
+        <w:t>Візуалізувати отриману дендрограму та вказати, що спільного у прапорів, які опинилися в одному кластері.</w:t>
+      </w:r>
+    </w:p>
+    <w:p>
+      <w:pPr>
+        <w:pStyle w:val="P1"/>
+        <w:rPr>
+          <w:rFonts w:ascii="Times New Roman" w:hAnsi="Times New Roman"/>
+          <w:b w:val="false"/>
+          <w:i w:val="false"/>
+          <w:caps w:val="false"/>
+          <w:smallCaps w:val="false"/>
+          <w:color w:val="000000"/>
+          <w:spacing w:val="0"/>
+          <w:sz w:val="27"/>
+        </w:rPr>
+      </w:pPr>
+      <w:r>
+        <w:rPr>
+          <w:rFonts w:ascii="Times New Roman" w:hAnsi="Times New Roman"/>
+          <w:b w:val="false"/>
+          <w:i w:val="false"/>
+          <w:caps w:val="false"/>
+          <w:smallCaps w:val="false"/>
+          <w:color w:val="000000"/>
+          <w:spacing w:val="0"/>
+          <w:sz w:val="27"/>
+        </w:rPr>
+      </w:r>
+    </w:p>
+    <w:p>
+      <w:pPr>
+        <w:pStyle w:val="H3"/>
+        <w:rPr/>
+      </w:pPr>
+      <w:r>
+        <w:rPr/>
+        <w:t>Виконання</w:t>
+      </w:r>
+    </w:p>
+    <w:p>
+      <w:pPr>
+        <w:pStyle w:val="P1"/>
+        <w:rPr/>
+      </w:pPr>
+      <w:r>
+        <w:rPr/>
+      </w:r>
+    </w:p>
+    <w:p>
+      <w:pPr>
+        <w:pStyle w:val="P1"/>
+        <w:rPr/>
+      </w:pPr>
+      <w:r>
+        <w:rPr/>
+        <w:t>Прапорці, які опинилися в одному кластері є схожими між собою за відстанню.</w:t>
       </w:r>
     </w:p>
     <w:p>
@@ -3222,11 +4305,68 @@
         <w:pStyle w:val="H2"/>
         <w:rPr/>
       </w:pPr>
-      <w:bookmarkStart w:id="15" w:name="%25252525D0%25252525B7%25252525D0%252524"/>
+      <w:bookmarkStart w:id="15" w:name="%2525252525D0%2525252525B7%2525252525D04"/>
       <w:bookmarkEnd w:id="15"/>
       <w:r>
         <w:rPr/>
         <w:t>16 Завантажити вибірку «zoo.arff»</w:t>
+      </w:r>
+    </w:p>
+    <w:p>
+      <w:pPr>
+        <w:pStyle w:val="H3"/>
+        <w:rPr/>
+      </w:pPr>
+      <w:r>
+        <w:rPr/>
+        <w:t>Завдання</w:t>
+      </w:r>
+    </w:p>
+    <w:p>
+      <w:pPr>
+        <w:pStyle w:val="P1"/>
+        <w:rPr/>
+      </w:pPr>
+      <w:r>
+        <w:rPr/>
+      </w:r>
+    </w:p>
+    <w:p>
+      <w:pPr>
+        <w:pStyle w:val="P1"/>
+        <w:rPr/>
+      </w:pPr>
+      <w:r>
+        <w:rPr>
+          <w:rFonts w:ascii="Times New Roman" w:hAnsi="Times New Roman"/>
+          <w:b w:val="false"/>
+          <w:i w:val="false"/>
+          <w:caps w:val="false"/>
+          <w:smallCaps w:val="false"/>
+          <w:color w:val="000000"/>
+          <w:spacing w:val="0"/>
+          <w:sz w:val="27"/>
+        </w:rPr>
+        <w:t>Завантажити вибірку «zoo.arff».</w:t>
+      </w:r>
+    </w:p>
+    <w:p>
+      <w:pPr>
+        <w:pStyle w:val="P1"/>
+        <w:rPr/>
+      </w:pPr>
+      <w:r>
+        <w:rPr/>
+      </w:r>
+    </w:p>
+    <w:p>
+      <w:pPr>
+        <w:pStyle w:val="H3"/>
+        <w:rPr/>
+      </w:pPr>
+      <w:r>
+        <w:rPr/>
+        <w:t>Виконання</w:t>
       </w:r>
     </w:p>
     <w:p>
@@ -3328,11 +4468,68 @@
         <w:pStyle w:val="H2"/>
         <w:rPr/>
       </w:pPr>
-      <w:bookmarkStart w:id="16" w:name="%25252525D0%25252525BE%25252525D0%252522"/>
+      <w:bookmarkStart w:id="16" w:name="%2525252525D0%2525252525BE%2525252525D02"/>
       <w:bookmarkEnd w:id="16"/>
       <w:r>
         <w:rPr/>
         <w:t>17 Обрати з вибірки частину тварин</w:t>
+      </w:r>
+    </w:p>
+    <w:p>
+      <w:pPr>
+        <w:pStyle w:val="H3"/>
+        <w:rPr/>
+      </w:pPr>
+      <w:r>
+        <w:rPr/>
+        <w:t>Завдання</w:t>
+      </w:r>
+    </w:p>
+    <w:p>
+      <w:pPr>
+        <w:pStyle w:val="P1"/>
+        <w:rPr/>
+      </w:pPr>
+      <w:r>
+        <w:rPr/>
+      </w:r>
+    </w:p>
+    <w:p>
+      <w:pPr>
+        <w:pStyle w:val="P1"/>
+        <w:rPr/>
+      </w:pPr>
+      <w:r>
+        <w:rPr>
+          <w:rFonts w:ascii="Times New Roman" w:hAnsi="Times New Roman"/>
+          <w:b w:val="false"/>
+          <w:i w:val="false"/>
+          <w:caps w:val="false"/>
+          <w:smallCaps w:val="false"/>
+          <w:color w:val="000000"/>
+          <w:spacing w:val="0"/>
+          <w:sz w:val="27"/>
+        </w:rPr>
+        <w:t>Обрати з вибірки частину тварин на власний розсуд (за типом).</w:t>
+      </w:r>
+    </w:p>
+    <w:p>
+      <w:pPr>
+        <w:pStyle w:val="P1"/>
+        <w:rPr/>
+      </w:pPr>
+      <w:r>
+        <w:rPr/>
+      </w:r>
+    </w:p>
+    <w:p>
+      <w:pPr>
+        <w:pStyle w:val="H3"/>
+        <w:rPr/>
+      </w:pPr>
+      <w:r>
+        <w:rPr/>
+        <w:t>Виконання</w:t>
       </w:r>
     </w:p>
     <w:p>
@@ -3446,7 +4643,7 @@
         <w:pStyle w:val="H2"/>
         <w:rPr/>
       </w:pPr>
-      <w:bookmarkStart w:id="17" w:name="%25252525D0%25252525B0%25252525D0%252523"/>
+      <w:bookmarkStart w:id="17" w:name="%2525252525D0%2525252525B0%2525252525D03"/>
       <w:bookmarkEnd w:id="17"/>
       <w:r>
         <w:rPr/>
@@ -3455,11 +4652,125 @@
     </w:p>
     <w:p>
       <w:pPr>
-        <w:pStyle w:val="P1"/>
-        <w:rPr/>
-      </w:pPr>
-      <w:r>
-        <w:rPr/>
+        <w:pStyle w:val="H3"/>
+        <w:rPr/>
+      </w:pPr>
+      <w:r>
+        <w:rPr/>
+        <w:t>Завдання</w:t>
+      </w:r>
+    </w:p>
+    <w:p>
+      <w:pPr>
+        <w:pStyle w:val="P1"/>
+        <w:rPr/>
+      </w:pPr>
+      <w:r>
+        <w:rPr/>
+      </w:r>
+    </w:p>
+    <w:p>
+      <w:pPr>
+        <w:pStyle w:val="P1"/>
+        <w:rPr/>
+      </w:pPr>
+      <w:r>
+        <w:rPr/>
+        <w:t>Запустити  алгоритм  Hierarchical  Clusterer  (тип  тварини  не використовувати  в  кластеризації,  а  назву  за  допомогою  фільтру NominalToString перетворити на рядковий тип).</w:t>
+      </w:r>
+    </w:p>
+    <w:p>
+      <w:pPr>
+        <w:pStyle w:val="P1"/>
+        <w:rPr/>
+      </w:pPr>
+      <w:r>
+        <w:rPr/>
+      </w:r>
+    </w:p>
+    <w:p>
+      <w:pPr>
+        <w:pStyle w:val="H3"/>
+        <w:rPr/>
+      </w:pPr>
+      <w:r>
+        <w:rPr/>
+        <w:t>Виконання</w:t>
+      </w:r>
+    </w:p>
+    <w:p>
+      <w:pPr>
+        <w:pStyle w:val="P1"/>
+        <w:rPr/>
+      </w:pPr>
+      <w:r>
+        <w:rPr/>
+      </w:r>
+    </w:p>
+    <w:p>
+      <w:pPr>
+        <w:pStyle w:val="P1"/>
+        <w:rPr/>
+      </w:pPr>
+      <w:r>
+        <w:rPr/>
+        <w:t xml:space="preserve">Тип тварин ігнорується через </w:t>
+      </w:r>
+      <w:r>
+        <w:rPr>
+          <w:lang w:val="uk-UA"/>
+        </w:rPr>
+        <w:t xml:space="preserve">натискання кнопки </w:t>
+      </w:r>
+      <w:r>
+        <w:rPr>
+          <w:lang w:val="en-US"/>
+        </w:rPr>
+        <w:t xml:space="preserve">Ignore Attributes </w:t>
+      </w:r>
+      <w:r>
+        <w:rPr>
+          <w:lang w:val="uk-UA"/>
+        </w:rPr>
+        <w:t xml:space="preserve">на вкладці </w:t>
+      </w:r>
+      <w:r>
+        <w:rPr>
+          <w:lang w:val="en-US"/>
+        </w:rPr>
+        <w:t>Cluster.</w:t>
+      </w:r>
+    </w:p>
+    <w:p>
+      <w:pPr>
+        <w:pStyle w:val="P1"/>
+        <w:rPr>
+          <w:lang w:val="uk-UA"/>
+        </w:rPr>
+      </w:pPr>
+      <w:r>
+        <w:rPr>
+          <w:lang w:val="uk-UA"/>
+        </w:rPr>
+        <w:t xml:space="preserve">Назву перетворено на рядковий тип через застосування фільтру </w:t>
+      </w:r>
+      <w:r>
+        <w:rPr>
+          <w:lang w:val="en-US"/>
+        </w:rPr>
+        <w:t xml:space="preserve">NumToString </w:t>
+      </w:r>
+      <w:r>
+        <w:rPr>
+          <w:lang w:val="uk-UA"/>
+        </w:rPr>
+        <w:t xml:space="preserve">у вкладці </w:t>
+      </w:r>
+      <w:r>
+        <w:rPr>
+          <w:lang w:val="en-US"/>
+        </w:rPr>
+        <w:t>Preprocess.</w:t>
       </w:r>
     </w:p>
     <w:p>
@@ -3506,7 +4817,7 @@
         <w:rPr/>
         <w:drawing>
           <wp:inline distT="0" distB="0" distL="0" distR="0">
-            <wp:extent cx="5731510" cy="6268720"/>
+            <wp:extent cx="5731510" cy="6555740"/>
             <wp:effectExtent l="0" t="0" r="0" b="0"/>
             <wp:docPr id="14" name="Зображення14"/>
             <wp:cNvGraphicFramePr>
@@ -3530,7 +4841,7 @@
                   <pic:spPr bwMode="auto">
                     <a:xfrm>
                       <a:off x="0" y="0"/>
-                      <a:ext cx="5731510" cy="6268720"/>
+                      <a:ext cx="5731510" cy="6555740"/>
                     </a:xfrm>
                     <a:prstGeom prst="rect">
                       <a:avLst/>
@@ -3568,7 +4879,7 @@
         <w:pStyle w:val="H2"/>
         <w:rPr/>
       </w:pPr>
-      <w:bookmarkStart w:id="18" w:name="%25252525D0%25252525B2%25252525D1%252523"/>
+      <w:bookmarkStart w:id="18" w:name="%2525252525D0%2525252525B2%2525252525D13"/>
       <w:bookmarkEnd w:id="18"/>
       <w:r>
         <w:rPr/>
@@ -3674,7 +4985,7 @@
         <w:pStyle w:val="H2"/>
         <w:rPr/>
       </w:pPr>
-      <w:bookmarkStart w:id="19" w:name="%25252525D0%25252525B7%25252525D0%252526"/>
+      <w:bookmarkStart w:id="19" w:name="%2525252525D0%2525252525B7%2525252525D05"/>
       <w:bookmarkEnd w:id="19"/>
       <w:r>
         <w:rPr/>
@@ -3804,7 +5115,7 @@
         <w:pStyle w:val="H2"/>
         <w:rPr/>
       </w:pPr>
-      <w:bookmarkStart w:id="20" w:name="%25252525D0%25252525B7%25252525D0%252527"/>
+      <w:bookmarkStart w:id="20" w:name="%2525252525D0%2525252525B7%2525252525D06"/>
       <w:bookmarkEnd w:id="20"/>
       <w:r>
         <w:rPr/>
@@ -5387,13 +6698,13 @@
       <w:lang w:val="en-US" w:eastAsia="uk-UA"/>
     </w:rPr>
   </w:style>
-  <w:style w:type="character" w:styleId="Style12">
-    <w:name w:val="Символ нумерації"/>
+  <w:style w:type="character" w:styleId="user">
+    <w:name w:val="Символ нумерації (user)"/>
     <w:qFormat/>
     <w:rPr/>
   </w:style>
-  <w:style w:type="character" w:styleId="user">
-    <w:name w:val="Маркери (user)"/>
+  <w:style w:type="character" w:styleId="Style12">
+    <w:name w:val="Маркери"/>
     <w:qFormat/>
     <w:rPr>
       <w:rFonts w:ascii="OpenSymbol" w:hAnsi="OpenSymbol" w:eastAsia="OpenSymbol" w:cs="OpenSymbol"/>
@@ -5416,7 +6727,7 @@
       <w:spacing w:before="240" w:after="120"/>
     </w:pPr>
     <w:rPr>
-      <w:rFonts w:ascii="Liberation Sans" w:hAnsi="Liberation Sans" w:eastAsia="Microsoft YaHei" w:cs="Lucida Sans"/>
+      <w:rFonts w:ascii="Liberation Sans" w:hAnsi="Liberation Sans" w:eastAsia="Microsoft YaHei" w:cs="Arial Unicode MS"/>
       <w:sz w:val="28"/>
       <w:szCs w:val="28"/>
     </w:rPr>
@@ -5461,7 +6772,7 @@
       <w:suppressLineNumbers/>
     </w:pPr>
     <w:rPr>
-      <w:rFonts w:cs="Lucida Sans"/>
+      <w:rFonts w:cs="Arial Unicode MS"/>
     </w:rPr>
   </w:style>
   <w:style w:type="paragraph" w:styleId="user1">
@@ -5474,7 +6785,7 @@
       <w:spacing w:before="240" w:after="120"/>
     </w:pPr>
     <w:rPr>
-      <w:rFonts w:ascii="Liberation Sans" w:hAnsi="Liberation Sans" w:eastAsia="Microsoft YaHei" w:cs="Arial Unicode MS"/>
+      <w:rFonts w:ascii="Liberation Sans" w:hAnsi="Liberation Sans" w:eastAsia="Microsoft YaHei" w:cs="Lucida Sans"/>
       <w:sz w:val="28"/>
       <w:szCs w:val="28"/>
     </w:rPr>
@@ -5487,12 +6798,12 @@
       <w:suppressLineNumbers/>
     </w:pPr>
     <w:rPr>
-      <w:rFonts w:cs="Arial Unicode MS"/>
+      <w:rFonts w:cs="Lucida Sans"/>
     </w:rPr>
   </w:style>
   <w:style w:type="paragraph" w:styleId="IndexHeading">
     <w:name w:val="index heading"/>
-    <w:basedOn w:val="user1"/>
+    <w:basedOn w:val="Style13"/>
     <w:pPr/>
     <w:rPr/>
   </w:style>
@@ -5591,7 +6902,9 @@
     <w:link w:val="H2Char"/>
     <w:qFormat/>
     <w:rsid w:val="00062cf8"/>
-    <w:pPr/>
+    <w:pPr>
+      <w:spacing w:before="0" w:after="0"/>
+    </w:pPr>
     <w:rPr>
       <w:rFonts w:ascii="Times New Roman" w:hAnsi="Times New Roman" w:cs="Times New Roman"/>
       <w:b/>
@@ -5618,7 +6931,9 @@
     <w:link w:val="H3Char"/>
     <w:qFormat/>
     <w:rsid w:val="00dc3221"/>
-    <w:pPr/>
+    <w:pPr>
+      <w:spacing w:before="0" w:after="0"/>
+    </w:pPr>
     <w:rPr>
       <w:rFonts w:ascii="Times New Roman" w:hAnsi="Times New Roman" w:cs="Times New Roman"/>
       <w:b/>
@@ -5795,8 +7110,8 @@
       <w:sz w:val="28"/>
     </w:rPr>
   </w:style>
-  <w:style w:type="paragraph" w:styleId="user3">
-    <w:name w:val="Вміст таблиці (user)"/>
+  <w:style w:type="paragraph" w:styleId="Style15">
+    <w:name w:val="Вміст таблиці"/>
     <w:basedOn w:val="Normal"/>
     <w:qFormat/>
     <w:pPr>
@@ -5805,9 +7120,9 @@
     </w:pPr>
     <w:rPr/>
   </w:style>
-  <w:style w:type="paragraph" w:styleId="user4">
-    <w:name w:val="Заголовок таблиці (user)"/>
-    <w:basedOn w:val="user3"/>
+  <w:style w:type="paragraph" w:styleId="Style16">
+    <w:name w:val="Заголовок таблиці"/>
+    <w:basedOn w:val="Style15"/>
     <w:qFormat/>
     <w:pPr>
       <w:suppressLineNumbers/>
@@ -5818,8 +7133,8 @@
       <w:bCs/>
     </w:rPr>
   </w:style>
-  <w:style w:type="numbering" w:styleId="user5" w:default="1">
-    <w:name w:val="Без маркерів (user)"/>
+  <w:style w:type="numbering" w:styleId="Style17" w:default="1">
+    <w:name w:val="Без маркерів"/>
     <w:uiPriority w:val="99"/>
     <w:semiHidden/>
     <w:unhideWhenUsed/>

</xml_diff>

<commit_message>
docs: finish IA6 report
</commit_message>
<xml_diff>
--- a/41IA Intelektualnyj analiz danyh/6/IA_KNT-122_Onyshchenko_19_PR6.docx
+++ b/41IA Intelektualnyj analiz danyh/6/IA_KNT-122_Onyshchenko_19_PR6.docx
@@ -403,8 +403,7 @@
     </w:p>
     <w:p>
       <w:pPr>
-        <w:pStyle w:val="H1"/>
-        <w:spacing w:before="0" w:after="0"/>
+        <w:pStyle w:val="h11"/>
         <w:rPr/>
       </w:pPr>
       <w:r>
@@ -452,7 +451,7 @@
     </w:p>
     <w:p>
       <w:pPr>
-        <w:pStyle w:val="H1"/>
+        <w:pStyle w:val="h11"/>
         <w:rPr/>
       </w:pPr>
       <w:r>
@@ -1055,7 +1054,7 @@
     </w:p>
     <w:p>
       <w:pPr>
-        <w:pStyle w:val="H1"/>
+        <w:pStyle w:val="h11"/>
         <w:rPr/>
       </w:pPr>
       <w:r>
@@ -4888,21 +4887,96 @@
     </w:p>
     <w:p>
       <w:pPr>
-        <w:pStyle w:val="P1"/>
-        <w:rPr/>
-      </w:pPr>
-      <w:r>
-        <w:rPr/>
-      </w:r>
-    </w:p>
-    <w:p>
-      <w:pPr>
-        <w:pStyle w:val="P1"/>
-        <w:rPr/>
-      </w:pPr>
-      <w:r>
-        <w:rPr/>
-        <w:t>Сенс у створені кластерів є. Візуалізація кластеризації наведена нижче на рисунку:</w:t>
+        <w:pStyle w:val="H3"/>
+        <w:rPr/>
+      </w:pPr>
+      <w:r>
+        <w:rPr/>
+        <w:t>Завдання</w:t>
+      </w:r>
+    </w:p>
+    <w:p>
+      <w:pPr>
+        <w:pStyle w:val="P1"/>
+        <w:rPr/>
+      </w:pPr>
+      <w:r>
+        <w:rPr/>
+      </w:r>
+    </w:p>
+    <w:p>
+      <w:pPr>
+        <w:pStyle w:val="P1"/>
+        <w:rPr/>
+      </w:pPr>
+      <w:r>
+        <w:rPr>
+          <w:rFonts w:ascii="Times New Roman" w:hAnsi="Times New Roman"/>
+          <w:b w:val="false"/>
+          <w:i w:val="false"/>
+          <w:caps w:val="false"/>
+          <w:smallCaps w:val="false"/>
+          <w:color w:val="000000"/>
+          <w:spacing w:val="0"/>
+          <w:sz w:val="27"/>
+        </w:rPr>
+        <w:t>Візуалізувати результати роботи алгоритму та оцінити, чи є логічний сенс в створюваних кластерах.</w:t>
+      </w:r>
+    </w:p>
+    <w:p>
+      <w:pPr>
+        <w:pStyle w:val="P1"/>
+        <w:rPr/>
+      </w:pPr>
+      <w:r>
+        <w:rPr/>
+      </w:r>
+    </w:p>
+    <w:p>
+      <w:pPr>
+        <w:pStyle w:val="H3"/>
+        <w:rPr/>
+      </w:pPr>
+      <w:r>
+        <w:rPr/>
+        <w:t>Виконання</w:t>
+      </w:r>
+    </w:p>
+    <w:p>
+      <w:pPr>
+        <w:pStyle w:val="P1"/>
+        <w:rPr/>
+      </w:pPr>
+      <w:r>
+        <w:rPr/>
+      </w:r>
+    </w:p>
+    <w:p>
+      <w:pPr>
+        <w:pStyle w:val="P1"/>
+        <w:rPr/>
+      </w:pPr>
+      <w:r>
+        <w:rPr/>
+        <w:t>Сенс у кластер</w:t>
+      </w:r>
+      <w:r>
+        <w:rPr/>
+        <w:t>ах</w:t>
+      </w:r>
+      <w:r>
+        <w:rPr/>
+        <w:t xml:space="preserve"> є. </w:t>
+      </w:r>
+    </w:p>
+    <w:p>
+      <w:pPr>
+        <w:pStyle w:val="P1"/>
+        <w:rPr/>
+      </w:pPr>
+      <w:r>
+        <w:rPr/>
+        <w:t>Візуалізація кластеризації наведена на рисунку:</w:t>
       </w:r>
     </w:p>
     <w:p>
@@ -4994,6 +5068,63 @@
     </w:p>
     <w:p>
       <w:pPr>
+        <w:pStyle w:val="H3"/>
+        <w:rPr/>
+      </w:pPr>
+      <w:r>
+        <w:rPr/>
+        <w:t>Завдання</w:t>
+      </w:r>
+    </w:p>
+    <w:p>
+      <w:pPr>
+        <w:pStyle w:val="P1"/>
+        <w:rPr/>
+      </w:pPr>
+      <w:r>
+        <w:rPr/>
+      </w:r>
+    </w:p>
+    <w:p>
+      <w:pPr>
+        <w:pStyle w:val="P1"/>
+        <w:rPr/>
+      </w:pPr>
+      <w:r>
+        <w:rPr>
+          <w:rFonts w:ascii="Times New Roman" w:hAnsi="Times New Roman"/>
+          <w:b w:val="false"/>
+          <w:i w:val="false"/>
+          <w:caps w:val="false"/>
+          <w:smallCaps w:val="false"/>
+          <w:color w:val="000000"/>
+          <w:spacing w:val="0"/>
+          <w:sz w:val="27"/>
+        </w:rPr>
+        <w:t>Згенерувати вибірку за допомогою алгоритму BIRCHCluster. До вибірки згенерувати також флаг класу. Згенерований набір зберегти.</w:t>
+      </w:r>
+    </w:p>
+    <w:p>
+      <w:pPr>
+        <w:pStyle w:val="P1"/>
+        <w:rPr/>
+      </w:pPr>
+      <w:r>
+        <w:rPr/>
+      </w:r>
+    </w:p>
+    <w:p>
+      <w:pPr>
+        <w:pStyle w:val="H3"/>
+        <w:rPr/>
+      </w:pPr>
+      <w:r>
+        <w:rPr/>
+        <w:t>Виконання</w:t>
+      </w:r>
+    </w:p>
+    <w:p>
+      <w:pPr>
         <w:pStyle w:val="P1"/>
         <w:rPr/>
       </w:pPr>
@@ -5053,7 +5184,7 @@
         <w:rPr/>
         <w:drawing>
           <wp:inline distT="0" distB="0" distL="0" distR="0">
-            <wp:extent cx="5731510" cy="6268720"/>
+            <wp:extent cx="5550535" cy="6070600"/>
             <wp:effectExtent l="0" t="0" r="0" b="0"/>
             <wp:docPr id="16" name="Зображення16"/>
             <wp:cNvGraphicFramePr>
@@ -5077,7 +5208,7 @@
                   <pic:spPr bwMode="auto">
                     <a:xfrm>
                       <a:off x="0" y="0"/>
-                      <a:ext cx="5731510" cy="6268720"/>
+                      <a:ext cx="5550535" cy="6070600"/>
                     </a:xfrm>
                     <a:prstGeom prst="rect">
                       <a:avLst/>
@@ -5120,6 +5251,67 @@
       <w:r>
         <w:rPr/>
         <w:t>21 За допомогою налаштувань методу DBSCAN досягнути найкращої кластеризації даних</w:t>
+      </w:r>
+    </w:p>
+    <w:p>
+      <w:pPr>
+        <w:pStyle w:val="H3"/>
+        <w:rPr/>
+      </w:pPr>
+      <w:r>
+        <w:rPr/>
+        <w:t>Завдання</w:t>
+      </w:r>
+    </w:p>
+    <w:p>
+      <w:pPr>
+        <w:pStyle w:val="P1"/>
+        <w:rPr/>
+      </w:pPr>
+      <w:r>
+        <w:rPr/>
+      </w:r>
+    </w:p>
+    <w:p>
+      <w:pPr>
+        <w:pStyle w:val="P1"/>
+        <w:rPr/>
+      </w:pPr>
+      <w:r>
+        <w:rPr>
+          <w:rFonts w:ascii="Times New Roman" w:hAnsi="Times New Roman"/>
+          <w:b w:val="false"/>
+          <w:i w:val="false"/>
+          <w:caps w:val="false"/>
+          <w:smallCaps w:val="false"/>
+          <w:color w:val="000000"/>
+          <w:spacing w:val="0"/>
+          <w:sz w:val="27"/>
+        </w:rPr>
+        <w:t>За допомогою налаштувань методу DBSCAN досягнути найкращої кластеризації даних</w:t>
+      </w:r>
+      <w:r>
+        <w:rPr/>
+        <w:t xml:space="preserve"> </w:t>
+      </w:r>
+    </w:p>
+    <w:p>
+      <w:pPr>
+        <w:pStyle w:val="P1"/>
+        <w:rPr/>
+      </w:pPr>
+      <w:r>
+        <w:rPr/>
+      </w:r>
+    </w:p>
+    <w:p>
+      <w:pPr>
+        <w:pStyle w:val="H3"/>
+        <w:rPr/>
+      </w:pPr>
+      <w:r>
+        <w:rPr/>
+        <w:t>Виконання</w:t>
       </w:r>
     </w:p>
     <w:p>
@@ -5353,7 +5545,7 @@
     </w:p>
     <w:p>
       <w:pPr>
-        <w:pStyle w:val="H1"/>
+        <w:pStyle w:val="h11"/>
         <w:rPr/>
       </w:pPr>
       <w:r>
@@ -5383,15 +5575,175 @@
     <w:p>
       <w:pPr>
         <w:pStyle w:val="p11"/>
-        <w:rPr/>
-      </w:pPr>
-      <w:r>
-        <w:rPr/>
-      </w:r>
-    </w:p>
-    <w:p>
-      <w:pPr>
-        <w:pStyle w:val="H1"/>
+        <w:rPr>
+          <w:lang w:val="uk-UA"/>
+        </w:rPr>
+      </w:pPr>
+      <w:r>
+        <w:rPr>
+          <w:lang w:val="uk-UA"/>
+        </w:rPr>
+        <w:t xml:space="preserve">Спочатку було проаналізовано вибірку </w:t>
+      </w:r>
+      <w:r>
+        <w:rPr>
+          <w:lang w:val="en-US"/>
+        </w:rPr>
+        <w:t xml:space="preserve">bank.arff. </w:t>
+      </w:r>
+      <w:r>
+        <w:rPr>
+          <w:lang w:val="uk-UA"/>
+        </w:rPr>
+        <w:t xml:space="preserve">До неї було застосовано метод кластеризації </w:t>
+      </w:r>
+      <w:r>
+        <w:rPr>
+          <w:lang w:val="en-US"/>
+        </w:rPr>
+        <w:t>SimpleKMeans.</w:t>
+      </w:r>
+    </w:p>
+    <w:p>
+      <w:pPr>
+        <w:pStyle w:val="p11"/>
+        <w:rPr>
+          <w:lang w:val="uk-UA"/>
+        </w:rPr>
+      </w:pPr>
+      <w:r>
+        <w:rPr>
+          <w:lang w:val="uk-UA"/>
+        </w:rPr>
+        <w:t xml:space="preserve">Після цього було завантажено вибірку </w:t>
+      </w:r>
+      <w:r>
+        <w:rPr>
+          <w:lang w:val="en-US"/>
+        </w:rPr>
+        <w:t xml:space="preserve">iris.arff. </w:t>
+      </w:r>
+      <w:r>
+        <w:rPr>
+          <w:lang w:val="uk-UA"/>
+        </w:rPr>
+        <w:t xml:space="preserve">До неї також було застосовано метод </w:t>
+      </w:r>
+      <w:r>
+        <w:rPr>
+          <w:lang w:val="en-US"/>
+        </w:rPr>
+        <w:t>SimpleKMeans.</w:t>
+      </w:r>
+    </w:p>
+    <w:p>
+      <w:pPr>
+        <w:pStyle w:val="p11"/>
+        <w:rPr>
+          <w:lang w:val="uk-UA"/>
+        </w:rPr>
+      </w:pPr>
+      <w:r>
+        <w:rPr>
+          <w:lang w:val="uk-UA"/>
+        </w:rPr>
+        <w:t xml:space="preserve">Далі було завантажено вибірку </w:t>
+      </w:r>
+      <w:r>
+        <w:rPr>
+          <w:lang w:val="en-US"/>
+        </w:rPr>
+        <w:t xml:space="preserve">flags.arff. </w:t>
+      </w:r>
+      <w:r>
+        <w:rPr>
+          <w:lang w:val="uk-UA"/>
+        </w:rPr>
+        <w:t xml:space="preserve">До неї було застосовано метод </w:t>
+      </w:r>
+      <w:r>
+        <w:rPr>
+          <w:lang w:val="en-US"/>
+        </w:rPr>
+        <w:t>Cobweb.</w:t>
+      </w:r>
+    </w:p>
+    <w:p>
+      <w:pPr>
+        <w:pStyle w:val="p11"/>
+        <w:rPr>
+          <w:lang w:val="uk-UA"/>
+        </w:rPr>
+      </w:pPr>
+      <w:r>
+        <w:rPr>
+          <w:lang w:val="uk-UA"/>
+        </w:rPr>
+        <w:t xml:space="preserve">Після цього було завантажено вибірку </w:t>
+      </w:r>
+      <w:r>
+        <w:rPr>
+          <w:lang w:val="en-US"/>
+        </w:rPr>
+        <w:t xml:space="preserve">zoo.arff. </w:t>
+      </w:r>
+      <w:r>
+        <w:rPr>
+          <w:lang w:val="uk-UA"/>
+        </w:rPr>
+        <w:t xml:space="preserve">До неї було застосовано метод </w:t>
+      </w:r>
+      <w:r>
+        <w:rPr>
+          <w:lang w:val="en-US"/>
+        </w:rPr>
+        <w:t>HierarchicalClustering.</w:t>
+      </w:r>
+    </w:p>
+    <w:p>
+      <w:pPr>
+        <w:pStyle w:val="p11"/>
+        <w:rPr>
+          <w:lang w:val="uk-UA"/>
+        </w:rPr>
+      </w:pPr>
+      <w:r>
+        <w:rPr>
+          <w:lang w:val="uk-UA"/>
+        </w:rPr>
+        <w:t xml:space="preserve">Насамкінець було згенеровано вибірку методом </w:t>
+      </w:r>
+      <w:r>
+        <w:rPr>
+          <w:lang w:val="en-US"/>
+        </w:rPr>
+        <w:t xml:space="preserve">BirchCluster. </w:t>
+      </w:r>
+      <w:r>
+        <w:rPr>
+          <w:lang w:val="uk-UA"/>
+        </w:rPr>
+        <w:t xml:space="preserve">До неї було застосовано метод кластеризації </w:t>
+      </w:r>
+      <w:r>
+        <w:rPr>
+          <w:lang w:val="en-US"/>
+        </w:rPr>
+        <w:t>DBSCAN.</w:t>
+      </w:r>
+    </w:p>
+    <w:p>
+      <w:pPr>
+        <w:pStyle w:val="p11"/>
+        <w:rPr/>
+      </w:pPr>
+      <w:r>
+        <w:rPr/>
+      </w:r>
+    </w:p>
+    <w:p>
+      <w:pPr>
+        <w:pStyle w:val="h11"/>
         <w:rPr/>
       </w:pPr>
       <w:r>
@@ -5512,7 +5864,7 @@
       </w:pPr>
       <w:r>
         <w:rPr/>
-        <w:t>В  чому схожість та відмінність задач класифікації та кластеризації?</w:t>
+        <w:t>В чому схожість та відмінність задач класифікації та кластеризації?</w:t>
       </w:r>
     </w:p>
     <w:p>
@@ -7078,11 +7430,13 @@
     <w:pPr>
       <w:spacing w:lineRule="auto" w:line="360" w:before="0" w:after="0"/>
       <w:ind w:firstLine="851"/>
+      <w:jc w:val="center"/>
+      <w:outlineLvl w:val="0"/>
     </w:pPr>
     <w:rPr>
       <w:rFonts w:ascii="Times New Roman" w:hAnsi="Times New Roman"/>
       <w:b/>
-      <w:smallCaps/>
+      <w:caps/>
       <w:color w:val="auto"/>
       <w:sz w:val="28"/>
     </w:rPr>

</xml_diff>

<commit_message>
feat: adding new docs for AM
</commit_message>
<xml_diff>
--- a/41IA Intelektualnyj analiz danyh/6/IA_KNT-122_Onyshchenko_19_PR6.docx
+++ b/41IA Intelektualnyj analiz danyh/6/IA_KNT-122_Onyshchenko_19_PR6.docx
@@ -404,6 +404,7 @@
     <w:p>
       <w:pPr>
         <w:pStyle w:val="h11"/>
+        <w:spacing w:before="0" w:after="0"/>
         <w:rPr/>
       </w:pPr>
       <w:r>
@@ -1067,7 +1068,7 @@
         <w:pStyle w:val="H2"/>
         <w:rPr/>
       </w:pPr>
-      <w:bookmarkStart w:id="0" w:name="%2525252525D0%2525252525B7%2525252525D0%"/>
+      <w:bookmarkStart w:id="0" w:name="%252525252525D0%252525252525B7%252525252"/>
       <w:bookmarkEnd w:id="0"/>
       <w:r>
         <w:rPr/>
@@ -1233,7 +1234,7 @@
         <w:pStyle w:val="H2"/>
         <w:rPr/>
       </w:pPr>
-      <w:bookmarkStart w:id="1" w:name="%2525252525D0%2525252525B0%2525252525D0%"/>
+      <w:bookmarkStart w:id="1" w:name="%252525252525D0%252525252525B0%252525252"/>
       <w:bookmarkEnd w:id="1"/>
       <w:r>
         <w:rPr/>
@@ -1266,7 +1267,6 @@
       </w:pPr>
       <w:r>
         <w:rPr>
-          <w:rFonts w:ascii="Times New Roman" w:hAnsi="Times New Roman"/>
           <w:b w:val="false"/>
           <w:i w:val="false"/>
           <w:caps w:val="false"/>
@@ -1432,7 +1432,7 @@
         <w:pStyle w:val="H2"/>
         <w:rPr/>
       </w:pPr>
-      <w:bookmarkStart w:id="2" w:name="%2525252525D1%252525252582%2525252525D0%"/>
+      <w:bookmarkStart w:id="2" w:name="%252525252525D1%25252525252582%252525252"/>
       <w:bookmarkEnd w:id="2"/>
       <w:r>
         <w:rPr/>
@@ -1465,7 +1465,6 @@
       </w:pPr>
       <w:r>
         <w:rPr>
-          <w:rFonts w:ascii="Times New Roman" w:hAnsi="Times New Roman"/>
           <w:b w:val="false"/>
           <w:i w:val="false"/>
           <w:caps w:val="false"/>
@@ -1548,8 +1547,8 @@
         </w:tblCellMar>
       </w:tblPr>
       <w:tblGrid>
-        <w:gridCol w:w="2661"/>
-        <w:gridCol w:w="2585"/>
+        <w:gridCol w:w="2660"/>
+        <w:gridCol w:w="2586"/>
       </w:tblGrid>
       <w:tr>
         <w:trPr>
@@ -1557,7 +1556,7 @@
         </w:trPr>
         <w:tc>
           <w:tcPr>
-            <w:tcW w:w="2661" w:type="dxa"/>
+            <w:tcW w:w="2660" w:type="dxa"/>
             <w:tcBorders>
               <w:top w:val="single" w:sz="4" w:space="0" w:color="000000"/>
               <w:left w:val="single" w:sz="4" w:space="0" w:color="000000"/>
@@ -1567,7 +1566,7 @@
           </w:tcPr>
           <w:p>
             <w:pPr>
-              <w:pStyle w:val="Style16"/>
+              <w:pStyle w:val="user4"/>
               <w:spacing w:lineRule="auto" w:line="240"/>
               <w:ind w:hanging="0" w:left="0" w:right="0"/>
               <w:jc w:val="left"/>
@@ -1581,7 +1580,7 @@
         </w:tc>
         <w:tc>
           <w:tcPr>
-            <w:tcW w:w="2585" w:type="dxa"/>
+            <w:tcW w:w="2586" w:type="dxa"/>
             <w:tcBorders>
               <w:top w:val="single" w:sz="4" w:space="0" w:color="000000"/>
               <w:left w:val="single" w:sz="4" w:space="0" w:color="000000"/>
@@ -1592,7 +1591,7 @@
           </w:tcPr>
           <w:p>
             <w:pPr>
-              <w:pStyle w:val="Style16"/>
+              <w:pStyle w:val="user4"/>
               <w:spacing w:lineRule="auto" w:line="240"/>
               <w:ind w:hanging="0" w:left="0" w:right="0"/>
               <w:jc w:val="left"/>
@@ -1609,7 +1608,7 @@
         <w:trPr/>
         <w:tc>
           <w:tcPr>
-            <w:tcW w:w="2661" w:type="dxa"/>
+            <w:tcW w:w="2660" w:type="dxa"/>
             <w:tcBorders>
               <w:left w:val="single" w:sz="4" w:space="0" w:color="000000"/>
               <w:bottom w:val="single" w:sz="4" w:space="0" w:color="000000"/>
@@ -1618,7 +1617,7 @@
           </w:tcPr>
           <w:p>
             <w:pPr>
-              <w:pStyle w:val="Style15"/>
+              <w:pStyle w:val="user3"/>
               <w:spacing w:lineRule="auto" w:line="240"/>
               <w:ind w:hanging="0" w:left="0" w:right="0"/>
               <w:rPr/>
@@ -1631,7 +1630,7 @@
         </w:tc>
         <w:tc>
           <w:tcPr>
-            <w:tcW w:w="2585" w:type="dxa"/>
+            <w:tcW w:w="2586" w:type="dxa"/>
             <w:tcBorders>
               <w:left w:val="single" w:sz="4" w:space="0" w:color="000000"/>
               <w:bottom w:val="single" w:sz="4" w:space="0" w:color="000000"/>
@@ -1641,7 +1640,7 @@
           </w:tcPr>
           <w:p>
             <w:pPr>
-              <w:pStyle w:val="Style15"/>
+              <w:pStyle w:val="user3"/>
               <w:spacing w:lineRule="auto" w:line="240"/>
               <w:ind w:hanging="0" w:left="0" w:right="0"/>
               <w:rPr/>
@@ -1657,7 +1656,7 @@
         <w:trPr/>
         <w:tc>
           <w:tcPr>
-            <w:tcW w:w="2661" w:type="dxa"/>
+            <w:tcW w:w="2660" w:type="dxa"/>
             <w:tcBorders>
               <w:left w:val="single" w:sz="4" w:space="0" w:color="000000"/>
               <w:bottom w:val="single" w:sz="4" w:space="0" w:color="000000"/>
@@ -1666,7 +1665,7 @@
           </w:tcPr>
           <w:p>
             <w:pPr>
-              <w:pStyle w:val="Style15"/>
+              <w:pStyle w:val="user3"/>
               <w:spacing w:lineRule="auto" w:line="240"/>
               <w:ind w:hanging="0" w:left="0" w:right="0"/>
               <w:rPr/>
@@ -1679,7 +1678,7 @@
         </w:tc>
         <w:tc>
           <w:tcPr>
-            <w:tcW w:w="2585" w:type="dxa"/>
+            <w:tcW w:w="2586" w:type="dxa"/>
             <w:tcBorders>
               <w:left w:val="single" w:sz="4" w:space="0" w:color="000000"/>
               <w:bottom w:val="single" w:sz="4" w:space="0" w:color="000000"/>
@@ -1689,7 +1688,7 @@
           </w:tcPr>
           <w:p>
             <w:pPr>
-              <w:pStyle w:val="Style15"/>
+              <w:pStyle w:val="user3"/>
               <w:spacing w:lineRule="auto" w:line="240"/>
               <w:ind w:hanging="0" w:left="0" w:right="0"/>
               <w:rPr/>
@@ -1705,7 +1704,7 @@
         <w:trPr/>
         <w:tc>
           <w:tcPr>
-            <w:tcW w:w="2661" w:type="dxa"/>
+            <w:tcW w:w="2660" w:type="dxa"/>
             <w:tcBorders>
               <w:left w:val="single" w:sz="4" w:space="0" w:color="000000"/>
               <w:bottom w:val="single" w:sz="4" w:space="0" w:color="000000"/>
@@ -1714,7 +1713,7 @@
           </w:tcPr>
           <w:p>
             <w:pPr>
-              <w:pStyle w:val="Style15"/>
+              <w:pStyle w:val="user3"/>
               <w:spacing w:lineRule="auto" w:line="240"/>
               <w:ind w:hanging="0" w:left="0" w:right="0"/>
               <w:rPr/>
@@ -1727,7 +1726,7 @@
         </w:tc>
         <w:tc>
           <w:tcPr>
-            <w:tcW w:w="2585" w:type="dxa"/>
+            <w:tcW w:w="2586" w:type="dxa"/>
             <w:tcBorders>
               <w:left w:val="single" w:sz="4" w:space="0" w:color="000000"/>
               <w:bottom w:val="single" w:sz="4" w:space="0" w:color="000000"/>
@@ -1737,7 +1736,7 @@
           </w:tcPr>
           <w:p>
             <w:pPr>
-              <w:pStyle w:val="Style15"/>
+              <w:pStyle w:val="user3"/>
               <w:spacing w:lineRule="auto" w:line="240"/>
               <w:ind w:hanging="0" w:left="0" w:right="0"/>
               <w:rPr/>
@@ -1753,7 +1752,7 @@
         <w:trPr/>
         <w:tc>
           <w:tcPr>
-            <w:tcW w:w="2661" w:type="dxa"/>
+            <w:tcW w:w="2660" w:type="dxa"/>
             <w:tcBorders>
               <w:left w:val="single" w:sz="4" w:space="0" w:color="000000"/>
               <w:bottom w:val="single" w:sz="4" w:space="0" w:color="000000"/>
@@ -1762,7 +1761,7 @@
           </w:tcPr>
           <w:p>
             <w:pPr>
-              <w:pStyle w:val="Style15"/>
+              <w:pStyle w:val="user3"/>
               <w:spacing w:lineRule="auto" w:line="240"/>
               <w:ind w:hanging="0" w:left="0" w:right="0"/>
               <w:rPr/>
@@ -1775,7 +1774,7 @@
         </w:tc>
         <w:tc>
           <w:tcPr>
-            <w:tcW w:w="2585" w:type="dxa"/>
+            <w:tcW w:w="2586" w:type="dxa"/>
             <w:tcBorders>
               <w:left w:val="single" w:sz="4" w:space="0" w:color="000000"/>
               <w:bottom w:val="single" w:sz="4" w:space="0" w:color="000000"/>
@@ -1785,7 +1784,7 @@
           </w:tcPr>
           <w:p>
             <w:pPr>
-              <w:pStyle w:val="Style15"/>
+              <w:pStyle w:val="user3"/>
               <w:spacing w:lineRule="auto" w:line="240"/>
               <w:ind w:hanging="0" w:left="0" w:right="0"/>
               <w:rPr/>
@@ -1801,7 +1800,7 @@
         <w:trPr/>
         <w:tc>
           <w:tcPr>
-            <w:tcW w:w="2661" w:type="dxa"/>
+            <w:tcW w:w="2660" w:type="dxa"/>
             <w:tcBorders>
               <w:left w:val="single" w:sz="4" w:space="0" w:color="000000"/>
               <w:bottom w:val="single" w:sz="4" w:space="0" w:color="000000"/>
@@ -1810,7 +1809,7 @@
           </w:tcPr>
           <w:p>
             <w:pPr>
-              <w:pStyle w:val="Style15"/>
+              <w:pStyle w:val="user3"/>
               <w:spacing w:lineRule="auto" w:line="240"/>
               <w:ind w:hanging="0" w:left="0" w:right="0"/>
               <w:rPr/>
@@ -1823,7 +1822,7 @@
         </w:tc>
         <w:tc>
           <w:tcPr>
-            <w:tcW w:w="2585" w:type="dxa"/>
+            <w:tcW w:w="2586" w:type="dxa"/>
             <w:tcBorders>
               <w:left w:val="single" w:sz="4" w:space="0" w:color="000000"/>
               <w:bottom w:val="single" w:sz="4" w:space="0" w:color="000000"/>
@@ -1833,7 +1832,7 @@
           </w:tcPr>
           <w:p>
             <w:pPr>
-              <w:pStyle w:val="Style15"/>
+              <w:pStyle w:val="user3"/>
               <w:spacing w:lineRule="auto" w:line="240"/>
               <w:ind w:hanging="0" w:left="0" w:right="0"/>
               <w:rPr/>
@@ -1849,7 +1848,7 @@
         <w:trPr/>
         <w:tc>
           <w:tcPr>
-            <w:tcW w:w="2661" w:type="dxa"/>
+            <w:tcW w:w="2660" w:type="dxa"/>
             <w:tcBorders>
               <w:left w:val="single" w:sz="4" w:space="0" w:color="000000"/>
               <w:bottom w:val="single" w:sz="4" w:space="0" w:color="000000"/>
@@ -1858,7 +1857,7 @@
           </w:tcPr>
           <w:p>
             <w:pPr>
-              <w:pStyle w:val="Style15"/>
+              <w:pStyle w:val="user3"/>
               <w:spacing w:lineRule="auto" w:line="240"/>
               <w:ind w:hanging="0" w:left="0" w:right="0"/>
               <w:rPr/>
@@ -1871,7 +1870,7 @@
         </w:tc>
         <w:tc>
           <w:tcPr>
-            <w:tcW w:w="2585" w:type="dxa"/>
+            <w:tcW w:w="2586" w:type="dxa"/>
             <w:tcBorders>
               <w:left w:val="single" w:sz="4" w:space="0" w:color="000000"/>
               <w:bottom w:val="single" w:sz="4" w:space="0" w:color="000000"/>
@@ -1881,7 +1880,7 @@
           </w:tcPr>
           <w:p>
             <w:pPr>
-              <w:pStyle w:val="Style15"/>
+              <w:pStyle w:val="user3"/>
               <w:spacing w:lineRule="auto" w:line="240"/>
               <w:ind w:hanging="0" w:left="0" w:right="0"/>
               <w:rPr/>
@@ -1897,7 +1896,7 @@
         <w:trPr/>
         <w:tc>
           <w:tcPr>
-            <w:tcW w:w="2661" w:type="dxa"/>
+            <w:tcW w:w="2660" w:type="dxa"/>
             <w:tcBorders>
               <w:left w:val="single" w:sz="4" w:space="0" w:color="000000"/>
               <w:bottom w:val="single" w:sz="4" w:space="0" w:color="000000"/>
@@ -1906,7 +1905,7 @@
           </w:tcPr>
           <w:p>
             <w:pPr>
-              <w:pStyle w:val="Style15"/>
+              <w:pStyle w:val="user3"/>
               <w:spacing w:lineRule="auto" w:line="240"/>
               <w:ind w:hanging="0" w:left="0" w:right="0"/>
               <w:rPr/>
@@ -1919,7 +1918,7 @@
         </w:tc>
         <w:tc>
           <w:tcPr>
-            <w:tcW w:w="2585" w:type="dxa"/>
+            <w:tcW w:w="2586" w:type="dxa"/>
             <w:tcBorders>
               <w:left w:val="single" w:sz="4" w:space="0" w:color="000000"/>
               <w:bottom w:val="single" w:sz="4" w:space="0" w:color="000000"/>
@@ -1929,7 +1928,7 @@
           </w:tcPr>
           <w:p>
             <w:pPr>
-              <w:pStyle w:val="Style15"/>
+              <w:pStyle w:val="user3"/>
               <w:spacing w:lineRule="auto" w:line="240"/>
               <w:ind w:hanging="0" w:left="0" w:right="0"/>
               <w:rPr/>
@@ -1945,7 +1944,7 @@
         <w:trPr/>
         <w:tc>
           <w:tcPr>
-            <w:tcW w:w="2661" w:type="dxa"/>
+            <w:tcW w:w="2660" w:type="dxa"/>
             <w:tcBorders>
               <w:left w:val="single" w:sz="4" w:space="0" w:color="000000"/>
               <w:bottom w:val="single" w:sz="4" w:space="0" w:color="000000"/>
@@ -1954,7 +1953,7 @@
           </w:tcPr>
           <w:p>
             <w:pPr>
-              <w:pStyle w:val="Style15"/>
+              <w:pStyle w:val="user3"/>
               <w:spacing w:lineRule="auto" w:line="240"/>
               <w:ind w:hanging="0" w:left="0" w:right="0"/>
               <w:rPr/>
@@ -1967,7 +1966,7 @@
         </w:tc>
         <w:tc>
           <w:tcPr>
-            <w:tcW w:w="2585" w:type="dxa"/>
+            <w:tcW w:w="2586" w:type="dxa"/>
             <w:tcBorders>
               <w:left w:val="single" w:sz="4" w:space="0" w:color="000000"/>
               <w:bottom w:val="single" w:sz="4" w:space="0" w:color="000000"/>
@@ -1977,7 +1976,7 @@
           </w:tcPr>
           <w:p>
             <w:pPr>
-              <w:pStyle w:val="Style15"/>
+              <w:pStyle w:val="user3"/>
               <w:spacing w:lineRule="auto" w:line="240"/>
               <w:ind w:hanging="0" w:left="0" w:right="0"/>
               <w:rPr/>
@@ -1993,7 +1992,7 @@
         <w:trPr/>
         <w:tc>
           <w:tcPr>
-            <w:tcW w:w="2661" w:type="dxa"/>
+            <w:tcW w:w="2660" w:type="dxa"/>
             <w:tcBorders>
               <w:left w:val="single" w:sz="4" w:space="0" w:color="000000"/>
               <w:bottom w:val="single" w:sz="4" w:space="0" w:color="000000"/>
@@ -2002,7 +2001,7 @@
           </w:tcPr>
           <w:p>
             <w:pPr>
-              <w:pStyle w:val="Style15"/>
+              <w:pStyle w:val="user3"/>
               <w:spacing w:lineRule="auto" w:line="240"/>
               <w:ind w:hanging="0" w:left="0" w:right="0"/>
               <w:rPr/>
@@ -2015,7 +2014,7 @@
         </w:tc>
         <w:tc>
           <w:tcPr>
-            <w:tcW w:w="2585" w:type="dxa"/>
+            <w:tcW w:w="2586" w:type="dxa"/>
             <w:tcBorders>
               <w:left w:val="single" w:sz="4" w:space="0" w:color="000000"/>
               <w:bottom w:val="single" w:sz="4" w:space="0" w:color="000000"/>
@@ -2025,7 +2024,7 @@
           </w:tcPr>
           <w:p>
             <w:pPr>
-              <w:pStyle w:val="Style15"/>
+              <w:pStyle w:val="user3"/>
               <w:spacing w:lineRule="auto" w:line="240"/>
               <w:ind w:hanging="0" w:left="0" w:right="0"/>
               <w:rPr/>
@@ -2041,7 +2040,7 @@
         <w:trPr/>
         <w:tc>
           <w:tcPr>
-            <w:tcW w:w="2661" w:type="dxa"/>
+            <w:tcW w:w="2660" w:type="dxa"/>
             <w:tcBorders>
               <w:left w:val="single" w:sz="4" w:space="0" w:color="000000"/>
               <w:bottom w:val="single" w:sz="4" w:space="0" w:color="000000"/>
@@ -2050,7 +2049,7 @@
           </w:tcPr>
           <w:p>
             <w:pPr>
-              <w:pStyle w:val="Style15"/>
+              <w:pStyle w:val="user3"/>
               <w:spacing w:lineRule="auto" w:line="240"/>
               <w:ind w:hanging="0" w:left="0" w:right="0"/>
               <w:rPr/>
@@ -2063,7 +2062,7 @@
         </w:tc>
         <w:tc>
           <w:tcPr>
-            <w:tcW w:w="2585" w:type="dxa"/>
+            <w:tcW w:w="2586" w:type="dxa"/>
             <w:tcBorders>
               <w:left w:val="single" w:sz="4" w:space="0" w:color="000000"/>
               <w:bottom w:val="single" w:sz="4" w:space="0" w:color="000000"/>
@@ -2073,7 +2072,7 @@
           </w:tcPr>
           <w:p>
             <w:pPr>
-              <w:pStyle w:val="Style15"/>
+              <w:pStyle w:val="user3"/>
               <w:spacing w:lineRule="auto" w:line="240"/>
               <w:ind w:hanging="0" w:left="0" w:right="0"/>
               <w:rPr/>
@@ -2089,7 +2088,7 @@
         <w:trPr/>
         <w:tc>
           <w:tcPr>
-            <w:tcW w:w="2661" w:type="dxa"/>
+            <w:tcW w:w="2660" w:type="dxa"/>
             <w:tcBorders>
               <w:left w:val="single" w:sz="4" w:space="0" w:color="000000"/>
               <w:bottom w:val="single" w:sz="4" w:space="0" w:color="000000"/>
@@ -2098,7 +2097,7 @@
           </w:tcPr>
           <w:p>
             <w:pPr>
-              <w:pStyle w:val="Style15"/>
+              <w:pStyle w:val="user3"/>
               <w:spacing w:lineRule="auto" w:line="240"/>
               <w:ind w:hanging="0" w:left="0" w:right="0"/>
               <w:rPr/>
@@ -2111,7 +2110,7 @@
         </w:tc>
         <w:tc>
           <w:tcPr>
-            <w:tcW w:w="2585" w:type="dxa"/>
+            <w:tcW w:w="2586" w:type="dxa"/>
             <w:tcBorders>
               <w:left w:val="single" w:sz="4" w:space="0" w:color="000000"/>
               <w:bottom w:val="single" w:sz="4" w:space="0" w:color="000000"/>
@@ -2121,7 +2120,7 @@
           </w:tcPr>
           <w:p>
             <w:pPr>
-              <w:pStyle w:val="Style15"/>
+              <w:pStyle w:val="user3"/>
               <w:spacing w:lineRule="auto" w:line="240"/>
               <w:ind w:hanging="0" w:left="0" w:right="0"/>
               <w:rPr/>
@@ -2137,7 +2136,7 @@
         <w:trPr/>
         <w:tc>
           <w:tcPr>
-            <w:tcW w:w="2661" w:type="dxa"/>
+            <w:tcW w:w="2660" w:type="dxa"/>
             <w:tcBorders>
               <w:left w:val="single" w:sz="4" w:space="0" w:color="000000"/>
               <w:bottom w:val="single" w:sz="4" w:space="0" w:color="000000"/>
@@ -2146,7 +2145,7 @@
           </w:tcPr>
           <w:p>
             <w:pPr>
-              <w:pStyle w:val="Style15"/>
+              <w:pStyle w:val="user3"/>
               <w:spacing w:lineRule="auto" w:line="240"/>
               <w:ind w:hanging="0" w:left="0" w:right="0"/>
               <w:rPr/>
@@ -2159,7 +2158,7 @@
         </w:tc>
         <w:tc>
           <w:tcPr>
-            <w:tcW w:w="2585" w:type="dxa"/>
+            <w:tcW w:w="2586" w:type="dxa"/>
             <w:tcBorders>
               <w:left w:val="single" w:sz="4" w:space="0" w:color="000000"/>
               <w:bottom w:val="single" w:sz="4" w:space="0" w:color="000000"/>
@@ -2169,7 +2168,7 @@
           </w:tcPr>
           <w:p>
             <w:pPr>
-              <w:pStyle w:val="Style15"/>
+              <w:pStyle w:val="user3"/>
               <w:spacing w:lineRule="auto" w:line="240"/>
               <w:ind w:hanging="0" w:left="0"/>
               <w:rPr/>
@@ -2215,7 +2214,7 @@
         <w:pStyle w:val="H2"/>
         <w:rPr/>
       </w:pPr>
-      <w:bookmarkStart w:id="3" w:name="%2525252525D0%2525252525B2%2525252525D1%"/>
+      <w:bookmarkStart w:id="3" w:name="%252525252525D0%252525252525B2%252525252"/>
       <w:bookmarkEnd w:id="3"/>
       <w:r>
         <w:rPr/>
@@ -2249,7 +2248,6 @@
       </w:pPr>
       <w:r>
         <w:rPr>
-          <w:rFonts w:ascii="Times New Roman" w:hAnsi="Times New Roman"/>
           <w:b w:val="false"/>
           <w:i w:val="false"/>
           <w:caps w:val="false"/>
@@ -2422,7 +2420,7 @@
         <w:pStyle w:val="H2"/>
         <w:rPr/>
       </w:pPr>
-      <w:bookmarkStart w:id="4" w:name="%2525252525D0%2525252525BE%2525252525D0%"/>
+      <w:bookmarkStart w:id="4" w:name="%252525252525D0%252525252525BE%252525252"/>
       <w:bookmarkEnd w:id="4"/>
       <w:r>
         <w:rPr/>
@@ -2455,7 +2453,6 @@
       </w:pPr>
       <w:r>
         <w:rPr>
-          <w:rFonts w:ascii="Times New Roman" w:hAnsi="Times New Roman"/>
           <w:b w:val="false"/>
           <w:i w:val="false"/>
           <w:caps w:val="false"/>
@@ -2594,7 +2591,7 @@
         <w:pStyle w:val="H2"/>
         <w:rPr/>
       </w:pPr>
-      <w:bookmarkStart w:id="5" w:name="%2525252525D1%252525252582%2525252525D01"/>
+      <w:bookmarkStart w:id="5" w:name="%252525252525D1%25252525252582%252525251"/>
       <w:bookmarkEnd w:id="5"/>
       <w:r>
         <w:rPr/>
@@ -2627,7 +2624,6 @@
       </w:pPr>
       <w:r>
         <w:rPr>
-          <w:rFonts w:ascii="Times New Roman" w:hAnsi="Times New Roman"/>
           <w:b w:val="false"/>
           <w:i w:val="false"/>
           <w:caps w:val="false"/>
@@ -2674,23 +2670,7 @@
       </w:pPr>
       <w:r>
         <w:rPr/>
-        <w:t>Таблиц</w:t>
-      </w:r>
-      <w:r>
-        <w:rPr/>
-        <w:t>ю</w:t>
-      </w:r>
-      <w:r>
-        <w:rPr/>
-        <w:t xml:space="preserve"> наведен</w:t>
-      </w:r>
-      <w:r>
-        <w:rPr/>
-        <w:t>о</w:t>
-      </w:r>
-      <w:r>
-        <w:rPr/>
-        <w:t xml:space="preserve"> нижче на рисунку:</w:t>
+        <w:t>Таблицю наведено нижче на рисунку:</w:t>
       </w:r>
     </w:p>
     <w:p>
@@ -2773,7 +2753,7 @@
         <w:pStyle w:val="H2"/>
         <w:rPr/>
       </w:pPr>
-      <w:bookmarkStart w:id="6" w:name="%2525252525D0%2525252525B7%2525252525D01"/>
+      <w:bookmarkStart w:id="6" w:name="%252525252525D0%252525252525B7%252525251"/>
       <w:bookmarkEnd w:id="6"/>
       <w:r>
         <w:rPr/>
@@ -2806,7 +2786,6 @@
       </w:pPr>
       <w:r>
         <w:rPr>
-          <w:rFonts w:ascii="Times New Roman" w:hAnsi="Times New Roman"/>
           <w:b w:val="false"/>
           <w:i w:val="false"/>
           <w:caps w:val="false"/>
@@ -2936,7 +2915,7 @@
         <w:pStyle w:val="H2"/>
         <w:rPr/>
       </w:pPr>
-      <w:bookmarkStart w:id="7" w:name="%2525252525D0%2525252525B0%2525252525D01"/>
+      <w:bookmarkStart w:id="7" w:name="%252525252525D0%252525252525B0%252525251"/>
       <w:bookmarkEnd w:id="7"/>
       <w:r>
         <w:rPr/>
@@ -2969,7 +2948,6 @@
       </w:pPr>
       <w:r>
         <w:rPr>
-          <w:rFonts w:ascii="Times New Roman" w:hAnsi="Times New Roman"/>
           <w:b w:val="false"/>
           <w:i w:val="false"/>
           <w:caps w:val="false"/>
@@ -3109,7 +3087,7 @@
         <w:pStyle w:val="H2"/>
         <w:rPr/>
       </w:pPr>
-      <w:bookmarkStart w:id="8" w:name="%2525252525D0%2525252525B7%2525252525D02"/>
+      <w:bookmarkStart w:id="8" w:name="%252525252525D0%252525252525B7%252525253"/>
       <w:bookmarkEnd w:id="8"/>
       <w:r>
         <w:rPr/>
@@ -3152,7 +3130,6 @@
       </w:pPr>
       <w:r>
         <w:rPr>
-          <w:rFonts w:ascii="Times New Roman" w:hAnsi="Times New Roman"/>
           <w:b w:val="false"/>
           <w:i w:val="false"/>
           <w:caps w:val="false"/>
@@ -3282,7 +3259,7 @@
         <w:pStyle w:val="H2"/>
         <w:rPr/>
       </w:pPr>
-      <w:bookmarkStart w:id="9" w:name="%2525252525D0%2525252525BE%2525252525D01"/>
+      <w:bookmarkStart w:id="9" w:name="%252525252525D0%252525252525BE%252525251"/>
       <w:bookmarkEnd w:id="9"/>
       <w:r>
         <w:rPr/>
@@ -3315,7 +3292,6 @@
       </w:pPr>
       <w:r>
         <w:rPr>
-          <w:rFonts w:ascii="Times New Roman" w:hAnsi="Times New Roman"/>
           <w:b w:val="false"/>
           <w:i w:val="false"/>
           <w:caps w:val="false"/>
@@ -3366,13 +3342,7 @@
         <w:rPr>
           <w:lang w:val="uk-UA"/>
         </w:rPr>
-        <w:t xml:space="preserve">При значенні кластерів 3, кожен кластер відповідає одному зі значень цільової ознаки. </w:t>
-      </w:r>
-      <w:r>
-        <w:rPr>
-          <w:lang w:val="uk-UA"/>
-        </w:rPr>
-        <w:t>Всі екземпляри було віднесено до вірних кластерів. Перший кластер виявився найбільш легким для виділення, бо він є найбільш компактним (Це видно з графіку).</w:t>
+        <w:t>При значенні кластерів 3, кожен кластер відповідає одному зі значень цільової ознаки. Всі екземпляри було віднесено до вірних кластерів. Перший кластер виявився найбільш легким для виділення, бо він є найбільш компактним (Це видно з графіку).</w:t>
       </w:r>
     </w:p>
     <w:p>
@@ -3389,7 +3359,7 @@
         <w:pStyle w:val="H2"/>
         <w:rPr/>
       </w:pPr>
-      <w:bookmarkStart w:id="10" w:name="%2525252525D0%2525252525B2%2525252525D11"/>
+      <w:bookmarkStart w:id="10" w:name="%252525252525D0%252525252525B2%252525251"/>
       <w:bookmarkEnd w:id="10"/>
       <w:r>
         <w:rPr/>
@@ -3422,7 +3392,6 @@
       </w:pPr>
       <w:r>
         <w:rPr>
-          <w:rFonts w:ascii="Times New Roman" w:hAnsi="Times New Roman"/>
           <w:b w:val="false"/>
           <w:i w:val="false"/>
           <w:caps w:val="false"/>
@@ -3552,7 +3521,7 @@
         <w:pStyle w:val="H2"/>
         <w:rPr/>
       </w:pPr>
-      <w:bookmarkStart w:id="11" w:name="%2525252525D0%2525252525BD%2525252525D0%"/>
+      <w:bookmarkStart w:id="11" w:name="%252525252525D0%252525252525BD%252525252"/>
       <w:bookmarkEnd w:id="11"/>
       <w:r>
         <w:rPr/>
@@ -3583,6 +3552,18 @@
         <w:pStyle w:val="P1"/>
         <w:rPr>
           <w:rFonts w:ascii="Times New Roman" w:hAnsi="Times New Roman"/>
+          <w:b w:val="false"/>
+          <w:i w:val="false"/>
+          <w:i w:val="false"/>
+          <w:caps w:val="false"/>
+          <w:smallCaps w:val="false"/>
+          <w:color w:val="000000"/>
+          <w:spacing w:val="0"/>
+          <w:sz w:val="27"/>
+        </w:rPr>
+      </w:pPr>
+      <w:r>
+        <w:rPr>
           <w:b w:val="false"/>
           <w:i w:val="false"/>
           <w:caps w:val="false"/>
@@ -3591,10 +3572,26 @@
           <w:spacing w:val="0"/>
           <w:sz w:val="27"/>
         </w:rPr>
-      </w:pPr>
-      <w:r>
+        <w:t>Визначити, на що впливає параметр «seed».</w:t>
+      </w:r>
+    </w:p>
+    <w:p>
+      <w:pPr>
+        <w:pStyle w:val="P1"/>
         <w:rPr>
           <w:rFonts w:ascii="Times New Roman" w:hAnsi="Times New Roman"/>
+          <w:b w:val="false"/>
+          <w:i w:val="false"/>
+          <w:i w:val="false"/>
+          <w:caps w:val="false"/>
+          <w:smallCaps w:val="false"/>
+          <w:color w:val="000000"/>
+          <w:spacing w:val="0"/>
+          <w:sz w:val="27"/>
+        </w:rPr>
+      </w:pPr>
+      <w:r>
+        <w:rPr>
           <w:b w:val="false"/>
           <w:i w:val="false"/>
           <w:caps w:val="false"/>
@@ -3603,7 +3600,99 @@
           <w:spacing w:val="0"/>
           <w:sz w:val="27"/>
         </w:rPr>
-        <w:t>Визначити, на що впливає параметр «seed».</w:t>
+      </w:r>
+    </w:p>
+    <w:p>
+      <w:pPr>
+        <w:pStyle w:val="H3"/>
+        <w:rPr/>
+      </w:pPr>
+      <w:r>
+        <w:rPr/>
+        <w:t>Виконання</w:t>
+      </w:r>
+    </w:p>
+    <w:p>
+      <w:pPr>
+        <w:pStyle w:val="P1"/>
+        <w:rPr/>
+      </w:pPr>
+      <w:r>
+        <w:rPr/>
+      </w:r>
+    </w:p>
+    <w:p>
+      <w:pPr>
+        <w:pStyle w:val="P1"/>
+        <w:rPr/>
+      </w:pPr>
+      <w:r>
+        <w:rPr/>
+        <w:t xml:space="preserve">Параметр </w:t>
+      </w:r>
+      <w:r>
+        <w:rPr>
+          <w:lang w:val="en-US"/>
+        </w:rPr>
+        <w:t xml:space="preserve">seed </w:t>
+      </w:r>
+      <w:r>
+        <w:rPr>
+          <w:lang w:val="uk-UA"/>
+        </w:rPr>
+        <w:t xml:space="preserve">впливає на випадковість розподілу. Його метою є забезпечити відтворюваність результатів. (Щоб можна було, задавши певний </w:t>
+      </w:r>
+      <w:r>
+        <w:rPr>
+          <w:lang w:val="en-US"/>
+        </w:rPr>
+        <w:t xml:space="preserve">seed, </w:t>
+      </w:r>
+      <w:r>
+        <w:rPr>
+          <w:lang w:val="uk-UA"/>
+        </w:rPr>
+        <w:t>отримати такі ж результати.)</w:t>
+      </w:r>
+    </w:p>
+    <w:p>
+      <w:pPr>
+        <w:pStyle w:val="P1"/>
+        <w:rPr/>
+      </w:pPr>
+      <w:r>
+        <w:rPr/>
+      </w:r>
+    </w:p>
+    <w:p>
+      <w:pPr>
+        <w:pStyle w:val="H2"/>
+        <w:rPr/>
+      </w:pPr>
+      <w:bookmarkStart w:id="12" w:name="%252525252525D0%252525252525B7%252525254"/>
+      <w:bookmarkEnd w:id="12"/>
+      <w:r>
+        <w:rPr/>
+        <w:t>13 Завантажити вибірку «flagdata.arff»</w:t>
+      </w:r>
+    </w:p>
+    <w:p>
+      <w:pPr>
+        <w:pStyle w:val="H3"/>
+        <w:rPr/>
+      </w:pPr>
+      <w:r>
+        <w:rPr/>
+        <w:t>Завдання</w:t>
+      </w:r>
+    </w:p>
+    <w:p>
+      <w:pPr>
+        <w:pStyle w:val="P1"/>
+        <w:rPr/>
+      </w:pPr>
+      <w:r>
+        <w:rPr/>
       </w:r>
     </w:p>
     <w:p>
@@ -3611,6 +3700,18 @@
         <w:pStyle w:val="P1"/>
         <w:rPr>
           <w:rFonts w:ascii="Times New Roman" w:hAnsi="Times New Roman"/>
+          <w:b w:val="false"/>
+          <w:i w:val="false"/>
+          <w:i w:val="false"/>
+          <w:caps w:val="false"/>
+          <w:smallCaps w:val="false"/>
+          <w:color w:val="000000"/>
+          <w:spacing w:val="0"/>
+          <w:sz w:val="27"/>
+        </w:rPr>
+      </w:pPr>
+      <w:r>
+        <w:rPr>
           <w:b w:val="false"/>
           <w:i w:val="false"/>
           <w:caps w:val="false"/>
@@ -3619,11 +3720,16 @@
           <w:spacing w:val="0"/>
           <w:sz w:val="27"/>
         </w:rPr>
-      </w:pPr>
-      <w:r>
+        <w:t>Завантажити вибірку «flagdata.arff».</w:t>
+      </w:r>
+    </w:p>
+    <w:p>
+      <w:pPr>
+        <w:pStyle w:val="P1"/>
         <w:rPr>
           <w:rFonts w:ascii="Times New Roman" w:hAnsi="Times New Roman"/>
           <w:b w:val="false"/>
+          <w:i w:val="false"/>
           <w:i w:val="false"/>
           <w:caps w:val="false"/>
           <w:smallCaps w:val="false"/>
@@ -3631,152 +3737,9 @@
           <w:spacing w:val="0"/>
           <w:sz w:val="27"/>
         </w:rPr>
-      </w:r>
-    </w:p>
-    <w:p>
-      <w:pPr>
-        <w:pStyle w:val="H3"/>
-        <w:rPr/>
-      </w:pPr>
-      <w:r>
-        <w:rPr/>
-        <w:t>Виконання</w:t>
-      </w:r>
-    </w:p>
-    <w:p>
-      <w:pPr>
-        <w:pStyle w:val="P1"/>
-        <w:rPr/>
-      </w:pPr>
-      <w:r>
-        <w:rPr/>
-      </w:r>
-    </w:p>
-    <w:p>
-      <w:pPr>
-        <w:pStyle w:val="P1"/>
-        <w:rPr/>
-      </w:pPr>
-      <w:r>
-        <w:rPr/>
-        <w:t xml:space="preserve">Параметр </w:t>
-      </w:r>
-      <w:r>
-        <w:rPr>
-          <w:lang w:val="en-US"/>
-        </w:rPr>
-        <w:t xml:space="preserve">seed </w:t>
-      </w:r>
-      <w:r>
-        <w:rPr>
-          <w:lang w:val="uk-UA"/>
-        </w:rPr>
-        <w:t xml:space="preserve">впливає на випадковість розподілу. </w:t>
-      </w:r>
-      <w:r>
-        <w:rPr>
-          <w:lang w:val="uk-UA"/>
-        </w:rPr>
-        <w:t xml:space="preserve">Його метою є забезпечити відтворюваність результатів. (Щоб можна було, задавши певний </w:t>
-      </w:r>
-      <w:r>
-        <w:rPr>
-          <w:lang w:val="en-US"/>
-        </w:rPr>
-        <w:t xml:space="preserve">seed, </w:t>
-      </w:r>
-      <w:r>
-        <w:rPr>
-          <w:lang w:val="uk-UA"/>
-        </w:rPr>
-        <w:t>отримати такі ж результати.)</w:t>
-      </w:r>
-    </w:p>
-    <w:p>
-      <w:pPr>
-        <w:pStyle w:val="P1"/>
-        <w:rPr/>
-      </w:pPr>
-      <w:r>
-        <w:rPr/>
-      </w:r>
-    </w:p>
-    <w:p>
-      <w:pPr>
-        <w:pStyle w:val="H2"/>
-        <w:rPr/>
-      </w:pPr>
-      <w:bookmarkStart w:id="12" w:name="%2525252525D0%2525252525B7%2525252525D03"/>
-      <w:bookmarkEnd w:id="12"/>
-      <w:r>
-        <w:rPr/>
-        <w:t>13 Завантажити вибірку «flagdata.arff»</w:t>
-      </w:r>
-    </w:p>
-    <w:p>
-      <w:pPr>
-        <w:pStyle w:val="H3"/>
-        <w:rPr/>
-      </w:pPr>
-      <w:r>
-        <w:rPr/>
-        <w:t>Завдання</w:t>
-      </w:r>
-    </w:p>
-    <w:p>
-      <w:pPr>
-        <w:pStyle w:val="P1"/>
-        <w:rPr/>
-      </w:pPr>
-      <w:r>
-        <w:rPr/>
-      </w:r>
-    </w:p>
-    <w:p>
-      <w:pPr>
-        <w:pStyle w:val="P1"/>
-        <w:rPr>
-          <w:rFonts w:ascii="Times New Roman" w:hAnsi="Times New Roman"/>
-          <w:b w:val="false"/>
-          <w:i w:val="false"/>
-          <w:caps w:val="false"/>
-          <w:smallCaps w:val="false"/>
-          <w:color w:val="000000"/>
-          <w:spacing w:val="0"/>
-          <w:sz w:val="27"/>
-        </w:rPr>
-      </w:pPr>
-      <w:r>
-        <w:rPr>
-          <w:rFonts w:ascii="Times New Roman" w:hAnsi="Times New Roman"/>
-          <w:b w:val="false"/>
-          <w:i w:val="false"/>
-          <w:caps w:val="false"/>
-          <w:smallCaps w:val="false"/>
-          <w:color w:val="000000"/>
-          <w:spacing w:val="0"/>
-          <w:sz w:val="27"/>
-        </w:rPr>
-        <w:t>Завантажити вибірку «flagdata.arff».</w:t>
-      </w:r>
-    </w:p>
-    <w:p>
-      <w:pPr>
-        <w:pStyle w:val="P1"/>
-        <w:rPr>
-          <w:rFonts w:ascii="Times New Roman" w:hAnsi="Times New Roman"/>
-          <w:b w:val="false"/>
-          <w:i w:val="false"/>
-          <w:caps w:val="false"/>
-          <w:smallCaps w:val="false"/>
-          <w:color w:val="000000"/>
-          <w:spacing w:val="0"/>
-          <w:sz w:val="27"/>
-        </w:rPr>
-      </w:pPr>
-      <w:r>
-        <w:rPr>
-          <w:rFonts w:ascii="Times New Roman" w:hAnsi="Times New Roman"/>
+      </w:pPr>
+      <w:r>
+        <w:rPr>
           <w:b w:val="false"/>
           <w:i w:val="false"/>
           <w:caps w:val="false"/>
@@ -3896,7 +3859,7 @@
         <w:pStyle w:val="H2"/>
         <w:rPr/>
       </w:pPr>
-      <w:bookmarkStart w:id="13" w:name="%2525252525D0%2525252525B0%2525252525D02"/>
+      <w:bookmarkStart w:id="13" w:name="%252525252525D0%252525252525B0%252525253"/>
       <w:bookmarkEnd w:id="13"/>
       <w:r>
         <w:rPr/>
@@ -3927,6 +3890,18 @@
         <w:pStyle w:val="P1"/>
         <w:rPr>
           <w:rFonts w:ascii="Times New Roman" w:hAnsi="Times New Roman"/>
+          <w:b w:val="false"/>
+          <w:i w:val="false"/>
+          <w:i w:val="false"/>
+          <w:caps w:val="false"/>
+          <w:smallCaps w:val="false"/>
+          <w:color w:val="000000"/>
+          <w:spacing w:val="0"/>
+          <w:sz w:val="27"/>
+        </w:rPr>
+      </w:pPr>
+      <w:r>
+        <w:rPr>
           <w:b w:val="false"/>
           <w:i w:val="false"/>
           <w:caps w:val="false"/>
@@ -3935,10 +3910,26 @@
           <w:spacing w:val="0"/>
           <w:sz w:val="27"/>
         </w:rPr>
-      </w:pPr>
-      <w:r>
+        <w:t>Запустити алгоритм COBWEB з параметрами С=0,4 (0,35), saveInstanceData = True, cluster mode = Use training set.</w:t>
+      </w:r>
+    </w:p>
+    <w:p>
+      <w:pPr>
+        <w:pStyle w:val="P1"/>
         <w:rPr>
           <w:rFonts w:ascii="Times New Roman" w:hAnsi="Times New Roman"/>
+          <w:b w:val="false"/>
+          <w:i w:val="false"/>
+          <w:i w:val="false"/>
+          <w:caps w:val="false"/>
+          <w:smallCaps w:val="false"/>
+          <w:color w:val="000000"/>
+          <w:spacing w:val="0"/>
+          <w:sz w:val="27"/>
+        </w:rPr>
+      </w:pPr>
+      <w:r>
+        <w:rPr>
           <w:b w:val="false"/>
           <w:i w:val="false"/>
           <w:caps w:val="false"/>
@@ -3947,7 +3938,16 @@
           <w:spacing w:val="0"/>
           <w:sz w:val="27"/>
         </w:rPr>
-        <w:t>Запустити алгоритм COBWEB з параметрами С=0,4 (0,35), saveInstanceData = True, cluster mode = Use training set.</w:t>
+      </w:r>
+    </w:p>
+    <w:p>
+      <w:pPr>
+        <w:pStyle w:val="H3"/>
+        <w:rPr/>
+      </w:pPr>
+      <w:r>
+        <w:rPr/>
+        <w:t>Виконання</w:t>
       </w:r>
     </w:p>
     <w:p>
@@ -3956,6 +3956,7 @@
         <w:rPr>
           <w:rFonts w:ascii="Times New Roman" w:hAnsi="Times New Roman"/>
           <w:b w:val="false"/>
+          <w:i w:val="false"/>
           <w:i w:val="false"/>
           <w:caps w:val="false"/>
           <w:smallCaps w:val="false"/>
@@ -3966,44 +3967,6 @@
       </w:pPr>
       <w:r>
         <w:rPr>
-          <w:rFonts w:ascii="Times New Roman" w:hAnsi="Times New Roman"/>
-          <w:b w:val="false"/>
-          <w:i w:val="false"/>
-          <w:caps w:val="false"/>
-          <w:smallCaps w:val="false"/>
-          <w:color w:val="000000"/>
-          <w:spacing w:val="0"/>
-          <w:sz w:val="27"/>
-        </w:rPr>
-      </w:r>
-    </w:p>
-    <w:p>
-      <w:pPr>
-        <w:pStyle w:val="H3"/>
-        <w:rPr/>
-      </w:pPr>
-      <w:r>
-        <w:rPr/>
-        <w:t>Виконання</w:t>
-      </w:r>
-    </w:p>
-    <w:p>
-      <w:pPr>
-        <w:pStyle w:val="P1"/>
-        <w:rPr>
-          <w:rFonts w:ascii="Times New Roman" w:hAnsi="Times New Roman"/>
-          <w:b w:val="false"/>
-          <w:i w:val="false"/>
-          <w:caps w:val="false"/>
-          <w:smallCaps w:val="false"/>
-          <w:color w:val="000000"/>
-          <w:spacing w:val="0"/>
-          <w:sz w:val="27"/>
-        </w:rPr>
-      </w:pPr>
-      <w:r>
-        <w:rPr>
-          <w:rFonts w:ascii="Times New Roman" w:hAnsi="Times New Roman"/>
           <w:b w:val="false"/>
           <w:i w:val="false"/>
           <w:caps w:val="false"/>
@@ -4104,7 +4067,7 @@
         <w:pStyle w:val="H2"/>
         <w:rPr/>
       </w:pPr>
-      <w:bookmarkStart w:id="14" w:name="%2525252525D0%2525252525B2%2525252525D12"/>
+      <w:bookmarkStart w:id="14" w:name="%252525252525D0%252525252525B2%252525253"/>
       <w:bookmarkEnd w:id="14"/>
       <w:r>
         <w:rPr/>
@@ -4135,6 +4098,18 @@
         <w:pStyle w:val="P1"/>
         <w:rPr>
           <w:rFonts w:ascii="Times New Roman" w:hAnsi="Times New Roman"/>
+          <w:b w:val="false"/>
+          <w:i w:val="false"/>
+          <w:i w:val="false"/>
+          <w:caps w:val="false"/>
+          <w:smallCaps w:val="false"/>
+          <w:color w:val="000000"/>
+          <w:spacing w:val="0"/>
+          <w:sz w:val="27"/>
+        </w:rPr>
+      </w:pPr>
+      <w:r>
+        <w:rPr>
           <w:b w:val="false"/>
           <w:i w:val="false"/>
           <w:caps w:val="false"/>
@@ -4143,11 +4118,16 @@
           <w:spacing w:val="0"/>
           <w:sz w:val="27"/>
         </w:rPr>
-      </w:pPr>
-      <w:r>
+        <w:t>Візуалізувати отриману дендрограму та вказати, що спільного у прапорів, які опинилися в одному кластері.</w:t>
+      </w:r>
+    </w:p>
+    <w:p>
+      <w:pPr>
+        <w:pStyle w:val="P1"/>
         <w:rPr>
           <w:rFonts w:ascii="Times New Roman" w:hAnsi="Times New Roman"/>
           <w:b w:val="false"/>
+          <w:i w:val="false"/>
           <w:i w:val="false"/>
           <w:caps w:val="false"/>
           <w:smallCaps w:val="false"/>
@@ -4155,26 +4135,9 @@
           <w:spacing w:val="0"/>
           <w:sz w:val="27"/>
         </w:rPr>
-        <w:t>Візуалізувати отриману дендрограму та вказати, що спільного у прапорів, які опинилися в одному кластері.</w:t>
-      </w:r>
-    </w:p>
-    <w:p>
-      <w:pPr>
-        <w:pStyle w:val="P1"/>
-        <w:rPr>
-          <w:rFonts w:ascii="Times New Roman" w:hAnsi="Times New Roman"/>
-          <w:b w:val="false"/>
-          <w:i w:val="false"/>
-          <w:caps w:val="false"/>
-          <w:smallCaps w:val="false"/>
-          <w:color w:val="000000"/>
-          <w:spacing w:val="0"/>
-          <w:sz w:val="27"/>
-        </w:rPr>
-      </w:pPr>
-      <w:r>
-        <w:rPr>
-          <w:rFonts w:ascii="Times New Roman" w:hAnsi="Times New Roman"/>
+      </w:pPr>
+      <w:r>
+        <w:rPr>
           <w:b w:val="false"/>
           <w:i w:val="false"/>
           <w:caps w:val="false"/>
@@ -4304,7 +4267,7 @@
         <w:pStyle w:val="H2"/>
         <w:rPr/>
       </w:pPr>
-      <w:bookmarkStart w:id="15" w:name="%2525252525D0%2525252525B7%2525252525D04"/>
+      <w:bookmarkStart w:id="15" w:name="%252525252525D0%252525252525B7%252525255"/>
       <w:bookmarkEnd w:id="15"/>
       <w:r>
         <w:rPr/>
@@ -4337,7 +4300,6 @@
       </w:pPr>
       <w:r>
         <w:rPr>
-          <w:rFonts w:ascii="Times New Roman" w:hAnsi="Times New Roman"/>
           <w:b w:val="false"/>
           <w:i w:val="false"/>
           <w:caps w:val="false"/>
@@ -4467,7 +4429,7 @@
         <w:pStyle w:val="H2"/>
         <w:rPr/>
       </w:pPr>
-      <w:bookmarkStart w:id="16" w:name="%2525252525D0%2525252525BE%2525252525D02"/>
+      <w:bookmarkStart w:id="16" w:name="%252525252525D0%252525252525BE%252525253"/>
       <w:bookmarkEnd w:id="16"/>
       <w:r>
         <w:rPr/>
@@ -4500,7 +4462,6 @@
       </w:pPr>
       <w:r>
         <w:rPr>
-          <w:rFonts w:ascii="Times New Roman" w:hAnsi="Times New Roman"/>
           <w:b w:val="false"/>
           <w:i w:val="false"/>
           <w:caps w:val="false"/>
@@ -4642,7 +4603,7 @@
         <w:pStyle w:val="H2"/>
         <w:rPr/>
       </w:pPr>
-      <w:bookmarkStart w:id="17" w:name="%2525252525D0%2525252525B0%2525252525D03"/>
+      <w:bookmarkStart w:id="17" w:name="%252525252525D0%252525252525B0%252525254"/>
       <w:bookmarkEnd w:id="17"/>
       <w:r>
         <w:rPr/>
@@ -4878,7 +4839,7 @@
         <w:pStyle w:val="H2"/>
         <w:rPr/>
       </w:pPr>
-      <w:bookmarkStart w:id="18" w:name="%2525252525D0%2525252525B2%2525252525D13"/>
+      <w:bookmarkStart w:id="18" w:name="%252525252525D0%252525252525B2%252525254"/>
       <w:bookmarkEnd w:id="18"/>
       <w:r>
         <w:rPr/>
@@ -4911,7 +4872,6 @@
       </w:pPr>
       <w:r>
         <w:rPr>
-          <w:rFonts w:ascii="Times New Roman" w:hAnsi="Times New Roman"/>
           <w:b w:val="false"/>
           <w:i w:val="false"/>
           <w:caps w:val="false"/>
@@ -4958,15 +4918,7 @@
       </w:pPr>
       <w:r>
         <w:rPr/>
-        <w:t>Сенс у кластер</w:t>
-      </w:r>
-      <w:r>
-        <w:rPr/>
-        <w:t>ах</w:t>
-      </w:r>
-      <w:r>
-        <w:rPr/>
-        <w:t xml:space="preserve"> є. </w:t>
+        <w:t xml:space="preserve">Сенс у кластерах є. </w:t>
       </w:r>
     </w:p>
     <w:p>
@@ -5059,7 +5011,7 @@
         <w:pStyle w:val="H2"/>
         <w:rPr/>
       </w:pPr>
-      <w:bookmarkStart w:id="19" w:name="%2525252525D0%2525252525B7%2525252525D05"/>
+      <w:bookmarkStart w:id="19" w:name="%252525252525D0%252525252525B7%252525256"/>
       <w:bookmarkEnd w:id="19"/>
       <w:r>
         <w:rPr/>
@@ -5092,7 +5044,6 @@
       </w:pPr>
       <w:r>
         <w:rPr>
-          <w:rFonts w:ascii="Times New Roman" w:hAnsi="Times New Roman"/>
           <w:b w:val="false"/>
           <w:i w:val="false"/>
           <w:caps w:val="false"/>
@@ -5246,7 +5197,7 @@
         <w:pStyle w:val="H2"/>
         <w:rPr/>
       </w:pPr>
-      <w:bookmarkStart w:id="20" w:name="%2525252525D0%2525252525B7%2525252525D06"/>
+      <w:bookmarkStart w:id="20" w:name="%252525252525D0%252525252525B7%252525257"/>
       <w:bookmarkEnd w:id="20"/>
       <w:r>
         <w:rPr/>
@@ -5279,7 +5230,6 @@
       </w:pPr>
       <w:r>
         <w:rPr>
-          <w:rFonts w:ascii="Times New Roman" w:hAnsi="Times New Roman"/>
           <w:b w:val="false"/>
           <w:i w:val="false"/>
           <w:caps w:val="false"/>
@@ -7050,13 +7000,13 @@
       <w:lang w:val="en-US" w:eastAsia="uk-UA"/>
     </w:rPr>
   </w:style>
-  <w:style w:type="character" w:styleId="user">
-    <w:name w:val="Символ нумерації (user)"/>
+  <w:style w:type="character" w:styleId="Style12">
+    <w:name w:val="Символ нумерації"/>
     <w:qFormat/>
     <w:rPr/>
   </w:style>
-  <w:style w:type="character" w:styleId="Style12">
-    <w:name w:val="Маркери"/>
+  <w:style w:type="character" w:styleId="user">
+    <w:name w:val="Маркери (user)"/>
     <w:qFormat/>
     <w:rPr>
       <w:rFonts w:ascii="OpenSymbol" w:hAnsi="OpenSymbol" w:eastAsia="OpenSymbol" w:cs="OpenSymbol"/>
@@ -7079,7 +7029,7 @@
       <w:spacing w:before="240" w:after="120"/>
     </w:pPr>
     <w:rPr>
-      <w:rFonts w:ascii="Liberation Sans" w:hAnsi="Liberation Sans" w:eastAsia="Microsoft YaHei" w:cs="Arial Unicode MS"/>
+      <w:rFonts w:ascii="Liberation Sans" w:hAnsi="Liberation Sans" w:eastAsia="Microsoft YaHei" w:cs="Lucida Sans"/>
       <w:sz w:val="28"/>
       <w:szCs w:val="28"/>
     </w:rPr>
@@ -7124,7 +7074,7 @@
       <w:suppressLineNumbers/>
     </w:pPr>
     <w:rPr>
-      <w:rFonts w:cs="Arial Unicode MS"/>
+      <w:rFonts w:cs="Lucida Sans"/>
     </w:rPr>
   </w:style>
   <w:style w:type="paragraph" w:styleId="user1">
@@ -7137,7 +7087,7 @@
       <w:spacing w:before="240" w:after="120"/>
     </w:pPr>
     <w:rPr>
-      <w:rFonts w:ascii="Liberation Sans" w:hAnsi="Liberation Sans" w:eastAsia="Microsoft YaHei" w:cs="Lucida Sans"/>
+      <w:rFonts w:ascii="Liberation Sans" w:hAnsi="Liberation Sans" w:eastAsia="Microsoft YaHei" w:cs="Arial Unicode MS"/>
       <w:sz w:val="28"/>
       <w:szCs w:val="28"/>
     </w:rPr>
@@ -7150,12 +7100,12 @@
       <w:suppressLineNumbers/>
     </w:pPr>
     <w:rPr>
-      <w:rFonts w:cs="Lucida Sans"/>
+      <w:rFonts w:cs="Arial Unicode MS"/>
     </w:rPr>
   </w:style>
   <w:style w:type="paragraph" w:styleId="IndexHeading">
     <w:name w:val="index heading"/>
-    <w:basedOn w:val="Style13"/>
+    <w:basedOn w:val="user1"/>
     <w:pPr/>
     <w:rPr/>
   </w:style>
@@ -7464,8 +7414,8 @@
       <w:sz w:val="28"/>
     </w:rPr>
   </w:style>
-  <w:style w:type="paragraph" w:styleId="Style15">
-    <w:name w:val="Вміст таблиці"/>
+  <w:style w:type="paragraph" w:styleId="user3">
+    <w:name w:val="Вміст таблиці (user)"/>
     <w:basedOn w:val="Normal"/>
     <w:qFormat/>
     <w:pPr>
@@ -7474,9 +7424,9 @@
     </w:pPr>
     <w:rPr/>
   </w:style>
-  <w:style w:type="paragraph" w:styleId="Style16">
-    <w:name w:val="Заголовок таблиці"/>
-    <w:basedOn w:val="Style15"/>
+  <w:style w:type="paragraph" w:styleId="user4">
+    <w:name w:val="Заголовок таблиці (user)"/>
+    <w:basedOn w:val="user3"/>
     <w:qFormat/>
     <w:pPr>
       <w:suppressLineNumbers/>
@@ -7487,8 +7437,8 @@
       <w:bCs/>
     </w:rPr>
   </w:style>
-  <w:style w:type="numbering" w:styleId="Style17" w:default="1">
-    <w:name w:val="Без маркерів"/>
+  <w:style w:type="numbering" w:styleId="user5" w:default="1">
+    <w:name w:val="Без маркерів (user)"/>
     <w:uiPriority w:val="99"/>
     <w:semiHidden/>
     <w:unhideWhenUsed/>

</xml_diff>